<commit_message>
feat: implement dynamic services page and integrate comprehensive repository of updated advisory and compliance documentation
</commit_message>
<xml_diff>
--- a/public/Services _modifed_f.docx
+++ b/public/Services _modifed_f.docx
@@ -93,6 +93,54 @@
     </w:p>
     <w:p>
       <w:pPr>
+        <w:spacing w:before="100" w:beforeAutospacing="1" w:after="100" w:afterAutospacing="1" w:line="240" w:lineRule="auto"/>
+        <w:rPr>
+          <w:rFonts w:ascii="Open Sans" w:eastAsia="Times New Roman" w:hAnsi="Open Sans" w:cs="Open Sans"/>
+          <w:b/>
+          <w:bCs/>
+          <w:sz w:val="24"/>
+          <w:szCs w:val="24"/>
+          <w:lang w:eastAsia="en-IN"/>
+        </w:rPr>
+      </w:pPr>
+      <w:r>
+        <w:rPr>
+          <w:rFonts w:ascii="Open Sans" w:eastAsia="Times New Roman" w:hAnsi="Open Sans" w:cs="Open Sans"/>
+          <w:b/>
+          <w:bCs/>
+          <w:sz w:val="24"/>
+          <w:szCs w:val="24"/>
+          <w:lang w:eastAsia="en-IN"/>
+        </w:rPr>
+        <w:t xml:space="preserve">At </w:t>
+      </w:r>
+      <w:proofErr w:type="spellStart"/>
+      <w:r>
+        <w:rPr>
+          <w:rFonts w:ascii="Open Sans" w:eastAsia="Times New Roman" w:hAnsi="Open Sans" w:cs="Open Sans"/>
+          <w:b/>
+          <w:bCs/>
+          <w:sz w:val="24"/>
+          <w:szCs w:val="24"/>
+          <w:lang w:eastAsia="en-IN"/>
+        </w:rPr>
+        <w:t>ConsultAvenuee</w:t>
+      </w:r>
+      <w:proofErr w:type="spellEnd"/>
+      <w:r>
+        <w:rPr>
+          <w:rFonts w:ascii="Open Sans" w:eastAsia="Times New Roman" w:hAnsi="Open Sans" w:cs="Open Sans"/>
+          <w:b/>
+          <w:bCs/>
+          <w:sz w:val="24"/>
+          <w:szCs w:val="24"/>
+          <w:lang w:eastAsia="en-IN"/>
+        </w:rPr>
+        <w:t>, we provide end-to-end assistance for the formation and registration of Cooperative Housing Societies and handover from builder.</w:t>
+      </w:r>
+    </w:p>
+    <w:p>
+      <w:pPr>
         <w:numPr>
           <w:ilvl w:val="0"/>
           <w:numId w:val="1"/>
@@ -206,6 +254,29 @@
     </w:p>
     <w:p>
       <w:pPr>
+        <w:rPr>
+          <w:rFonts w:ascii="Open Sans" w:eastAsia="Times New Roman" w:hAnsi="Open Sans" w:cs="Open Sans"/>
+          <w:b/>
+          <w:bCs/>
+          <w:sz w:val="24"/>
+          <w:szCs w:val="24"/>
+          <w:lang w:eastAsia="en-IN"/>
+        </w:rPr>
+      </w:pPr>
+      <w:r>
+        <w:rPr>
+          <w:rFonts w:ascii="Open Sans" w:eastAsia="Times New Roman" w:hAnsi="Open Sans" w:cs="Open Sans"/>
+          <w:b/>
+          <w:bCs/>
+          <w:sz w:val="24"/>
+          <w:szCs w:val="24"/>
+          <w:lang w:eastAsia="en-IN"/>
+        </w:rPr>
+        <w:t>From election planning to committee formation, we help housing societies conduct smooth, transparent, and legally compliant elections.</w:t>
+      </w:r>
+    </w:p>
+    <w:p>
+      <w:pPr>
         <w:numPr>
           <w:ilvl w:val="0"/>
           <w:numId w:val="1"/>
@@ -375,6 +446,29 @@
     </w:p>
     <w:p>
       <w:pPr>
+        <w:rPr>
+          <w:rFonts w:ascii="Open Sans" w:eastAsia="Times New Roman" w:hAnsi="Open Sans" w:cs="Open Sans"/>
+          <w:b/>
+          <w:bCs/>
+          <w:sz w:val="24"/>
+          <w:szCs w:val="24"/>
+          <w:lang w:eastAsia="en-IN"/>
+        </w:rPr>
+      </w:pPr>
+      <w:r>
+        <w:rPr>
+          <w:rFonts w:ascii="Open Sans" w:eastAsia="Times New Roman" w:hAnsi="Open Sans" w:cs="Open Sans"/>
+          <w:b/>
+          <w:bCs/>
+          <w:sz w:val="24"/>
+          <w:szCs w:val="24"/>
+          <w:lang w:eastAsia="en-IN"/>
+        </w:rPr>
+        <w:t>We help housing societies meet statutory compliance requirements while promoting transparent governance and effective management.</w:t>
+      </w:r>
+    </w:p>
+    <w:p>
+      <w:pPr>
         <w:numPr>
           <w:ilvl w:val="0"/>
           <w:numId w:val="1"/>
@@ -553,6 +647,48 @@
     </w:p>
     <w:p>
       <w:pPr>
+        <w:pStyle w:val="NormalWeb"/>
+        <w:rPr>
+          <w:rFonts w:ascii="Open Sans" w:hAnsi="Open Sans" w:cs="Open Sans"/>
+          <w:b/>
+          <w:bCs/>
+          <w:kern w:val="2"/>
+          <w14:ligatures w14:val="standardContextual"/>
+        </w:rPr>
+      </w:pPr>
+      <w:r>
+        <w:rPr>
+          <w:rFonts w:ascii="Open Sans" w:hAnsi="Open Sans" w:cs="Open Sans"/>
+          <w:b/>
+          <w:bCs/>
+          <w:kern w:val="2"/>
+          <w14:ligatures w14:val="standardContextual"/>
+        </w:rPr>
+        <w:lastRenderedPageBreak/>
+        <w:t>Taxation, Audit &amp; Accounting solutions for compliant and efficient society</w:t>
+      </w:r>
+      <w:r>
+        <w:rPr>
+          <w:rStyle w:val="Strong"/>
+          <w:rFonts w:eastAsiaTheme="majorEastAsia"/>
+          <w:b w:val="0"/>
+          <w:bCs w:val="0"/>
+        </w:rPr>
+        <w:t xml:space="preserve"> </w:t>
+      </w:r>
+      <w:r>
+        <w:rPr>
+          <w:rFonts w:ascii="Open Sans" w:hAnsi="Open Sans" w:cs="Open Sans"/>
+          <w:b/>
+          <w:bCs/>
+          <w:kern w:val="2"/>
+          <w14:ligatures w14:val="standardContextual"/>
+        </w:rPr>
+        <w:t>management.</w:t>
+      </w:r>
+    </w:p>
+    <w:p>
+      <w:pPr>
         <w:numPr>
           <w:ilvl w:val="0"/>
           <w:numId w:val="1"/>
@@ -700,19 +836,6 @@
         </w:rPr>
         <w:t>Monthly Accounting Review &amp; Monitoring</w:t>
       </w:r>
-    </w:p>
-    <w:p>
-      <w:pPr>
-        <w:shd w:val="clear" w:color="auto" w:fill="FFFFFF"/>
-        <w:spacing w:after="100" w:afterAutospacing="1" w:line="360" w:lineRule="atLeast"/>
-        <w:jc w:val="both"/>
-        <w:rPr>
-          <w:rFonts w:ascii="Open Sans" w:eastAsia="Times New Roman" w:hAnsi="Open Sans"/>
-          <w:sz w:val="24"/>
-          <w:szCs w:val="24"/>
-          <w:lang w:eastAsia="en-IN"/>
-        </w:rPr>
-      </w:pPr>
     </w:p>
     <w:p>
       <w:pPr>
@@ -723,1234 +846,1342 @@
           <w:szCs w:val="32"/>
         </w:rPr>
       </w:pPr>
-    </w:p>
-    <w:p>
-      <w:pPr>
+      <w:r>
         <w:rPr>
           <w:b/>
           <w:bCs/>
           <w:sz w:val="32"/>
           <w:szCs w:val="32"/>
         </w:rPr>
-      </w:pPr>
-      <w:r>
+        <w:t>Redevelopment Advisory Support</w:t>
+      </w:r>
+    </w:p>
+    <w:p>
+      <w:pPr>
+        <w:rPr>
+          <w:rFonts w:ascii="Open Sans" w:eastAsia="Times New Roman" w:hAnsi="Open Sans" w:cs="Open Sans"/>
+          <w:b/>
+          <w:bCs/>
+          <w:sz w:val="24"/>
+          <w:szCs w:val="24"/>
+          <w:lang w:eastAsia="en-IN"/>
+        </w:rPr>
+      </w:pPr>
+      <w:r>
+        <w:rPr>
+          <w:rFonts w:ascii="Open Sans" w:eastAsia="Times New Roman" w:hAnsi="Open Sans" w:cs="Open Sans"/>
+          <w:b/>
+          <w:bCs/>
+          <w:sz w:val="24"/>
+          <w:szCs w:val="24"/>
+          <w:lang w:eastAsia="en-IN"/>
+        </w:rPr>
+        <w:t>Comprehensive support for redevelopment planning, documentation, and stakeholder coordination.</w:t>
+      </w:r>
+    </w:p>
+    <w:p>
+      <w:pPr>
+        <w:numPr>
+          <w:ilvl w:val="0"/>
+          <w:numId w:val="9"/>
+        </w:numPr>
+        <w:spacing w:before="100" w:beforeAutospacing="1" w:after="100" w:afterAutospacing="1" w:line="240" w:lineRule="auto"/>
+        <w:rPr>
+          <w:rFonts w:ascii="Open Sans" w:eastAsia="Times New Roman" w:hAnsi="Open Sans" w:cs="Open Sans"/>
+          <w:sz w:val="24"/>
+          <w:szCs w:val="24"/>
+          <w:lang w:eastAsia="en-IN"/>
+        </w:rPr>
+      </w:pPr>
+      <w:r>
+        <w:rPr>
+          <w:rFonts w:ascii="Open Sans" w:eastAsia="Times New Roman" w:hAnsi="Open Sans" w:cs="Open Sans"/>
+          <w:sz w:val="24"/>
+          <w:szCs w:val="24"/>
+          <w:lang w:eastAsia="en-IN"/>
+        </w:rPr>
+        <w:t>Preliminary Redevelopment Assessment</w:t>
+      </w:r>
+    </w:p>
+    <w:p>
+      <w:pPr>
+        <w:numPr>
+          <w:ilvl w:val="0"/>
+          <w:numId w:val="9"/>
+        </w:numPr>
+        <w:spacing w:before="100" w:beforeAutospacing="1" w:after="100" w:afterAutospacing="1" w:line="240" w:lineRule="auto"/>
+        <w:rPr>
+          <w:rFonts w:ascii="Open Sans" w:eastAsia="Times New Roman" w:hAnsi="Open Sans" w:cs="Open Sans"/>
+          <w:sz w:val="24"/>
+          <w:szCs w:val="24"/>
+          <w:lang w:eastAsia="en-IN"/>
+        </w:rPr>
+      </w:pPr>
+      <w:r>
+        <w:rPr>
+          <w:rFonts w:ascii="Open Sans" w:eastAsia="Times New Roman" w:hAnsi="Open Sans" w:cs="Open Sans"/>
+          <w:sz w:val="24"/>
+          <w:szCs w:val="24"/>
+          <w:lang w:eastAsia="en-IN"/>
+        </w:rPr>
+        <w:t>Compliance Review</w:t>
+      </w:r>
+    </w:p>
+    <w:p>
+      <w:pPr>
+        <w:numPr>
+          <w:ilvl w:val="0"/>
+          <w:numId w:val="9"/>
+        </w:numPr>
+        <w:spacing w:before="100" w:beforeAutospacing="1" w:after="100" w:afterAutospacing="1" w:line="240" w:lineRule="auto"/>
+        <w:rPr>
+          <w:rFonts w:ascii="Open Sans" w:eastAsia="Times New Roman" w:hAnsi="Open Sans" w:cs="Open Sans"/>
+          <w:sz w:val="24"/>
+          <w:szCs w:val="24"/>
+          <w:lang w:eastAsia="en-IN"/>
+        </w:rPr>
+      </w:pPr>
+      <w:r>
+        <w:rPr>
+          <w:rFonts w:ascii="Open Sans" w:eastAsia="Times New Roman" w:hAnsi="Open Sans" w:cs="Open Sans"/>
+          <w:sz w:val="24"/>
+          <w:szCs w:val="24"/>
+          <w:lang w:eastAsia="en-IN"/>
+        </w:rPr>
+        <w:t>Member Communication Support</w:t>
+      </w:r>
+    </w:p>
+    <w:p>
+      <w:pPr>
+        <w:numPr>
+          <w:ilvl w:val="0"/>
+          <w:numId w:val="9"/>
+        </w:numPr>
+        <w:spacing w:before="100" w:beforeAutospacing="1" w:after="100" w:afterAutospacing="1" w:line="240" w:lineRule="auto"/>
+        <w:rPr>
+          <w:rFonts w:ascii="Open Sans" w:eastAsia="Times New Roman" w:hAnsi="Open Sans" w:cs="Open Sans"/>
+          <w:sz w:val="24"/>
+          <w:szCs w:val="24"/>
+          <w:lang w:eastAsia="en-IN"/>
+        </w:rPr>
+      </w:pPr>
+      <w:r>
+        <w:rPr>
+          <w:rFonts w:ascii="Open Sans" w:eastAsia="Times New Roman" w:hAnsi="Open Sans" w:cs="Open Sans"/>
+          <w:sz w:val="24"/>
+          <w:szCs w:val="24"/>
+          <w:lang w:eastAsia="en-IN"/>
+        </w:rPr>
+        <w:t>Documentation Assistance</w:t>
+      </w:r>
+    </w:p>
+    <w:p>
+      <w:pPr>
+        <w:numPr>
+          <w:ilvl w:val="0"/>
+          <w:numId w:val="9"/>
+        </w:numPr>
+        <w:spacing w:before="100" w:beforeAutospacing="1" w:after="100" w:afterAutospacing="1" w:line="240" w:lineRule="auto"/>
+        <w:rPr>
+          <w:rFonts w:ascii="Open Sans" w:eastAsia="Times New Roman" w:hAnsi="Open Sans" w:cs="Open Sans"/>
+          <w:sz w:val="24"/>
+          <w:szCs w:val="24"/>
+          <w:lang w:eastAsia="en-IN"/>
+        </w:rPr>
+      </w:pPr>
+      <w:r>
+        <w:rPr>
+          <w:rFonts w:ascii="Open Sans" w:eastAsia="Times New Roman" w:hAnsi="Open Sans" w:cs="Open Sans"/>
+          <w:sz w:val="24"/>
+          <w:szCs w:val="24"/>
+          <w:lang w:eastAsia="en-IN"/>
+        </w:rPr>
+        <w:t>Financial Evaluation Support</w:t>
+      </w:r>
+    </w:p>
+    <w:p>
+      <w:pPr>
         <w:rPr>
           <w:b/>
           <w:bCs/>
           <w:sz w:val="32"/>
           <w:szCs w:val="32"/>
         </w:rPr>
-        <w:t>Redevelopment Advisory Support</w:t>
-      </w:r>
-    </w:p>
-    <w:p>
-      <w:pPr>
-        <w:numPr>
-          <w:ilvl w:val="0"/>
-          <w:numId w:val="9"/>
-        </w:numPr>
-        <w:spacing w:before="100" w:beforeAutospacing="1" w:after="100" w:afterAutospacing="1" w:line="240" w:lineRule="auto"/>
-        <w:rPr>
-          <w:rFonts w:ascii="Open Sans" w:eastAsia="Times New Roman" w:hAnsi="Open Sans" w:cs="Open Sans"/>
-          <w:sz w:val="24"/>
-          <w:szCs w:val="24"/>
-          <w:lang w:eastAsia="en-IN"/>
-        </w:rPr>
-      </w:pPr>
-      <w:r>
-        <w:rPr>
-          <w:rFonts w:ascii="Open Sans" w:eastAsia="Times New Roman" w:hAnsi="Open Sans" w:cs="Open Sans"/>
-          <w:sz w:val="24"/>
-          <w:szCs w:val="24"/>
-          <w:lang w:eastAsia="en-IN"/>
-        </w:rPr>
-        <w:t>Preliminary Redevelopment Assessment</w:t>
-      </w:r>
-    </w:p>
-    <w:p>
-      <w:pPr>
-        <w:numPr>
-          <w:ilvl w:val="0"/>
-          <w:numId w:val="9"/>
-        </w:numPr>
-        <w:spacing w:before="100" w:beforeAutospacing="1" w:after="100" w:afterAutospacing="1" w:line="240" w:lineRule="auto"/>
-        <w:rPr>
-          <w:rFonts w:ascii="Open Sans" w:eastAsia="Times New Roman" w:hAnsi="Open Sans" w:cs="Open Sans"/>
-          <w:sz w:val="24"/>
-          <w:szCs w:val="24"/>
-          <w:lang w:eastAsia="en-IN"/>
-        </w:rPr>
-      </w:pPr>
-      <w:r>
-        <w:rPr>
-          <w:rFonts w:ascii="Open Sans" w:eastAsia="Times New Roman" w:hAnsi="Open Sans" w:cs="Open Sans"/>
-          <w:sz w:val="24"/>
-          <w:szCs w:val="24"/>
-          <w:lang w:eastAsia="en-IN"/>
-        </w:rPr>
-        <w:t>Compliance Review</w:t>
-      </w:r>
-    </w:p>
-    <w:p>
-      <w:pPr>
-        <w:numPr>
-          <w:ilvl w:val="0"/>
-          <w:numId w:val="9"/>
-        </w:numPr>
-        <w:spacing w:before="100" w:beforeAutospacing="1" w:after="100" w:afterAutospacing="1" w:line="240" w:lineRule="auto"/>
-        <w:rPr>
-          <w:rFonts w:ascii="Open Sans" w:eastAsia="Times New Roman" w:hAnsi="Open Sans" w:cs="Open Sans"/>
-          <w:sz w:val="24"/>
-          <w:szCs w:val="24"/>
-          <w:lang w:eastAsia="en-IN"/>
-        </w:rPr>
-      </w:pPr>
-      <w:r>
-        <w:rPr>
-          <w:rFonts w:ascii="Open Sans" w:eastAsia="Times New Roman" w:hAnsi="Open Sans" w:cs="Open Sans"/>
-          <w:sz w:val="24"/>
-          <w:szCs w:val="24"/>
-          <w:lang w:eastAsia="en-IN"/>
-        </w:rPr>
-        <w:t>Member Communication Support</w:t>
-      </w:r>
-    </w:p>
-    <w:p>
-      <w:pPr>
-        <w:numPr>
-          <w:ilvl w:val="0"/>
-          <w:numId w:val="9"/>
-        </w:numPr>
-        <w:spacing w:before="100" w:beforeAutospacing="1" w:after="100" w:afterAutospacing="1" w:line="240" w:lineRule="auto"/>
-        <w:rPr>
-          <w:rFonts w:ascii="Open Sans" w:eastAsia="Times New Roman" w:hAnsi="Open Sans" w:cs="Open Sans"/>
-          <w:sz w:val="24"/>
-          <w:szCs w:val="24"/>
-          <w:lang w:eastAsia="en-IN"/>
-        </w:rPr>
-      </w:pPr>
-      <w:r>
-        <w:rPr>
-          <w:rFonts w:ascii="Open Sans" w:eastAsia="Times New Roman" w:hAnsi="Open Sans" w:cs="Open Sans"/>
-          <w:sz w:val="24"/>
-          <w:szCs w:val="24"/>
-          <w:lang w:eastAsia="en-IN"/>
-        </w:rPr>
-        <w:t>Documentation Assistance</w:t>
-      </w:r>
-    </w:p>
-    <w:p>
-      <w:pPr>
-        <w:numPr>
-          <w:ilvl w:val="0"/>
-          <w:numId w:val="9"/>
-        </w:numPr>
-        <w:spacing w:before="100" w:beforeAutospacing="1" w:after="100" w:afterAutospacing="1" w:line="240" w:lineRule="auto"/>
-        <w:rPr>
-          <w:rFonts w:ascii="Open Sans" w:eastAsia="Times New Roman" w:hAnsi="Open Sans" w:cs="Open Sans"/>
-          <w:sz w:val="24"/>
-          <w:szCs w:val="24"/>
-          <w:lang w:eastAsia="en-IN"/>
-        </w:rPr>
-      </w:pPr>
-      <w:r>
-        <w:rPr>
-          <w:rFonts w:ascii="Open Sans" w:eastAsia="Times New Roman" w:hAnsi="Open Sans" w:cs="Open Sans"/>
-          <w:sz w:val="24"/>
-          <w:szCs w:val="24"/>
-          <w:lang w:eastAsia="en-IN"/>
-        </w:rPr>
-        <w:t>Financial Evaluation Support</w:t>
-      </w:r>
-    </w:p>
-    <w:p>
-      <w:pPr>
+      </w:pPr>
+      <w:r>
         <w:rPr>
           <w:b/>
           <w:bCs/>
           <w:sz w:val="32"/>
           <w:szCs w:val="32"/>
         </w:rPr>
-      </w:pPr>
-      <w:r>
+        <w:t>Society Documentation &amp; Certification Services</w:t>
+      </w:r>
+    </w:p>
+    <w:p>
+      <w:pPr>
+        <w:rPr>
+          <w:rFonts w:ascii="Open Sans" w:eastAsia="Times New Roman" w:hAnsi="Open Sans" w:cs="Open Sans"/>
+          <w:b/>
+          <w:bCs/>
+          <w:sz w:val="24"/>
+          <w:szCs w:val="24"/>
+          <w:lang w:eastAsia="en-IN"/>
+        </w:rPr>
+      </w:pPr>
+      <w:r>
+        <w:rPr>
+          <w:rFonts w:ascii="Open Sans" w:eastAsia="Times New Roman" w:hAnsi="Open Sans" w:cs="Open Sans"/>
+          <w:b/>
+          <w:bCs/>
+          <w:sz w:val="24"/>
+          <w:szCs w:val="24"/>
+          <w:lang w:eastAsia="en-IN"/>
+        </w:rPr>
+        <w:t>Efficient documentation support for property transfers, loans, memberships, and society records.</w:t>
+      </w:r>
+    </w:p>
+    <w:p>
+      <w:pPr>
+        <w:numPr>
+          <w:ilvl w:val="0"/>
+          <w:numId w:val="9"/>
+        </w:numPr>
+        <w:spacing w:before="100" w:beforeAutospacing="1" w:after="100" w:afterAutospacing="1" w:line="240" w:lineRule="auto"/>
+        <w:rPr>
+          <w:rFonts w:ascii="Open Sans" w:eastAsia="Times New Roman" w:hAnsi="Open Sans" w:cs="Open Sans"/>
+          <w:sz w:val="24"/>
+          <w:szCs w:val="24"/>
+          <w:lang w:eastAsia="en-IN"/>
+        </w:rPr>
+      </w:pPr>
+      <w:r>
+        <w:rPr>
+          <w:rFonts w:ascii="Open Sans" w:eastAsia="Times New Roman" w:hAnsi="Open Sans" w:cs="Open Sans"/>
+          <w:sz w:val="24"/>
+          <w:szCs w:val="24"/>
+          <w:lang w:eastAsia="en-IN"/>
+        </w:rPr>
+        <w:t>NOC for Flat Transfer</w:t>
+      </w:r>
+    </w:p>
+    <w:p>
+      <w:pPr>
+        <w:numPr>
+          <w:ilvl w:val="0"/>
+          <w:numId w:val="9"/>
+        </w:numPr>
+        <w:spacing w:before="100" w:beforeAutospacing="1" w:after="100" w:afterAutospacing="1" w:line="240" w:lineRule="auto"/>
+        <w:rPr>
+          <w:rFonts w:ascii="Open Sans" w:eastAsia="Times New Roman" w:hAnsi="Open Sans" w:cs="Open Sans"/>
+          <w:sz w:val="24"/>
+          <w:szCs w:val="24"/>
+          <w:lang w:eastAsia="en-IN"/>
+        </w:rPr>
+      </w:pPr>
+      <w:r>
+        <w:rPr>
+          <w:rFonts w:ascii="Open Sans" w:eastAsia="Times New Roman" w:hAnsi="Open Sans" w:cs="Open Sans"/>
+          <w:sz w:val="24"/>
+          <w:szCs w:val="24"/>
+          <w:lang w:eastAsia="en-IN"/>
+        </w:rPr>
+        <w:t>NOC for Sale of Flat</w:t>
+      </w:r>
+    </w:p>
+    <w:p>
+      <w:pPr>
+        <w:numPr>
+          <w:ilvl w:val="0"/>
+          <w:numId w:val="9"/>
+        </w:numPr>
+        <w:spacing w:before="100" w:beforeAutospacing="1" w:after="100" w:afterAutospacing="1" w:line="240" w:lineRule="auto"/>
+        <w:rPr>
+          <w:rFonts w:ascii="Open Sans" w:eastAsia="Times New Roman" w:hAnsi="Open Sans" w:cs="Open Sans"/>
+          <w:sz w:val="24"/>
+          <w:szCs w:val="24"/>
+          <w:lang w:eastAsia="en-IN"/>
+        </w:rPr>
+      </w:pPr>
+      <w:r>
+        <w:rPr>
+          <w:rFonts w:ascii="Open Sans" w:eastAsia="Times New Roman" w:hAnsi="Open Sans" w:cs="Open Sans"/>
+          <w:sz w:val="24"/>
+          <w:szCs w:val="24"/>
+          <w:lang w:eastAsia="en-IN"/>
+        </w:rPr>
+        <w:t>NOC for Home Loans</w:t>
+      </w:r>
+    </w:p>
+    <w:p>
+      <w:pPr>
+        <w:numPr>
+          <w:ilvl w:val="0"/>
+          <w:numId w:val="9"/>
+        </w:numPr>
+        <w:spacing w:before="100" w:beforeAutospacing="1" w:after="100" w:afterAutospacing="1" w:line="240" w:lineRule="auto"/>
+        <w:rPr>
+          <w:rFonts w:ascii="Open Sans" w:eastAsia="Times New Roman" w:hAnsi="Open Sans" w:cs="Open Sans"/>
+          <w:sz w:val="24"/>
+          <w:szCs w:val="24"/>
+          <w:lang w:eastAsia="en-IN"/>
+        </w:rPr>
+      </w:pPr>
+      <w:r>
+        <w:rPr>
+          <w:rFonts w:ascii="Open Sans" w:eastAsia="Times New Roman" w:hAnsi="Open Sans" w:cs="Open Sans"/>
+          <w:sz w:val="24"/>
+          <w:szCs w:val="24"/>
+          <w:lang w:eastAsia="en-IN"/>
+        </w:rPr>
+        <w:t>NOC for Passport Verification</w:t>
+      </w:r>
+    </w:p>
+    <w:p>
+      <w:pPr>
+        <w:numPr>
+          <w:ilvl w:val="0"/>
+          <w:numId w:val="9"/>
+        </w:numPr>
+        <w:spacing w:before="100" w:beforeAutospacing="1" w:after="100" w:afterAutospacing="1" w:line="240" w:lineRule="auto"/>
+        <w:rPr>
+          <w:rFonts w:ascii="Open Sans" w:eastAsia="Times New Roman" w:hAnsi="Open Sans" w:cs="Open Sans"/>
+          <w:sz w:val="24"/>
+          <w:szCs w:val="24"/>
+          <w:lang w:eastAsia="en-IN"/>
+        </w:rPr>
+      </w:pPr>
+      <w:r>
+        <w:rPr>
+          <w:rFonts w:ascii="Open Sans" w:eastAsia="Times New Roman" w:hAnsi="Open Sans" w:cs="Open Sans"/>
+          <w:sz w:val="24"/>
+          <w:szCs w:val="24"/>
+          <w:lang w:eastAsia="en-IN"/>
+        </w:rPr>
+        <w:t>Membership Transfer Documentation</w:t>
+      </w:r>
+    </w:p>
+    <w:p>
+      <w:pPr>
+        <w:numPr>
+          <w:ilvl w:val="0"/>
+          <w:numId w:val="9"/>
+        </w:numPr>
+        <w:spacing w:before="100" w:beforeAutospacing="1" w:after="100" w:afterAutospacing="1" w:line="240" w:lineRule="auto"/>
+        <w:rPr>
+          <w:rFonts w:ascii="Open Sans" w:eastAsia="Times New Roman" w:hAnsi="Open Sans" w:cs="Open Sans"/>
+          <w:sz w:val="24"/>
+          <w:szCs w:val="24"/>
+          <w:lang w:eastAsia="en-IN"/>
+        </w:rPr>
+      </w:pPr>
+      <w:r>
+        <w:rPr>
+          <w:rFonts w:ascii="Open Sans" w:eastAsia="Times New Roman" w:hAnsi="Open Sans" w:cs="Open Sans"/>
+          <w:sz w:val="24"/>
+          <w:szCs w:val="24"/>
+          <w:lang w:eastAsia="en-IN"/>
+        </w:rPr>
+        <w:t>Share Certificate Documentation</w:t>
+      </w:r>
+    </w:p>
+    <w:p>
+      <w:pPr>
+        <w:numPr>
+          <w:ilvl w:val="0"/>
+          <w:numId w:val="9"/>
+        </w:numPr>
+        <w:spacing w:before="100" w:beforeAutospacing="1" w:after="100" w:afterAutospacing="1" w:line="240" w:lineRule="auto"/>
+        <w:rPr>
+          <w:rFonts w:ascii="Open Sans" w:eastAsia="Times New Roman" w:hAnsi="Open Sans" w:cs="Open Sans"/>
+          <w:sz w:val="24"/>
+          <w:szCs w:val="24"/>
+          <w:lang w:eastAsia="en-IN"/>
+        </w:rPr>
+      </w:pPr>
+      <w:r>
+        <w:rPr>
+          <w:rFonts w:ascii="Open Sans" w:eastAsia="Times New Roman" w:hAnsi="Open Sans" w:cs="Open Sans"/>
+          <w:sz w:val="24"/>
+          <w:szCs w:val="24"/>
+          <w:lang w:eastAsia="en-IN"/>
+        </w:rPr>
+        <w:t>Society Certificates &amp; Confirmations</w:t>
+      </w:r>
+    </w:p>
+    <w:p>
+      <w:pPr>
+        <w:numPr>
+          <w:ilvl w:val="0"/>
+          <w:numId w:val="9"/>
+        </w:numPr>
+        <w:spacing w:before="100" w:beforeAutospacing="1" w:after="100" w:afterAutospacing="1" w:line="240" w:lineRule="auto"/>
+        <w:rPr>
+          <w:rFonts w:ascii="Open Sans" w:eastAsia="Times New Roman" w:hAnsi="Open Sans" w:cs="Open Sans"/>
+          <w:sz w:val="24"/>
+          <w:szCs w:val="24"/>
+          <w:lang w:eastAsia="en-IN"/>
+        </w:rPr>
+      </w:pPr>
+      <w:r>
+        <w:rPr>
+          <w:rFonts w:ascii="Open Sans" w:eastAsia="Times New Roman" w:hAnsi="Open Sans" w:cs="Open Sans"/>
+          <w:sz w:val="24"/>
+          <w:szCs w:val="24"/>
+          <w:lang w:eastAsia="en-IN"/>
+        </w:rPr>
+        <w:t>Duplicate Share Certificate Assistance</w:t>
+      </w:r>
+    </w:p>
+    <w:p>
+      <w:pPr>
+        <w:pStyle w:val="Heading3"/>
+        <w:shd w:val="clear" w:color="auto" w:fill="FFFFFF"/>
+        <w:spacing w:before="0" w:beforeAutospacing="0" w:after="90" w:afterAutospacing="0" w:line="375" w:lineRule="atLeast"/>
+        <w:jc w:val="both"/>
+        <w:rPr>
+          <w:rFonts w:ascii="Open Sans" w:hAnsi="Open Sans"/>
+          <w:sz w:val="40"/>
+          <w:szCs w:val="40"/>
+        </w:rPr>
+      </w:pPr>
+      <w:r>
+        <w:rPr>
+          <w:rFonts w:ascii="Open Sans" w:hAnsi="Open Sans"/>
+          <w:sz w:val="40"/>
+          <w:szCs w:val="40"/>
+        </w:rPr>
+        <w:t>2.NRI SERVICES</w:t>
+      </w:r>
+    </w:p>
+    <w:p>
+      <w:pPr>
+        <w:rPr>
+          <w:rFonts w:ascii="Open Sans" w:eastAsia="Times New Roman" w:hAnsi="Open Sans" w:cs="Open Sans"/>
+          <w:b/>
+          <w:bCs/>
+          <w:sz w:val="24"/>
+          <w:szCs w:val="24"/>
+          <w:lang w:eastAsia="en-IN"/>
+        </w:rPr>
+      </w:pPr>
+      <w:r>
+        <w:rPr>
+          <w:rFonts w:ascii="Open Sans" w:eastAsia="Times New Roman" w:hAnsi="Open Sans" w:cs="Open Sans"/>
+          <w:b/>
+          <w:bCs/>
+          <w:sz w:val="24"/>
+          <w:szCs w:val="24"/>
+          <w:lang w:eastAsia="en-IN"/>
+        </w:rPr>
+        <w:t>Trusted NRI solutions for tax, property, and legal matters in India.</w:t>
+      </w:r>
+      <w:r>
+        <w:rPr>
+          <w:rFonts w:ascii="Open Sans" w:eastAsia="Times New Roman" w:hAnsi="Open Sans" w:cs="Open Sans"/>
+          <w:b/>
+          <w:bCs/>
+          <w:sz w:val="24"/>
+          <w:szCs w:val="24"/>
+          <w:lang w:eastAsia="en-IN"/>
+        </w:rPr>
+        <w:br/>
+        <w:t>Expert support. Complete peace of mind.</w:t>
+      </w:r>
+    </w:p>
+    <w:p>
+      <w:pPr>
+        <w:numPr>
+          <w:ilvl w:val="0"/>
+          <w:numId w:val="1"/>
+        </w:numPr>
+        <w:shd w:val="clear" w:color="auto" w:fill="FFFFFF"/>
+        <w:tabs>
+          <w:tab w:val="clear" w:pos="1440"/>
+        </w:tabs>
+        <w:spacing w:after="100" w:afterAutospacing="1" w:line="360" w:lineRule="atLeast"/>
+        <w:ind w:left="0" w:firstLine="0"/>
+        <w:jc w:val="both"/>
+        <w:rPr>
+          <w:rFonts w:ascii="Open Sans" w:eastAsia="Times New Roman" w:hAnsi="Open Sans"/>
+          <w:sz w:val="24"/>
+          <w:szCs w:val="24"/>
+          <w:lang w:eastAsia="en-IN"/>
+        </w:rPr>
+      </w:pPr>
+      <w:r>
+        <w:rPr>
+          <w:rFonts w:ascii="Open Sans" w:eastAsia="Times New Roman" w:hAnsi="Open Sans"/>
+          <w:sz w:val="24"/>
+          <w:szCs w:val="24"/>
+          <w:lang w:eastAsia="en-IN"/>
+        </w:rPr>
+        <w:t>Taxation services.</w:t>
+      </w:r>
+    </w:p>
+    <w:p>
+      <w:pPr>
+        <w:numPr>
+          <w:ilvl w:val="0"/>
+          <w:numId w:val="1"/>
+        </w:numPr>
+        <w:shd w:val="clear" w:color="auto" w:fill="FFFFFF"/>
+        <w:tabs>
+          <w:tab w:val="clear" w:pos="1440"/>
+        </w:tabs>
+        <w:spacing w:after="100" w:afterAutospacing="1" w:line="360" w:lineRule="atLeast"/>
+        <w:ind w:left="0" w:firstLine="0"/>
+        <w:jc w:val="both"/>
+        <w:rPr>
+          <w:rFonts w:ascii="Open Sans" w:eastAsia="Times New Roman" w:hAnsi="Open Sans"/>
+          <w:sz w:val="24"/>
+          <w:szCs w:val="24"/>
+          <w:lang w:eastAsia="en-IN"/>
+        </w:rPr>
+      </w:pPr>
+      <w:r>
+        <w:rPr>
+          <w:rFonts w:ascii="Open Sans" w:eastAsia="Times New Roman" w:hAnsi="Open Sans"/>
+          <w:sz w:val="24"/>
+          <w:szCs w:val="24"/>
+          <w:lang w:eastAsia="en-IN"/>
+        </w:rPr>
+        <w:t>Property management services</w:t>
+      </w:r>
+    </w:p>
+    <w:p>
+      <w:pPr>
+        <w:numPr>
+          <w:ilvl w:val="0"/>
+          <w:numId w:val="1"/>
+        </w:numPr>
+        <w:shd w:val="clear" w:color="auto" w:fill="FFFFFF"/>
+        <w:tabs>
+          <w:tab w:val="clear" w:pos="1440"/>
+        </w:tabs>
+        <w:spacing w:after="100" w:afterAutospacing="1" w:line="360" w:lineRule="atLeast"/>
+        <w:ind w:left="0" w:firstLine="0"/>
+        <w:jc w:val="both"/>
+        <w:rPr>
+          <w:rFonts w:ascii="Open Sans" w:eastAsia="Times New Roman" w:hAnsi="Open Sans"/>
+          <w:sz w:val="24"/>
+          <w:szCs w:val="24"/>
+          <w:lang w:eastAsia="en-IN"/>
+        </w:rPr>
+      </w:pPr>
+      <w:r>
+        <w:rPr>
+          <w:rFonts w:ascii="Open Sans" w:eastAsia="Times New Roman" w:hAnsi="Open Sans"/>
+          <w:sz w:val="24"/>
+          <w:szCs w:val="24"/>
+          <w:lang w:eastAsia="en-IN"/>
+        </w:rPr>
+        <w:t>Legal services</w:t>
+      </w:r>
+    </w:p>
+    <w:p>
+      <w:pPr>
+        <w:pStyle w:val="Heading3"/>
+        <w:shd w:val="clear" w:color="auto" w:fill="FFFFFF"/>
+        <w:spacing w:before="0" w:beforeAutospacing="0" w:after="90" w:afterAutospacing="0" w:line="375" w:lineRule="atLeast"/>
+        <w:jc w:val="both"/>
+        <w:rPr>
+          <w:rFonts w:ascii="Open Sans" w:hAnsi="Open Sans"/>
+          <w:sz w:val="40"/>
+          <w:szCs w:val="40"/>
+        </w:rPr>
+      </w:pPr>
+      <w:bookmarkStart w:id="2" w:name="_Hlk231721565"/>
+      <w:r>
+        <w:rPr>
+          <w:rFonts w:ascii="Open Sans" w:hAnsi="Open Sans"/>
+          <w:sz w:val="40"/>
+          <w:szCs w:val="40"/>
+        </w:rPr>
+        <w:lastRenderedPageBreak/>
+        <w:t>3.Senior Citizen Advisory Services</w:t>
+      </w:r>
+      <w:bookmarkEnd w:id="2"/>
+    </w:p>
+    <w:p>
+      <w:pPr>
+        <w:pStyle w:val="Heading3"/>
+        <w:shd w:val="clear" w:color="auto" w:fill="FFFFFF"/>
+        <w:spacing w:before="0" w:beforeAutospacing="0" w:after="90" w:afterAutospacing="0" w:line="375" w:lineRule="atLeast"/>
+        <w:jc w:val="both"/>
+        <w:rPr>
+          <w:rFonts w:ascii="Open Sans" w:hAnsi="Open Sans" w:cs="Open Sans"/>
+          <w:kern w:val="2"/>
+          <w:sz w:val="24"/>
+          <w:szCs w:val="24"/>
+          <w14:ligatures w14:val="standardContextual"/>
+        </w:rPr>
+      </w:pPr>
+      <w:r>
+        <w:rPr>
+          <w:rFonts w:ascii="Open Sans" w:hAnsi="Open Sans" w:cs="Open Sans"/>
+          <w:kern w:val="2"/>
+          <w:sz w:val="24"/>
+          <w:szCs w:val="24"/>
+          <w14:ligatures w14:val="standardContextual"/>
+        </w:rPr>
+        <w:t>Helping senior citizens manage tax, pension, property, and legal matters with ease.</w:t>
+      </w:r>
+    </w:p>
+    <w:p>
+      <w:pPr>
+        <w:numPr>
+          <w:ilvl w:val="0"/>
+          <w:numId w:val="21"/>
+        </w:numPr>
+        <w:shd w:val="clear" w:color="auto" w:fill="FFFFFF"/>
+        <w:spacing w:after="100" w:afterAutospacing="1" w:line="360" w:lineRule="atLeast"/>
+        <w:jc w:val="both"/>
+        <w:rPr>
+          <w:rFonts w:ascii="Open Sans" w:eastAsia="Times New Roman" w:hAnsi="Open Sans"/>
+          <w:sz w:val="24"/>
+          <w:szCs w:val="24"/>
+          <w:lang w:eastAsia="en-IN"/>
+        </w:rPr>
+      </w:pPr>
+      <w:r>
+        <w:rPr>
+          <w:rFonts w:ascii="Open Sans" w:eastAsia="Times New Roman" w:hAnsi="Open Sans"/>
+          <w:sz w:val="24"/>
+          <w:szCs w:val="24"/>
+          <w:lang w:eastAsia="en-IN"/>
+        </w:rPr>
+        <w:t xml:space="preserve">Health Insurance Claims Support </w:t>
+      </w:r>
+    </w:p>
+    <w:p>
+      <w:pPr>
+        <w:numPr>
+          <w:ilvl w:val="0"/>
+          <w:numId w:val="21"/>
+        </w:numPr>
+        <w:shd w:val="clear" w:color="auto" w:fill="FFFFFF"/>
+        <w:spacing w:after="100" w:afterAutospacing="1" w:line="360" w:lineRule="atLeast"/>
+        <w:jc w:val="both"/>
+        <w:rPr>
+          <w:rFonts w:ascii="Open Sans" w:eastAsia="Times New Roman" w:hAnsi="Open Sans"/>
+          <w:sz w:val="24"/>
+          <w:szCs w:val="24"/>
+          <w:lang w:eastAsia="en-IN"/>
+        </w:rPr>
+      </w:pPr>
+      <w:r>
+        <w:rPr>
+          <w:rFonts w:ascii="Open Sans" w:eastAsia="Times New Roman" w:hAnsi="Open Sans"/>
+          <w:sz w:val="24"/>
+          <w:szCs w:val="24"/>
+          <w:lang w:eastAsia="en-IN"/>
+        </w:rPr>
+        <w:t xml:space="preserve">Income Tax planning &amp; Filing </w:t>
+      </w:r>
+    </w:p>
+    <w:p>
+      <w:pPr>
+        <w:numPr>
+          <w:ilvl w:val="0"/>
+          <w:numId w:val="21"/>
+        </w:numPr>
+        <w:shd w:val="clear" w:color="auto" w:fill="FFFFFF"/>
+        <w:spacing w:after="100" w:afterAutospacing="1" w:line="360" w:lineRule="atLeast"/>
+        <w:jc w:val="both"/>
+        <w:rPr>
+          <w:rFonts w:ascii="Open Sans" w:eastAsia="Times New Roman" w:hAnsi="Open Sans"/>
+          <w:sz w:val="24"/>
+          <w:szCs w:val="24"/>
+          <w:lang w:eastAsia="en-IN"/>
+        </w:rPr>
+      </w:pPr>
+      <w:r>
+        <w:rPr>
+          <w:rFonts w:ascii="Open Sans" w:eastAsia="Times New Roman" w:hAnsi="Open Sans"/>
+          <w:sz w:val="24"/>
+          <w:szCs w:val="24"/>
+          <w:lang w:eastAsia="en-IN"/>
+        </w:rPr>
+        <w:t>Pension &amp; Gratuity Documentations.</w:t>
+      </w:r>
+    </w:p>
+    <w:p>
+      <w:pPr>
+        <w:numPr>
+          <w:ilvl w:val="0"/>
+          <w:numId w:val="21"/>
+        </w:numPr>
+        <w:shd w:val="clear" w:color="auto" w:fill="FFFFFF"/>
+        <w:spacing w:after="100" w:afterAutospacing="1" w:line="360" w:lineRule="atLeast"/>
+        <w:jc w:val="both"/>
+        <w:rPr>
+          <w:rFonts w:ascii="Open Sans" w:eastAsia="Times New Roman" w:hAnsi="Open Sans"/>
+          <w:sz w:val="24"/>
+          <w:szCs w:val="24"/>
+          <w:lang w:eastAsia="en-IN"/>
+        </w:rPr>
+      </w:pPr>
+      <w:r>
+        <w:rPr>
+          <w:rFonts w:ascii="Open Sans" w:eastAsia="Times New Roman" w:hAnsi="Open Sans"/>
+          <w:sz w:val="24"/>
+          <w:szCs w:val="24"/>
+          <w:lang w:eastAsia="en-IN"/>
+        </w:rPr>
+        <w:t xml:space="preserve">Property sale. Gift &amp; Transfer </w:t>
+      </w:r>
+    </w:p>
+    <w:p>
+      <w:pPr>
+        <w:numPr>
+          <w:ilvl w:val="0"/>
+          <w:numId w:val="21"/>
+        </w:numPr>
+        <w:shd w:val="clear" w:color="auto" w:fill="FFFFFF"/>
+        <w:spacing w:after="100" w:afterAutospacing="1" w:line="360" w:lineRule="atLeast"/>
+        <w:jc w:val="both"/>
+        <w:rPr>
+          <w:rFonts w:ascii="Open Sans" w:eastAsia="Times New Roman" w:hAnsi="Open Sans"/>
+          <w:sz w:val="24"/>
+          <w:szCs w:val="24"/>
+          <w:lang w:eastAsia="en-IN"/>
+        </w:rPr>
+      </w:pPr>
+      <w:r>
+        <w:rPr>
+          <w:rFonts w:ascii="Open Sans" w:eastAsia="Times New Roman" w:hAnsi="Open Sans"/>
+          <w:sz w:val="24"/>
+          <w:szCs w:val="24"/>
+          <w:lang w:eastAsia="en-IN"/>
+        </w:rPr>
+        <w:t xml:space="preserve">Legal, Estate &amp; Succession </w:t>
+      </w:r>
+    </w:p>
+    <w:p>
+      <w:pPr>
+        <w:pStyle w:val="Heading3"/>
+        <w:shd w:val="clear" w:color="auto" w:fill="FFFFFF"/>
+        <w:spacing w:before="0" w:beforeAutospacing="0" w:after="90" w:afterAutospacing="0" w:line="375" w:lineRule="atLeast"/>
+        <w:jc w:val="both"/>
+        <w:rPr>
+          <w:rFonts w:ascii="Open Sans" w:hAnsi="Open Sans"/>
+          <w:sz w:val="40"/>
+          <w:szCs w:val="40"/>
+        </w:rPr>
+      </w:pPr>
+      <w:r>
+        <w:rPr>
+          <w:rFonts w:ascii="Open Sans" w:hAnsi="Open Sans"/>
+          <w:sz w:val="40"/>
+          <w:szCs w:val="40"/>
+        </w:rPr>
+        <w:t>4.</w:t>
+      </w:r>
+      <w:r>
+        <w:rPr>
+          <w:rFonts w:ascii="Open Sans" w:hAnsi="Open Sans"/>
+          <w:sz w:val="40"/>
+          <w:szCs w:val="40"/>
+        </w:rPr>
+        <w:t xml:space="preserve">Compliance &amp; </w:t>
+      </w:r>
+      <w:r>
+        <w:rPr>
+          <w:rFonts w:ascii="Open Sans" w:hAnsi="Open Sans"/>
+          <w:sz w:val="40"/>
+          <w:szCs w:val="40"/>
+        </w:rPr>
+        <w:t xml:space="preserve">Business Advisory </w:t>
+      </w:r>
+    </w:p>
+    <w:p>
+      <w:pPr>
+        <w:pStyle w:val="Heading3"/>
+        <w:shd w:val="clear" w:color="auto" w:fill="FFFFFF"/>
+        <w:spacing w:before="0" w:beforeAutospacing="0" w:after="90" w:afterAutospacing="0" w:line="375" w:lineRule="atLeast"/>
+        <w:jc w:val="both"/>
+        <w:rPr>
+          <w:rFonts w:ascii="Open Sans" w:hAnsi="Open Sans" w:cs="Open Sans"/>
+          <w:kern w:val="2"/>
+          <w:sz w:val="24"/>
+          <w:szCs w:val="24"/>
+          <w14:ligatures w14:val="standardContextual"/>
+        </w:rPr>
+      </w:pPr>
+      <w:r>
+        <w:rPr>
+          <w:rFonts w:ascii="Open Sans" w:hAnsi="Open Sans" w:cs="Open Sans"/>
+          <w:kern w:val="2"/>
+          <w:sz w:val="24"/>
+          <w:szCs w:val="24"/>
+          <w14:ligatures w14:val="standardContextual"/>
+        </w:rPr>
+        <w:t xml:space="preserve">One-stop solution for business setup, statutory registrations, compliance management, and Virtual CFO services. </w:t>
+      </w:r>
+    </w:p>
+    <w:p>
+      <w:pPr>
         <w:rPr>
           <w:b/>
           <w:bCs/>
           <w:sz w:val="32"/>
           <w:szCs w:val="32"/>
         </w:rPr>
-        <w:t>Society Documentation &amp; Certification Services</w:t>
-      </w:r>
-    </w:p>
-    <w:p>
-      <w:pPr>
-        <w:numPr>
-          <w:ilvl w:val="0"/>
-          <w:numId w:val="9"/>
-        </w:numPr>
-        <w:spacing w:before="100" w:beforeAutospacing="1" w:after="100" w:afterAutospacing="1" w:line="240" w:lineRule="auto"/>
-        <w:rPr>
-          <w:rFonts w:ascii="Open Sans" w:eastAsia="Times New Roman" w:hAnsi="Open Sans" w:cs="Open Sans"/>
-          <w:sz w:val="24"/>
-          <w:szCs w:val="24"/>
-          <w:lang w:eastAsia="en-IN"/>
-        </w:rPr>
-      </w:pPr>
-      <w:r>
-        <w:rPr>
-          <w:rFonts w:ascii="Open Sans" w:eastAsia="Times New Roman" w:hAnsi="Open Sans" w:cs="Open Sans"/>
-          <w:sz w:val="24"/>
-          <w:szCs w:val="24"/>
-          <w:lang w:eastAsia="en-IN"/>
-        </w:rPr>
-        <w:t>NOC for Flat Transfer</w:t>
-      </w:r>
-    </w:p>
-    <w:p>
-      <w:pPr>
-        <w:numPr>
-          <w:ilvl w:val="0"/>
-          <w:numId w:val="9"/>
-        </w:numPr>
-        <w:spacing w:before="100" w:beforeAutospacing="1" w:after="100" w:afterAutospacing="1" w:line="240" w:lineRule="auto"/>
-        <w:rPr>
-          <w:rFonts w:ascii="Open Sans" w:eastAsia="Times New Roman" w:hAnsi="Open Sans" w:cs="Open Sans"/>
-          <w:sz w:val="24"/>
-          <w:szCs w:val="24"/>
-          <w:lang w:eastAsia="en-IN"/>
-        </w:rPr>
-      </w:pPr>
-      <w:r>
-        <w:rPr>
-          <w:rFonts w:ascii="Open Sans" w:eastAsia="Times New Roman" w:hAnsi="Open Sans" w:cs="Open Sans"/>
-          <w:sz w:val="24"/>
-          <w:szCs w:val="24"/>
-          <w:lang w:eastAsia="en-IN"/>
-        </w:rPr>
-        <w:t>NOC for Sale of Flat</w:t>
-      </w:r>
-    </w:p>
-    <w:p>
-      <w:pPr>
-        <w:numPr>
-          <w:ilvl w:val="0"/>
-          <w:numId w:val="9"/>
-        </w:numPr>
-        <w:spacing w:before="100" w:beforeAutospacing="1" w:after="100" w:afterAutospacing="1" w:line="240" w:lineRule="auto"/>
-        <w:rPr>
-          <w:rFonts w:ascii="Open Sans" w:eastAsia="Times New Roman" w:hAnsi="Open Sans" w:cs="Open Sans"/>
-          <w:sz w:val="24"/>
-          <w:szCs w:val="24"/>
-          <w:lang w:eastAsia="en-IN"/>
-        </w:rPr>
-      </w:pPr>
-      <w:r>
-        <w:rPr>
-          <w:rFonts w:ascii="Open Sans" w:eastAsia="Times New Roman" w:hAnsi="Open Sans" w:cs="Open Sans"/>
-          <w:sz w:val="24"/>
-          <w:szCs w:val="24"/>
-          <w:lang w:eastAsia="en-IN"/>
-        </w:rPr>
-        <w:t>NOC for Home Loans</w:t>
-      </w:r>
-    </w:p>
-    <w:p>
-      <w:pPr>
-        <w:numPr>
-          <w:ilvl w:val="0"/>
-          <w:numId w:val="9"/>
-        </w:numPr>
-        <w:spacing w:before="100" w:beforeAutospacing="1" w:after="100" w:afterAutospacing="1" w:line="240" w:lineRule="auto"/>
-        <w:rPr>
-          <w:rFonts w:ascii="Open Sans" w:eastAsia="Times New Roman" w:hAnsi="Open Sans" w:cs="Open Sans"/>
-          <w:sz w:val="24"/>
-          <w:szCs w:val="24"/>
-          <w:lang w:eastAsia="en-IN"/>
-        </w:rPr>
-      </w:pPr>
-      <w:r>
-        <w:rPr>
-          <w:rFonts w:ascii="Open Sans" w:eastAsia="Times New Roman" w:hAnsi="Open Sans" w:cs="Open Sans"/>
-          <w:sz w:val="24"/>
-          <w:szCs w:val="24"/>
-          <w:lang w:eastAsia="en-IN"/>
-        </w:rPr>
-        <w:t>NOC for Passport Verification</w:t>
-      </w:r>
-    </w:p>
-    <w:p>
-      <w:pPr>
-        <w:numPr>
-          <w:ilvl w:val="0"/>
-          <w:numId w:val="9"/>
-        </w:numPr>
-        <w:spacing w:before="100" w:beforeAutospacing="1" w:after="100" w:afterAutospacing="1" w:line="240" w:lineRule="auto"/>
-        <w:rPr>
-          <w:rFonts w:ascii="Open Sans" w:eastAsia="Times New Roman" w:hAnsi="Open Sans" w:cs="Open Sans"/>
-          <w:sz w:val="24"/>
-          <w:szCs w:val="24"/>
-          <w:lang w:eastAsia="en-IN"/>
-        </w:rPr>
-      </w:pPr>
-      <w:r>
-        <w:rPr>
-          <w:rFonts w:ascii="Open Sans" w:eastAsia="Times New Roman" w:hAnsi="Open Sans" w:cs="Open Sans"/>
-          <w:sz w:val="24"/>
-          <w:szCs w:val="24"/>
-          <w:lang w:eastAsia="en-IN"/>
-        </w:rPr>
-        <w:t>Membership Transfer Documentation</w:t>
-      </w:r>
-    </w:p>
-    <w:p>
-      <w:pPr>
-        <w:numPr>
-          <w:ilvl w:val="0"/>
-          <w:numId w:val="9"/>
-        </w:numPr>
-        <w:spacing w:before="100" w:beforeAutospacing="1" w:after="100" w:afterAutospacing="1" w:line="240" w:lineRule="auto"/>
-        <w:rPr>
-          <w:rFonts w:ascii="Open Sans" w:eastAsia="Times New Roman" w:hAnsi="Open Sans" w:cs="Open Sans"/>
-          <w:sz w:val="24"/>
-          <w:szCs w:val="24"/>
-          <w:lang w:eastAsia="en-IN"/>
-        </w:rPr>
-      </w:pPr>
-      <w:r>
-        <w:rPr>
-          <w:rFonts w:ascii="Open Sans" w:eastAsia="Times New Roman" w:hAnsi="Open Sans" w:cs="Open Sans"/>
-          <w:sz w:val="24"/>
-          <w:szCs w:val="24"/>
-          <w:lang w:eastAsia="en-IN"/>
-        </w:rPr>
-        <w:t>Share Certificate Documentation</w:t>
-      </w:r>
-    </w:p>
-    <w:p>
-      <w:pPr>
-        <w:numPr>
-          <w:ilvl w:val="0"/>
-          <w:numId w:val="9"/>
-        </w:numPr>
-        <w:spacing w:before="100" w:beforeAutospacing="1" w:after="100" w:afterAutospacing="1" w:line="240" w:lineRule="auto"/>
-        <w:rPr>
-          <w:rFonts w:ascii="Open Sans" w:eastAsia="Times New Roman" w:hAnsi="Open Sans" w:cs="Open Sans"/>
-          <w:sz w:val="24"/>
-          <w:szCs w:val="24"/>
-          <w:lang w:eastAsia="en-IN"/>
-        </w:rPr>
-      </w:pPr>
-      <w:r>
-        <w:rPr>
-          <w:rFonts w:ascii="Open Sans" w:eastAsia="Times New Roman" w:hAnsi="Open Sans" w:cs="Open Sans"/>
-          <w:sz w:val="24"/>
-          <w:szCs w:val="24"/>
-          <w:lang w:eastAsia="en-IN"/>
-        </w:rPr>
-        <w:t>Society Certificates &amp; Confirmations</w:t>
-      </w:r>
-    </w:p>
-    <w:p>
-      <w:pPr>
-        <w:numPr>
-          <w:ilvl w:val="0"/>
-          <w:numId w:val="9"/>
-        </w:numPr>
-        <w:spacing w:before="100" w:beforeAutospacing="1" w:after="100" w:afterAutospacing="1" w:line="240" w:lineRule="auto"/>
-        <w:rPr>
-          <w:rFonts w:ascii="Open Sans" w:eastAsia="Times New Roman" w:hAnsi="Open Sans" w:cs="Open Sans"/>
-          <w:sz w:val="24"/>
-          <w:szCs w:val="24"/>
-          <w:lang w:eastAsia="en-IN"/>
-        </w:rPr>
-      </w:pPr>
-      <w:r>
-        <w:rPr>
-          <w:rFonts w:ascii="Open Sans" w:eastAsia="Times New Roman" w:hAnsi="Open Sans" w:cs="Open Sans"/>
-          <w:sz w:val="24"/>
-          <w:szCs w:val="24"/>
-          <w:lang w:eastAsia="en-IN"/>
-        </w:rPr>
-        <w:t>Duplicate Share Certificate Assistance</w:t>
-      </w:r>
-    </w:p>
-    <w:p>
-      <w:pPr>
-        <w:pStyle w:val="Heading3"/>
-        <w:shd w:val="clear" w:color="auto" w:fill="FFFFFF"/>
-        <w:spacing w:before="0" w:beforeAutospacing="0" w:after="90" w:afterAutospacing="0" w:line="375" w:lineRule="atLeast"/>
-        <w:jc w:val="both"/>
-        <w:rPr>
-          <w:rFonts w:ascii="Open Sans" w:hAnsi="Open Sans"/>
-          <w:sz w:val="40"/>
-          <w:szCs w:val="40"/>
-        </w:rPr>
-      </w:pPr>
-      <w:r>
-        <w:rPr>
-          <w:rFonts w:ascii="Open Sans" w:hAnsi="Open Sans"/>
-          <w:sz w:val="40"/>
-          <w:szCs w:val="40"/>
-        </w:rPr>
-        <w:t>2.NRI SERVICES</w:t>
-      </w:r>
-    </w:p>
-    <w:p>
-      <w:pPr>
-        <w:numPr>
-          <w:ilvl w:val="0"/>
-          <w:numId w:val="1"/>
-        </w:numPr>
-        <w:shd w:val="clear" w:color="auto" w:fill="FFFFFF"/>
-        <w:tabs>
-          <w:tab w:val="clear" w:pos="1440"/>
-        </w:tabs>
-        <w:spacing w:after="100" w:afterAutospacing="1" w:line="360" w:lineRule="atLeast"/>
-        <w:ind w:left="0" w:firstLine="0"/>
-        <w:jc w:val="both"/>
-        <w:rPr>
-          <w:rFonts w:ascii="Open Sans" w:eastAsia="Times New Roman" w:hAnsi="Open Sans"/>
-          <w:sz w:val="24"/>
-          <w:szCs w:val="24"/>
-          <w:lang w:eastAsia="en-IN"/>
-        </w:rPr>
-      </w:pPr>
-      <w:r>
-        <w:rPr>
-          <w:rFonts w:ascii="Open Sans" w:eastAsia="Times New Roman" w:hAnsi="Open Sans"/>
-          <w:sz w:val="24"/>
-          <w:szCs w:val="24"/>
-          <w:lang w:eastAsia="en-IN"/>
-        </w:rPr>
-        <w:t>Taxation services.</w:t>
-      </w:r>
-    </w:p>
-    <w:p>
-      <w:pPr>
-        <w:numPr>
-          <w:ilvl w:val="0"/>
-          <w:numId w:val="1"/>
-        </w:numPr>
-        <w:shd w:val="clear" w:color="auto" w:fill="FFFFFF"/>
-        <w:tabs>
-          <w:tab w:val="clear" w:pos="1440"/>
-        </w:tabs>
-        <w:spacing w:after="100" w:afterAutospacing="1" w:line="360" w:lineRule="atLeast"/>
-        <w:ind w:left="0" w:firstLine="0"/>
-        <w:jc w:val="both"/>
-        <w:rPr>
-          <w:rFonts w:ascii="Open Sans" w:eastAsia="Times New Roman" w:hAnsi="Open Sans"/>
-          <w:sz w:val="24"/>
-          <w:szCs w:val="24"/>
-          <w:lang w:eastAsia="en-IN"/>
-        </w:rPr>
-      </w:pPr>
-      <w:r>
-        <w:rPr>
-          <w:rFonts w:ascii="Open Sans" w:eastAsia="Times New Roman" w:hAnsi="Open Sans"/>
-          <w:sz w:val="24"/>
-          <w:szCs w:val="24"/>
-          <w:lang w:eastAsia="en-IN"/>
-        </w:rPr>
-        <w:t>Property management services</w:t>
-      </w:r>
-    </w:p>
-    <w:p>
-      <w:pPr>
-        <w:numPr>
-          <w:ilvl w:val="0"/>
-          <w:numId w:val="1"/>
-        </w:numPr>
-        <w:shd w:val="clear" w:color="auto" w:fill="FFFFFF"/>
-        <w:tabs>
-          <w:tab w:val="clear" w:pos="1440"/>
-        </w:tabs>
-        <w:spacing w:after="100" w:afterAutospacing="1" w:line="360" w:lineRule="atLeast"/>
-        <w:ind w:left="0" w:firstLine="0"/>
-        <w:jc w:val="both"/>
-        <w:rPr>
-          <w:rFonts w:ascii="Open Sans" w:eastAsia="Times New Roman" w:hAnsi="Open Sans"/>
-          <w:sz w:val="24"/>
-          <w:szCs w:val="24"/>
-          <w:lang w:eastAsia="en-IN"/>
-        </w:rPr>
-      </w:pPr>
-      <w:r>
-        <w:rPr>
-          <w:rFonts w:ascii="Open Sans" w:eastAsia="Times New Roman" w:hAnsi="Open Sans"/>
-          <w:sz w:val="24"/>
-          <w:szCs w:val="24"/>
-          <w:lang w:eastAsia="en-IN"/>
-        </w:rPr>
-        <w:t>Legal services</w:t>
-      </w:r>
-    </w:p>
-    <w:p>
-      <w:pPr>
-        <w:pStyle w:val="Heading3"/>
-        <w:shd w:val="clear" w:color="auto" w:fill="FFFFFF"/>
-        <w:spacing w:before="0" w:beforeAutospacing="0" w:after="90" w:afterAutospacing="0" w:line="375" w:lineRule="atLeast"/>
-        <w:jc w:val="both"/>
-        <w:rPr>
-          <w:rFonts w:ascii="Open Sans" w:hAnsi="Open Sans"/>
-          <w:sz w:val="40"/>
-          <w:szCs w:val="40"/>
-        </w:rPr>
-      </w:pPr>
-      <w:bookmarkStart w:id="2" w:name="_Hlk231721565"/>
-      <w:r>
-        <w:rPr>
-          <w:rFonts w:ascii="Open Sans" w:hAnsi="Open Sans"/>
-          <w:sz w:val="40"/>
-          <w:szCs w:val="40"/>
-        </w:rPr>
-        <w:t>3.Senior Citizen Advisory Services</w:t>
-      </w:r>
-      <w:bookmarkEnd w:id="2"/>
-    </w:p>
-    <w:p>
-      <w:pPr>
-        <w:numPr>
-          <w:ilvl w:val="0"/>
-          <w:numId w:val="1"/>
-        </w:numPr>
-        <w:shd w:val="clear" w:color="auto" w:fill="FFFFFF"/>
-        <w:tabs>
-          <w:tab w:val="clear" w:pos="1440"/>
-        </w:tabs>
-        <w:spacing w:after="100" w:afterAutospacing="1" w:line="360" w:lineRule="atLeast"/>
-        <w:ind w:left="0" w:firstLine="0"/>
-        <w:jc w:val="both"/>
-        <w:rPr>
-          <w:rFonts w:ascii="Open Sans" w:eastAsia="Times New Roman" w:hAnsi="Open Sans"/>
-          <w:sz w:val="24"/>
-          <w:szCs w:val="24"/>
-          <w:lang w:eastAsia="en-IN"/>
-        </w:rPr>
-      </w:pPr>
-      <w:r>
-        <w:rPr>
-          <w:rFonts w:ascii="Open Sans" w:eastAsia="Times New Roman" w:hAnsi="Open Sans"/>
-          <w:sz w:val="24"/>
-          <w:szCs w:val="24"/>
-          <w:lang w:eastAsia="en-IN"/>
-        </w:rPr>
-        <w:t xml:space="preserve">Health Insurance Claims Support </w:t>
-      </w:r>
-    </w:p>
-    <w:p>
-      <w:pPr>
-        <w:numPr>
-          <w:ilvl w:val="0"/>
-          <w:numId w:val="1"/>
-        </w:numPr>
-        <w:shd w:val="clear" w:color="auto" w:fill="FFFFFF"/>
-        <w:tabs>
-          <w:tab w:val="clear" w:pos="1440"/>
-        </w:tabs>
-        <w:spacing w:after="100" w:afterAutospacing="1" w:line="360" w:lineRule="atLeast"/>
-        <w:ind w:left="0" w:firstLine="0"/>
-        <w:jc w:val="both"/>
-        <w:rPr>
-          <w:rFonts w:ascii="Open Sans" w:eastAsia="Times New Roman" w:hAnsi="Open Sans"/>
-          <w:sz w:val="24"/>
-          <w:szCs w:val="24"/>
-          <w:lang w:eastAsia="en-IN"/>
-        </w:rPr>
-      </w:pPr>
-      <w:r>
-        <w:rPr>
-          <w:rFonts w:ascii="Open Sans" w:eastAsia="Times New Roman" w:hAnsi="Open Sans"/>
-          <w:sz w:val="24"/>
-          <w:szCs w:val="24"/>
-          <w:lang w:eastAsia="en-IN"/>
-        </w:rPr>
-        <w:t xml:space="preserve">Income Tax planning &amp; Filing </w:t>
-      </w:r>
-    </w:p>
-    <w:p>
-      <w:pPr>
-        <w:numPr>
-          <w:ilvl w:val="0"/>
-          <w:numId w:val="1"/>
-        </w:numPr>
-        <w:shd w:val="clear" w:color="auto" w:fill="FFFFFF"/>
-        <w:tabs>
-          <w:tab w:val="clear" w:pos="1440"/>
-        </w:tabs>
-        <w:spacing w:after="100" w:afterAutospacing="1" w:line="360" w:lineRule="atLeast"/>
-        <w:ind w:left="0" w:firstLine="0"/>
-        <w:jc w:val="both"/>
-        <w:rPr>
-          <w:rFonts w:ascii="Open Sans" w:eastAsia="Times New Roman" w:hAnsi="Open Sans"/>
-          <w:sz w:val="24"/>
-          <w:szCs w:val="24"/>
-          <w:lang w:eastAsia="en-IN"/>
-        </w:rPr>
-      </w:pPr>
-      <w:r>
-        <w:rPr>
-          <w:rFonts w:ascii="Open Sans" w:eastAsia="Times New Roman" w:hAnsi="Open Sans"/>
-          <w:sz w:val="24"/>
-          <w:szCs w:val="24"/>
-          <w:lang w:eastAsia="en-IN"/>
-        </w:rPr>
-        <w:t>Pension &amp; Gratuity Documentations.</w:t>
-      </w:r>
-    </w:p>
-    <w:p>
-      <w:pPr>
-        <w:numPr>
-          <w:ilvl w:val="0"/>
-          <w:numId w:val="1"/>
-        </w:numPr>
-        <w:shd w:val="clear" w:color="auto" w:fill="FFFFFF"/>
-        <w:tabs>
-          <w:tab w:val="clear" w:pos="1440"/>
-        </w:tabs>
-        <w:spacing w:after="100" w:afterAutospacing="1" w:line="360" w:lineRule="atLeast"/>
-        <w:ind w:left="0" w:firstLine="0"/>
-        <w:jc w:val="both"/>
-        <w:rPr>
-          <w:rFonts w:ascii="Open Sans" w:eastAsia="Times New Roman" w:hAnsi="Open Sans"/>
-          <w:sz w:val="24"/>
-          <w:szCs w:val="24"/>
-          <w:lang w:eastAsia="en-IN"/>
-        </w:rPr>
-      </w:pPr>
-      <w:r>
-        <w:rPr>
-          <w:rFonts w:ascii="Open Sans" w:eastAsia="Times New Roman" w:hAnsi="Open Sans"/>
-          <w:sz w:val="24"/>
-          <w:szCs w:val="24"/>
-          <w:lang w:eastAsia="en-IN"/>
-        </w:rPr>
-        <w:t xml:space="preserve">Property sale. Gift &amp; Transfer </w:t>
-      </w:r>
-    </w:p>
-    <w:p>
-      <w:pPr>
-        <w:numPr>
-          <w:ilvl w:val="0"/>
-          <w:numId w:val="1"/>
-        </w:numPr>
-        <w:shd w:val="clear" w:color="auto" w:fill="FFFFFF"/>
-        <w:tabs>
-          <w:tab w:val="clear" w:pos="1440"/>
-        </w:tabs>
-        <w:spacing w:after="100" w:afterAutospacing="1" w:line="360" w:lineRule="atLeast"/>
-        <w:ind w:left="0" w:firstLine="0"/>
-        <w:jc w:val="both"/>
-        <w:rPr>
-          <w:rFonts w:ascii="Open Sans" w:eastAsia="Times New Roman" w:hAnsi="Open Sans"/>
-          <w:sz w:val="24"/>
-          <w:szCs w:val="24"/>
-          <w:lang w:eastAsia="en-IN"/>
-        </w:rPr>
-      </w:pPr>
-      <w:r>
-        <w:rPr>
-          <w:rFonts w:ascii="Open Sans" w:eastAsia="Times New Roman" w:hAnsi="Open Sans"/>
-          <w:sz w:val="24"/>
-          <w:szCs w:val="24"/>
-          <w:lang w:eastAsia="en-IN"/>
-        </w:rPr>
-        <w:t xml:space="preserve">Legal, Estate &amp; Succession </w:t>
-      </w:r>
-    </w:p>
-    <w:p>
-      <w:pPr>
-        <w:pStyle w:val="Heading3"/>
-        <w:shd w:val="clear" w:color="auto" w:fill="FFFFFF"/>
-        <w:spacing w:before="0" w:beforeAutospacing="0" w:after="90" w:afterAutospacing="0" w:line="375" w:lineRule="atLeast"/>
-        <w:jc w:val="both"/>
-        <w:rPr>
-          <w:rFonts w:ascii="Open Sans" w:hAnsi="Open Sans"/>
-          <w:sz w:val="40"/>
-          <w:szCs w:val="40"/>
-        </w:rPr>
-      </w:pPr>
-      <w:r>
-        <w:rPr>
-          <w:rFonts w:ascii="Open Sans" w:hAnsi="Open Sans"/>
-          <w:sz w:val="40"/>
-          <w:szCs w:val="40"/>
-        </w:rPr>
-        <w:t>4.</w:t>
-      </w:r>
-      <w:r>
-        <w:rPr>
-          <w:rFonts w:ascii="Open Sans" w:hAnsi="Open Sans"/>
-          <w:sz w:val="40"/>
-          <w:szCs w:val="40"/>
-        </w:rPr>
-        <w:t xml:space="preserve">Compliance &amp; </w:t>
-      </w:r>
-      <w:r>
-        <w:rPr>
-          <w:rFonts w:ascii="Open Sans" w:hAnsi="Open Sans"/>
-          <w:sz w:val="40"/>
-          <w:szCs w:val="40"/>
-        </w:rPr>
-        <w:t xml:space="preserve">Business Advisory </w:t>
-      </w:r>
-    </w:p>
-    <w:p>
-      <w:pPr>
+      </w:pPr>
+      <w:r>
         <w:rPr>
           <w:b/>
           <w:bCs/>
           <w:sz w:val="32"/>
           <w:szCs w:val="32"/>
         </w:rPr>
-      </w:pPr>
-      <w:r>
+        <w:t>Company Formation</w:t>
+      </w:r>
+    </w:p>
+    <w:p>
+      <w:pPr>
+        <w:numPr>
+          <w:ilvl w:val="0"/>
+          <w:numId w:val="2"/>
+        </w:numPr>
+        <w:shd w:val="clear" w:color="auto" w:fill="FFFFFF"/>
+        <w:spacing w:after="100" w:afterAutospacing="1" w:line="360" w:lineRule="atLeast"/>
+        <w:jc w:val="both"/>
+        <w:rPr>
+          <w:rFonts w:ascii="Open Sans" w:eastAsia="Times New Roman" w:hAnsi="Open Sans"/>
+          <w:sz w:val="24"/>
+          <w:szCs w:val="24"/>
+          <w:lang w:eastAsia="en-IN"/>
+        </w:rPr>
+      </w:pPr>
+      <w:r>
+        <w:rPr>
+          <w:rFonts w:ascii="Open Sans" w:eastAsia="Times New Roman" w:hAnsi="Open Sans"/>
+          <w:sz w:val="24"/>
+          <w:szCs w:val="24"/>
+          <w:lang w:eastAsia="en-IN"/>
+        </w:rPr>
+        <w:t xml:space="preserve">Private Limited Company Registration </w:t>
+      </w:r>
+    </w:p>
+    <w:p>
+      <w:pPr>
+        <w:numPr>
+          <w:ilvl w:val="0"/>
+          <w:numId w:val="2"/>
+        </w:numPr>
+        <w:shd w:val="clear" w:color="auto" w:fill="FFFFFF"/>
+        <w:spacing w:after="100" w:afterAutospacing="1" w:line="360" w:lineRule="atLeast"/>
+        <w:jc w:val="both"/>
+        <w:rPr>
+          <w:rFonts w:ascii="Open Sans" w:eastAsia="Times New Roman" w:hAnsi="Open Sans"/>
+          <w:sz w:val="24"/>
+          <w:szCs w:val="24"/>
+          <w:lang w:eastAsia="en-IN"/>
+        </w:rPr>
+      </w:pPr>
+      <w:r>
+        <w:rPr>
+          <w:rFonts w:ascii="Open Sans" w:eastAsia="Times New Roman" w:hAnsi="Open Sans"/>
+          <w:sz w:val="24"/>
+          <w:szCs w:val="24"/>
+          <w:lang w:eastAsia="en-IN"/>
+        </w:rPr>
+        <w:t xml:space="preserve">LLP Registration </w:t>
+      </w:r>
+    </w:p>
+    <w:p>
+      <w:pPr>
+        <w:numPr>
+          <w:ilvl w:val="0"/>
+          <w:numId w:val="2"/>
+        </w:numPr>
+        <w:shd w:val="clear" w:color="auto" w:fill="FFFFFF"/>
+        <w:spacing w:after="100" w:afterAutospacing="1" w:line="360" w:lineRule="atLeast"/>
+        <w:jc w:val="both"/>
+        <w:rPr>
+          <w:rFonts w:ascii="Open Sans" w:eastAsia="Times New Roman" w:hAnsi="Open Sans"/>
+          <w:sz w:val="24"/>
+          <w:szCs w:val="24"/>
+          <w:lang w:eastAsia="en-IN"/>
+        </w:rPr>
+      </w:pPr>
+      <w:r>
+        <w:rPr>
+          <w:rFonts w:ascii="Open Sans" w:eastAsia="Times New Roman" w:hAnsi="Open Sans"/>
+          <w:sz w:val="24"/>
+          <w:szCs w:val="24"/>
+          <w:lang w:eastAsia="en-IN"/>
+        </w:rPr>
+        <w:t xml:space="preserve">Partnership Firm Registration </w:t>
+      </w:r>
+    </w:p>
+    <w:p>
+      <w:pPr>
+        <w:numPr>
+          <w:ilvl w:val="0"/>
+          <w:numId w:val="2"/>
+        </w:numPr>
+        <w:shd w:val="clear" w:color="auto" w:fill="FFFFFF"/>
+        <w:spacing w:after="100" w:afterAutospacing="1" w:line="360" w:lineRule="atLeast"/>
+        <w:jc w:val="both"/>
+        <w:rPr>
+          <w:rFonts w:ascii="Open Sans" w:eastAsia="Times New Roman" w:hAnsi="Open Sans"/>
+          <w:sz w:val="24"/>
+          <w:szCs w:val="24"/>
+          <w:lang w:eastAsia="en-IN"/>
+        </w:rPr>
+      </w:pPr>
+      <w:r>
+        <w:rPr>
+          <w:rFonts w:ascii="Open Sans" w:eastAsia="Times New Roman" w:hAnsi="Open Sans"/>
+          <w:sz w:val="24"/>
+          <w:szCs w:val="24"/>
+          <w:lang w:eastAsia="en-IN"/>
+        </w:rPr>
+        <w:t xml:space="preserve">Public Limited Company Registration </w:t>
+      </w:r>
+    </w:p>
+    <w:p>
+      <w:pPr>
+        <w:numPr>
+          <w:ilvl w:val="0"/>
+          <w:numId w:val="2"/>
+        </w:numPr>
+        <w:shd w:val="clear" w:color="auto" w:fill="FFFFFF"/>
+        <w:spacing w:after="100" w:afterAutospacing="1" w:line="360" w:lineRule="atLeast"/>
+        <w:jc w:val="both"/>
+        <w:rPr>
+          <w:rFonts w:ascii="Open Sans" w:eastAsia="Times New Roman" w:hAnsi="Open Sans"/>
+          <w:sz w:val="24"/>
+          <w:szCs w:val="24"/>
+          <w:lang w:eastAsia="en-IN"/>
+        </w:rPr>
+      </w:pPr>
+      <w:r>
+        <w:rPr>
+          <w:rFonts w:ascii="Open Sans" w:eastAsia="Times New Roman" w:hAnsi="Open Sans"/>
+          <w:sz w:val="24"/>
+          <w:szCs w:val="24"/>
+          <w:lang w:eastAsia="en-IN"/>
+        </w:rPr>
+        <w:t xml:space="preserve">Trust Registration </w:t>
+      </w:r>
+    </w:p>
+    <w:p>
+      <w:pPr>
+        <w:numPr>
+          <w:ilvl w:val="0"/>
+          <w:numId w:val="2"/>
+        </w:numPr>
+        <w:shd w:val="clear" w:color="auto" w:fill="FFFFFF"/>
+        <w:spacing w:after="100" w:afterAutospacing="1" w:line="360" w:lineRule="atLeast"/>
+        <w:jc w:val="both"/>
+        <w:rPr>
+          <w:rFonts w:ascii="Open Sans" w:eastAsia="Times New Roman" w:hAnsi="Open Sans"/>
+          <w:sz w:val="24"/>
+          <w:szCs w:val="24"/>
+          <w:lang w:eastAsia="en-IN"/>
+        </w:rPr>
+      </w:pPr>
+      <w:r>
+        <w:rPr>
+          <w:rFonts w:ascii="Open Sans" w:eastAsia="Times New Roman" w:hAnsi="Open Sans"/>
+          <w:sz w:val="24"/>
+          <w:szCs w:val="24"/>
+          <w:lang w:eastAsia="en-IN"/>
+        </w:rPr>
+        <w:t xml:space="preserve">Indian Subsidiary for Foreign Entrepreneurs </w:t>
+      </w:r>
+    </w:p>
+    <w:p>
+      <w:pPr>
         <w:rPr>
           <w:b/>
           <w:bCs/>
           <w:sz w:val="32"/>
           <w:szCs w:val="32"/>
         </w:rPr>
-        <w:t>Company Formation</w:t>
-      </w:r>
-    </w:p>
-    <w:p>
-      <w:pPr>
-        <w:numPr>
-          <w:ilvl w:val="0"/>
-          <w:numId w:val="2"/>
-        </w:numPr>
-        <w:shd w:val="clear" w:color="auto" w:fill="FFFFFF"/>
-        <w:spacing w:after="100" w:afterAutospacing="1" w:line="360" w:lineRule="atLeast"/>
-        <w:jc w:val="both"/>
-        <w:rPr>
-          <w:rFonts w:ascii="Open Sans" w:eastAsia="Times New Roman" w:hAnsi="Open Sans"/>
-          <w:sz w:val="24"/>
-          <w:szCs w:val="24"/>
-          <w:lang w:eastAsia="en-IN"/>
-        </w:rPr>
-      </w:pPr>
-      <w:r>
-        <w:rPr>
-          <w:rFonts w:ascii="Open Sans" w:eastAsia="Times New Roman" w:hAnsi="Open Sans"/>
-          <w:sz w:val="24"/>
-          <w:szCs w:val="24"/>
-          <w:lang w:eastAsia="en-IN"/>
-        </w:rPr>
-        <w:t xml:space="preserve">Private Limited Company Registration </w:t>
-      </w:r>
-    </w:p>
-    <w:p>
-      <w:pPr>
-        <w:numPr>
-          <w:ilvl w:val="0"/>
-          <w:numId w:val="2"/>
-        </w:numPr>
-        <w:shd w:val="clear" w:color="auto" w:fill="FFFFFF"/>
-        <w:spacing w:after="100" w:afterAutospacing="1" w:line="360" w:lineRule="atLeast"/>
-        <w:jc w:val="both"/>
-        <w:rPr>
-          <w:rFonts w:ascii="Open Sans" w:eastAsia="Times New Roman" w:hAnsi="Open Sans"/>
-          <w:sz w:val="24"/>
-          <w:szCs w:val="24"/>
-          <w:lang w:eastAsia="en-IN"/>
-        </w:rPr>
-      </w:pPr>
-      <w:r>
-        <w:rPr>
-          <w:rFonts w:ascii="Open Sans" w:eastAsia="Times New Roman" w:hAnsi="Open Sans"/>
-          <w:sz w:val="24"/>
-          <w:szCs w:val="24"/>
-          <w:lang w:eastAsia="en-IN"/>
-        </w:rPr>
-        <w:t xml:space="preserve">LLP Registration </w:t>
-      </w:r>
-    </w:p>
-    <w:p>
-      <w:pPr>
-        <w:numPr>
-          <w:ilvl w:val="0"/>
-          <w:numId w:val="2"/>
-        </w:numPr>
-        <w:shd w:val="clear" w:color="auto" w:fill="FFFFFF"/>
-        <w:spacing w:after="100" w:afterAutospacing="1" w:line="360" w:lineRule="atLeast"/>
-        <w:jc w:val="both"/>
-        <w:rPr>
-          <w:rFonts w:ascii="Open Sans" w:eastAsia="Times New Roman" w:hAnsi="Open Sans"/>
-          <w:sz w:val="24"/>
-          <w:szCs w:val="24"/>
-          <w:lang w:eastAsia="en-IN"/>
-        </w:rPr>
-      </w:pPr>
-      <w:r>
-        <w:rPr>
-          <w:rFonts w:ascii="Open Sans" w:eastAsia="Times New Roman" w:hAnsi="Open Sans"/>
-          <w:sz w:val="24"/>
-          <w:szCs w:val="24"/>
-          <w:lang w:eastAsia="en-IN"/>
-        </w:rPr>
-        <w:t xml:space="preserve">Partnership Firm Registration </w:t>
-      </w:r>
-    </w:p>
-    <w:p>
-      <w:pPr>
-        <w:numPr>
-          <w:ilvl w:val="0"/>
-          <w:numId w:val="2"/>
-        </w:numPr>
-        <w:shd w:val="clear" w:color="auto" w:fill="FFFFFF"/>
-        <w:spacing w:after="100" w:afterAutospacing="1" w:line="360" w:lineRule="atLeast"/>
-        <w:jc w:val="both"/>
-        <w:rPr>
-          <w:rFonts w:ascii="Open Sans" w:eastAsia="Times New Roman" w:hAnsi="Open Sans"/>
-          <w:sz w:val="24"/>
-          <w:szCs w:val="24"/>
-          <w:lang w:eastAsia="en-IN"/>
-        </w:rPr>
-      </w:pPr>
-      <w:r>
-        <w:rPr>
-          <w:rFonts w:ascii="Open Sans" w:eastAsia="Times New Roman" w:hAnsi="Open Sans"/>
-          <w:sz w:val="24"/>
-          <w:szCs w:val="24"/>
-          <w:lang w:eastAsia="en-IN"/>
-        </w:rPr>
-        <w:lastRenderedPageBreak/>
-        <w:t xml:space="preserve">Public Limited Company Registration </w:t>
-      </w:r>
-    </w:p>
-    <w:p>
-      <w:pPr>
-        <w:numPr>
-          <w:ilvl w:val="0"/>
-          <w:numId w:val="2"/>
-        </w:numPr>
-        <w:shd w:val="clear" w:color="auto" w:fill="FFFFFF"/>
-        <w:spacing w:after="100" w:afterAutospacing="1" w:line="360" w:lineRule="atLeast"/>
-        <w:jc w:val="both"/>
-        <w:rPr>
-          <w:rFonts w:ascii="Open Sans" w:eastAsia="Times New Roman" w:hAnsi="Open Sans"/>
-          <w:sz w:val="24"/>
-          <w:szCs w:val="24"/>
-          <w:lang w:eastAsia="en-IN"/>
-        </w:rPr>
-      </w:pPr>
-      <w:r>
-        <w:rPr>
-          <w:rFonts w:ascii="Open Sans" w:eastAsia="Times New Roman" w:hAnsi="Open Sans"/>
-          <w:sz w:val="24"/>
-          <w:szCs w:val="24"/>
-          <w:lang w:eastAsia="en-IN"/>
-        </w:rPr>
-        <w:t xml:space="preserve">Trust Registration </w:t>
-      </w:r>
-    </w:p>
-    <w:p>
-      <w:pPr>
-        <w:numPr>
-          <w:ilvl w:val="0"/>
-          <w:numId w:val="2"/>
-        </w:numPr>
-        <w:shd w:val="clear" w:color="auto" w:fill="FFFFFF"/>
-        <w:spacing w:after="100" w:afterAutospacing="1" w:line="360" w:lineRule="atLeast"/>
-        <w:jc w:val="both"/>
-        <w:rPr>
-          <w:rFonts w:ascii="Open Sans" w:eastAsia="Times New Roman" w:hAnsi="Open Sans"/>
-          <w:sz w:val="24"/>
-          <w:szCs w:val="24"/>
-          <w:lang w:eastAsia="en-IN"/>
-        </w:rPr>
-      </w:pPr>
-      <w:r>
-        <w:rPr>
-          <w:rFonts w:ascii="Open Sans" w:eastAsia="Times New Roman" w:hAnsi="Open Sans"/>
-          <w:sz w:val="24"/>
-          <w:szCs w:val="24"/>
-          <w:lang w:eastAsia="en-IN"/>
-        </w:rPr>
-        <w:t xml:space="preserve">Indian Subsidiary for Foreign Entrepreneurs </w:t>
-      </w:r>
-    </w:p>
-    <w:p>
-      <w:pPr>
+      </w:pPr>
+      <w:r>
         <w:rPr>
           <w:b/>
           <w:bCs/>
           <w:sz w:val="32"/>
           <w:szCs w:val="32"/>
         </w:rPr>
-      </w:pPr>
-      <w:r>
+        <w:t>Registrations</w:t>
+      </w:r>
+    </w:p>
+    <w:p>
+      <w:pPr>
+        <w:numPr>
+          <w:ilvl w:val="0"/>
+          <w:numId w:val="2"/>
+        </w:numPr>
+        <w:shd w:val="clear" w:color="auto" w:fill="FFFFFF"/>
+        <w:tabs>
+          <w:tab w:val="clear" w:pos="1440"/>
+        </w:tabs>
+        <w:spacing w:after="100" w:afterAutospacing="1" w:line="360" w:lineRule="atLeast"/>
+        <w:jc w:val="both"/>
+        <w:rPr>
+          <w:rFonts w:ascii="Open Sans" w:eastAsia="Times New Roman" w:hAnsi="Open Sans"/>
+          <w:sz w:val="24"/>
+          <w:szCs w:val="24"/>
+          <w:lang w:eastAsia="en-IN"/>
+        </w:rPr>
+      </w:pPr>
+      <w:r>
+        <w:rPr>
+          <w:rFonts w:ascii="Open Sans" w:eastAsia="Times New Roman" w:hAnsi="Open Sans"/>
+          <w:sz w:val="24"/>
+          <w:szCs w:val="24"/>
+          <w:lang w:eastAsia="en-IN"/>
+        </w:rPr>
+        <w:t xml:space="preserve">Shop &amp; Establishment Registration </w:t>
+      </w:r>
+    </w:p>
+    <w:p>
+      <w:pPr>
+        <w:numPr>
+          <w:ilvl w:val="0"/>
+          <w:numId w:val="2"/>
+        </w:numPr>
+        <w:shd w:val="clear" w:color="auto" w:fill="FFFFFF"/>
+        <w:tabs>
+          <w:tab w:val="clear" w:pos="1440"/>
+        </w:tabs>
+        <w:spacing w:after="100" w:afterAutospacing="1" w:line="360" w:lineRule="atLeast"/>
+        <w:jc w:val="both"/>
+        <w:rPr>
+          <w:rFonts w:ascii="Open Sans" w:eastAsia="Times New Roman" w:hAnsi="Open Sans"/>
+          <w:sz w:val="24"/>
+          <w:szCs w:val="24"/>
+          <w:lang w:eastAsia="en-IN"/>
+        </w:rPr>
+      </w:pPr>
+      <w:proofErr w:type="spellStart"/>
+      <w:r>
+        <w:rPr>
+          <w:rFonts w:ascii="Open Sans" w:eastAsia="Times New Roman" w:hAnsi="Open Sans"/>
+          <w:sz w:val="24"/>
+          <w:szCs w:val="24"/>
+          <w:lang w:eastAsia="en-IN"/>
+        </w:rPr>
+        <w:t>Startup</w:t>
+      </w:r>
+      <w:proofErr w:type="spellEnd"/>
+      <w:r>
+        <w:rPr>
+          <w:rFonts w:ascii="Open Sans" w:eastAsia="Times New Roman" w:hAnsi="Open Sans"/>
+          <w:sz w:val="24"/>
+          <w:szCs w:val="24"/>
+          <w:lang w:eastAsia="en-IN"/>
+        </w:rPr>
+        <w:t xml:space="preserve"> India Registration </w:t>
+      </w:r>
+    </w:p>
+    <w:p>
+      <w:pPr>
+        <w:numPr>
+          <w:ilvl w:val="0"/>
+          <w:numId w:val="2"/>
+        </w:numPr>
+        <w:shd w:val="clear" w:color="auto" w:fill="FFFFFF"/>
+        <w:tabs>
+          <w:tab w:val="clear" w:pos="1440"/>
+        </w:tabs>
+        <w:spacing w:after="100" w:afterAutospacing="1" w:line="360" w:lineRule="atLeast"/>
+        <w:jc w:val="both"/>
+        <w:rPr>
+          <w:rFonts w:ascii="Open Sans" w:eastAsia="Times New Roman" w:hAnsi="Open Sans"/>
+          <w:sz w:val="24"/>
+          <w:szCs w:val="24"/>
+          <w:lang w:eastAsia="en-IN"/>
+        </w:rPr>
+      </w:pPr>
+      <w:r>
+        <w:rPr>
+          <w:rFonts w:ascii="Open Sans" w:eastAsia="Times New Roman" w:hAnsi="Open Sans"/>
+          <w:sz w:val="24"/>
+          <w:szCs w:val="24"/>
+          <w:lang w:eastAsia="en-IN"/>
+        </w:rPr>
+        <w:t>MSME/</w:t>
+      </w:r>
+      <w:proofErr w:type="spellStart"/>
+      <w:r>
+        <w:rPr>
+          <w:rFonts w:ascii="Open Sans" w:eastAsia="Times New Roman" w:hAnsi="Open Sans"/>
+          <w:sz w:val="24"/>
+          <w:szCs w:val="24"/>
+          <w:lang w:eastAsia="en-IN"/>
+        </w:rPr>
+        <w:t>Udyam</w:t>
+      </w:r>
+      <w:proofErr w:type="spellEnd"/>
+      <w:r>
+        <w:rPr>
+          <w:rFonts w:ascii="Open Sans" w:eastAsia="Times New Roman" w:hAnsi="Open Sans"/>
+          <w:sz w:val="24"/>
+          <w:szCs w:val="24"/>
+          <w:lang w:eastAsia="en-IN"/>
+        </w:rPr>
+        <w:t xml:space="preserve"> Registration </w:t>
+      </w:r>
+    </w:p>
+    <w:p>
+      <w:pPr>
+        <w:numPr>
+          <w:ilvl w:val="0"/>
+          <w:numId w:val="2"/>
+        </w:numPr>
+        <w:shd w:val="clear" w:color="auto" w:fill="FFFFFF"/>
+        <w:tabs>
+          <w:tab w:val="clear" w:pos="1440"/>
+        </w:tabs>
+        <w:spacing w:after="100" w:afterAutospacing="1" w:line="360" w:lineRule="atLeast"/>
+        <w:jc w:val="both"/>
+        <w:rPr>
+          <w:rFonts w:ascii="Open Sans" w:eastAsia="Times New Roman" w:hAnsi="Open Sans"/>
+          <w:sz w:val="24"/>
+          <w:szCs w:val="24"/>
+          <w:lang w:eastAsia="en-IN"/>
+        </w:rPr>
+      </w:pPr>
+      <w:r>
+        <w:rPr>
+          <w:rFonts w:ascii="Open Sans" w:eastAsia="Times New Roman" w:hAnsi="Open Sans"/>
+          <w:sz w:val="24"/>
+          <w:szCs w:val="24"/>
+          <w:lang w:eastAsia="en-IN"/>
+        </w:rPr>
+        <w:t xml:space="preserve">PF Registration </w:t>
+      </w:r>
+    </w:p>
+    <w:p>
+      <w:pPr>
+        <w:numPr>
+          <w:ilvl w:val="0"/>
+          <w:numId w:val="2"/>
+        </w:numPr>
+        <w:shd w:val="clear" w:color="auto" w:fill="FFFFFF"/>
+        <w:tabs>
+          <w:tab w:val="clear" w:pos="1440"/>
+        </w:tabs>
+        <w:spacing w:after="100" w:afterAutospacing="1" w:line="360" w:lineRule="atLeast"/>
+        <w:jc w:val="both"/>
+        <w:rPr>
+          <w:rFonts w:ascii="Open Sans" w:eastAsia="Times New Roman" w:hAnsi="Open Sans"/>
+          <w:sz w:val="24"/>
+          <w:szCs w:val="24"/>
+          <w:lang w:eastAsia="en-IN"/>
+        </w:rPr>
+      </w:pPr>
+      <w:r>
+        <w:rPr>
+          <w:rFonts w:ascii="Open Sans" w:eastAsia="Times New Roman" w:hAnsi="Open Sans"/>
+          <w:sz w:val="24"/>
+          <w:szCs w:val="24"/>
+          <w:lang w:eastAsia="en-IN"/>
+        </w:rPr>
+        <w:t xml:space="preserve">ESIC Registration </w:t>
+      </w:r>
+    </w:p>
+    <w:p>
+      <w:pPr>
+        <w:numPr>
+          <w:ilvl w:val="0"/>
+          <w:numId w:val="2"/>
+        </w:numPr>
+        <w:shd w:val="clear" w:color="auto" w:fill="FFFFFF"/>
+        <w:tabs>
+          <w:tab w:val="clear" w:pos="1440"/>
+        </w:tabs>
+        <w:spacing w:after="100" w:afterAutospacing="1" w:line="360" w:lineRule="atLeast"/>
+        <w:jc w:val="both"/>
+        <w:rPr>
+          <w:rFonts w:ascii="Open Sans" w:eastAsia="Times New Roman" w:hAnsi="Open Sans"/>
+          <w:sz w:val="24"/>
+          <w:szCs w:val="24"/>
+          <w:lang w:eastAsia="en-IN"/>
+        </w:rPr>
+      </w:pPr>
+      <w:r>
+        <w:rPr>
+          <w:rFonts w:ascii="Open Sans" w:eastAsia="Times New Roman" w:hAnsi="Open Sans"/>
+          <w:sz w:val="24"/>
+          <w:szCs w:val="24"/>
+          <w:lang w:eastAsia="en-IN"/>
+        </w:rPr>
+        <w:t xml:space="preserve">Trade License </w:t>
+      </w:r>
+    </w:p>
+    <w:p>
+      <w:pPr>
+        <w:numPr>
+          <w:ilvl w:val="0"/>
+          <w:numId w:val="2"/>
+        </w:numPr>
+        <w:shd w:val="clear" w:color="auto" w:fill="FFFFFF"/>
+        <w:tabs>
+          <w:tab w:val="clear" w:pos="1440"/>
+        </w:tabs>
+        <w:spacing w:after="100" w:afterAutospacing="1" w:line="360" w:lineRule="atLeast"/>
+        <w:jc w:val="both"/>
+        <w:rPr>
+          <w:rFonts w:ascii="Open Sans" w:eastAsia="Times New Roman" w:hAnsi="Open Sans"/>
+          <w:sz w:val="24"/>
+          <w:szCs w:val="24"/>
+          <w:lang w:eastAsia="en-IN"/>
+        </w:rPr>
+      </w:pPr>
+      <w:r>
+        <w:rPr>
+          <w:rFonts w:ascii="Open Sans" w:eastAsia="Times New Roman" w:hAnsi="Open Sans"/>
+          <w:sz w:val="24"/>
+          <w:szCs w:val="24"/>
+          <w:lang w:eastAsia="en-IN"/>
+        </w:rPr>
+        <w:t xml:space="preserve">NGO Darpan Registration </w:t>
+      </w:r>
+    </w:p>
+    <w:p>
+      <w:pPr>
+        <w:numPr>
+          <w:ilvl w:val="0"/>
+          <w:numId w:val="2"/>
+        </w:numPr>
+        <w:shd w:val="clear" w:color="auto" w:fill="FFFFFF"/>
+        <w:tabs>
+          <w:tab w:val="clear" w:pos="1440"/>
+        </w:tabs>
+        <w:spacing w:after="100" w:afterAutospacing="1" w:line="360" w:lineRule="atLeast"/>
+        <w:jc w:val="both"/>
+        <w:rPr>
+          <w:rFonts w:ascii="Open Sans" w:eastAsia="Times New Roman" w:hAnsi="Open Sans"/>
+          <w:sz w:val="24"/>
+          <w:szCs w:val="24"/>
+          <w:lang w:eastAsia="en-IN"/>
+        </w:rPr>
+      </w:pPr>
+      <w:r>
+        <w:rPr>
+          <w:rFonts w:ascii="Open Sans" w:eastAsia="Times New Roman" w:hAnsi="Open Sans"/>
+          <w:sz w:val="24"/>
+          <w:szCs w:val="24"/>
+          <w:lang w:eastAsia="en-IN"/>
+        </w:rPr>
+        <w:t>Trademark Registration</w:t>
+      </w:r>
+    </w:p>
+    <w:p>
+      <w:pPr>
+        <w:numPr>
+          <w:ilvl w:val="0"/>
+          <w:numId w:val="2"/>
+        </w:numPr>
+        <w:shd w:val="clear" w:color="auto" w:fill="FFFFFF"/>
+        <w:tabs>
+          <w:tab w:val="clear" w:pos="1440"/>
+        </w:tabs>
+        <w:spacing w:after="100" w:afterAutospacing="1" w:line="360" w:lineRule="atLeast"/>
+        <w:jc w:val="both"/>
+        <w:rPr>
+          <w:rFonts w:ascii="Open Sans" w:eastAsia="Times New Roman" w:hAnsi="Open Sans"/>
+          <w:sz w:val="24"/>
+          <w:szCs w:val="24"/>
+          <w:lang w:eastAsia="en-IN"/>
+        </w:rPr>
+      </w:pPr>
+      <w:r>
+        <w:rPr>
+          <w:rFonts w:ascii="Open Sans" w:eastAsia="Times New Roman" w:hAnsi="Open Sans"/>
+          <w:sz w:val="24"/>
+          <w:szCs w:val="24"/>
+          <w:lang w:eastAsia="en-IN"/>
+        </w:rPr>
+        <w:t xml:space="preserve">Import Export Code (IEC) </w:t>
+      </w:r>
+    </w:p>
+    <w:p>
+      <w:pPr>
+        <w:numPr>
+          <w:ilvl w:val="0"/>
+          <w:numId w:val="2"/>
+        </w:numPr>
+        <w:shd w:val="clear" w:color="auto" w:fill="FFFFFF"/>
+        <w:tabs>
+          <w:tab w:val="clear" w:pos="1440"/>
+        </w:tabs>
+        <w:spacing w:after="100" w:afterAutospacing="1" w:line="360" w:lineRule="atLeast"/>
+        <w:jc w:val="both"/>
+        <w:rPr>
+          <w:rFonts w:ascii="Open Sans" w:eastAsia="Times New Roman" w:hAnsi="Open Sans"/>
+          <w:sz w:val="24"/>
+          <w:szCs w:val="24"/>
+          <w:lang w:eastAsia="en-IN"/>
+        </w:rPr>
+      </w:pPr>
+      <w:r>
+        <w:rPr>
+          <w:rFonts w:ascii="Open Sans" w:eastAsia="Times New Roman" w:hAnsi="Open Sans"/>
+          <w:sz w:val="24"/>
+          <w:szCs w:val="24"/>
+          <w:lang w:eastAsia="en-IN"/>
+        </w:rPr>
+        <w:t xml:space="preserve">ISO Certification </w:t>
+      </w:r>
+    </w:p>
+    <w:p>
+      <w:pPr>
+        <w:numPr>
+          <w:ilvl w:val="0"/>
+          <w:numId w:val="2"/>
+        </w:numPr>
+        <w:shd w:val="clear" w:color="auto" w:fill="FFFFFF"/>
+        <w:tabs>
+          <w:tab w:val="clear" w:pos="1440"/>
+        </w:tabs>
+        <w:spacing w:after="100" w:afterAutospacing="1" w:line="360" w:lineRule="atLeast"/>
+        <w:jc w:val="both"/>
+        <w:rPr>
+          <w:rFonts w:ascii="Open Sans" w:eastAsia="Times New Roman" w:hAnsi="Open Sans"/>
+          <w:sz w:val="24"/>
+          <w:szCs w:val="24"/>
+          <w:lang w:eastAsia="en-IN"/>
+        </w:rPr>
+      </w:pPr>
+      <w:r>
+        <w:rPr>
+          <w:rFonts w:ascii="Open Sans" w:eastAsia="Times New Roman" w:hAnsi="Open Sans"/>
+          <w:sz w:val="24"/>
+          <w:szCs w:val="24"/>
+          <w:lang w:eastAsia="en-IN"/>
+        </w:rPr>
+        <w:t xml:space="preserve">FSSAI Registration </w:t>
+      </w:r>
+    </w:p>
+    <w:p>
+      <w:pPr>
         <w:rPr>
           <w:b/>
           <w:bCs/>
           <w:sz w:val="32"/>
           <w:szCs w:val="32"/>
         </w:rPr>
-        <w:t>Registrations</w:t>
-      </w:r>
-    </w:p>
-    <w:p>
-      <w:pPr>
-        <w:numPr>
-          <w:ilvl w:val="0"/>
-          <w:numId w:val="2"/>
-        </w:numPr>
-        <w:shd w:val="clear" w:color="auto" w:fill="FFFFFF"/>
-        <w:tabs>
-          <w:tab w:val="clear" w:pos="1440"/>
-        </w:tabs>
-        <w:spacing w:after="100" w:afterAutospacing="1" w:line="360" w:lineRule="atLeast"/>
-        <w:jc w:val="both"/>
-        <w:rPr>
-          <w:rFonts w:ascii="Open Sans" w:eastAsia="Times New Roman" w:hAnsi="Open Sans"/>
-          <w:sz w:val="24"/>
-          <w:szCs w:val="24"/>
-          <w:lang w:eastAsia="en-IN"/>
-        </w:rPr>
-      </w:pPr>
-      <w:r>
-        <w:rPr>
-          <w:rFonts w:ascii="Open Sans" w:eastAsia="Times New Roman" w:hAnsi="Open Sans"/>
-          <w:sz w:val="24"/>
-          <w:szCs w:val="24"/>
-          <w:lang w:eastAsia="en-IN"/>
-        </w:rPr>
-        <w:t xml:space="preserve">Shop &amp; Establishment Registration </w:t>
-      </w:r>
-    </w:p>
-    <w:p>
-      <w:pPr>
-        <w:numPr>
-          <w:ilvl w:val="0"/>
-          <w:numId w:val="2"/>
-        </w:numPr>
-        <w:shd w:val="clear" w:color="auto" w:fill="FFFFFF"/>
-        <w:tabs>
-          <w:tab w:val="clear" w:pos="1440"/>
-        </w:tabs>
-        <w:spacing w:after="100" w:afterAutospacing="1" w:line="360" w:lineRule="atLeast"/>
-        <w:jc w:val="both"/>
-        <w:rPr>
-          <w:rFonts w:ascii="Open Sans" w:eastAsia="Times New Roman" w:hAnsi="Open Sans"/>
-          <w:sz w:val="24"/>
-          <w:szCs w:val="24"/>
-          <w:lang w:eastAsia="en-IN"/>
-        </w:rPr>
-      </w:pPr>
-      <w:proofErr w:type="spellStart"/>
-      <w:r>
-        <w:rPr>
-          <w:rFonts w:ascii="Open Sans" w:eastAsia="Times New Roman" w:hAnsi="Open Sans"/>
-          <w:sz w:val="24"/>
-          <w:szCs w:val="24"/>
-          <w:lang w:eastAsia="en-IN"/>
-        </w:rPr>
-        <w:t>Startup</w:t>
-      </w:r>
-      <w:proofErr w:type="spellEnd"/>
-      <w:r>
-        <w:rPr>
-          <w:rFonts w:ascii="Open Sans" w:eastAsia="Times New Roman" w:hAnsi="Open Sans"/>
-          <w:sz w:val="24"/>
-          <w:szCs w:val="24"/>
-          <w:lang w:eastAsia="en-IN"/>
-        </w:rPr>
-        <w:t xml:space="preserve"> India Registration </w:t>
-      </w:r>
-    </w:p>
-    <w:p>
-      <w:pPr>
-        <w:numPr>
-          <w:ilvl w:val="0"/>
-          <w:numId w:val="2"/>
-        </w:numPr>
-        <w:shd w:val="clear" w:color="auto" w:fill="FFFFFF"/>
-        <w:tabs>
-          <w:tab w:val="clear" w:pos="1440"/>
-        </w:tabs>
-        <w:spacing w:after="100" w:afterAutospacing="1" w:line="360" w:lineRule="atLeast"/>
-        <w:jc w:val="both"/>
-        <w:rPr>
-          <w:rFonts w:ascii="Open Sans" w:eastAsia="Times New Roman" w:hAnsi="Open Sans"/>
-          <w:sz w:val="24"/>
-          <w:szCs w:val="24"/>
-          <w:lang w:eastAsia="en-IN"/>
-        </w:rPr>
-      </w:pPr>
-      <w:r>
-        <w:rPr>
-          <w:rFonts w:ascii="Open Sans" w:eastAsia="Times New Roman" w:hAnsi="Open Sans"/>
-          <w:sz w:val="24"/>
-          <w:szCs w:val="24"/>
-          <w:lang w:eastAsia="en-IN"/>
-        </w:rPr>
-        <w:t>MSME/</w:t>
-      </w:r>
-      <w:proofErr w:type="spellStart"/>
-      <w:r>
-        <w:rPr>
-          <w:rFonts w:ascii="Open Sans" w:eastAsia="Times New Roman" w:hAnsi="Open Sans"/>
-          <w:sz w:val="24"/>
-          <w:szCs w:val="24"/>
-          <w:lang w:eastAsia="en-IN"/>
-        </w:rPr>
-        <w:t>Udyam</w:t>
-      </w:r>
-      <w:proofErr w:type="spellEnd"/>
-      <w:r>
-        <w:rPr>
-          <w:rFonts w:ascii="Open Sans" w:eastAsia="Times New Roman" w:hAnsi="Open Sans"/>
-          <w:sz w:val="24"/>
-          <w:szCs w:val="24"/>
-          <w:lang w:eastAsia="en-IN"/>
-        </w:rPr>
-        <w:t xml:space="preserve"> Registration </w:t>
-      </w:r>
-    </w:p>
-    <w:p>
-      <w:pPr>
-        <w:numPr>
-          <w:ilvl w:val="0"/>
-          <w:numId w:val="2"/>
-        </w:numPr>
-        <w:shd w:val="clear" w:color="auto" w:fill="FFFFFF"/>
-        <w:tabs>
-          <w:tab w:val="clear" w:pos="1440"/>
-        </w:tabs>
-        <w:spacing w:after="100" w:afterAutospacing="1" w:line="360" w:lineRule="atLeast"/>
-        <w:jc w:val="both"/>
-        <w:rPr>
-          <w:rFonts w:ascii="Open Sans" w:eastAsia="Times New Roman" w:hAnsi="Open Sans"/>
-          <w:sz w:val="24"/>
-          <w:szCs w:val="24"/>
-          <w:lang w:eastAsia="en-IN"/>
-        </w:rPr>
-      </w:pPr>
-      <w:r>
-        <w:rPr>
-          <w:rFonts w:ascii="Open Sans" w:eastAsia="Times New Roman" w:hAnsi="Open Sans"/>
-          <w:sz w:val="24"/>
-          <w:szCs w:val="24"/>
-          <w:lang w:eastAsia="en-IN"/>
-        </w:rPr>
-        <w:t xml:space="preserve">PF Registration </w:t>
-      </w:r>
-    </w:p>
-    <w:p>
-      <w:pPr>
-        <w:numPr>
-          <w:ilvl w:val="0"/>
-          <w:numId w:val="2"/>
-        </w:numPr>
-        <w:shd w:val="clear" w:color="auto" w:fill="FFFFFF"/>
-        <w:tabs>
-          <w:tab w:val="clear" w:pos="1440"/>
-        </w:tabs>
-        <w:spacing w:after="100" w:afterAutospacing="1" w:line="360" w:lineRule="atLeast"/>
-        <w:jc w:val="both"/>
-        <w:rPr>
-          <w:rFonts w:ascii="Open Sans" w:eastAsia="Times New Roman" w:hAnsi="Open Sans"/>
-          <w:sz w:val="24"/>
-          <w:szCs w:val="24"/>
-          <w:lang w:eastAsia="en-IN"/>
-        </w:rPr>
-      </w:pPr>
-      <w:r>
-        <w:rPr>
-          <w:rFonts w:ascii="Open Sans" w:eastAsia="Times New Roman" w:hAnsi="Open Sans"/>
-          <w:sz w:val="24"/>
-          <w:szCs w:val="24"/>
-          <w:lang w:eastAsia="en-IN"/>
-        </w:rPr>
-        <w:t xml:space="preserve">ESIC Registration </w:t>
-      </w:r>
-    </w:p>
-    <w:p>
-      <w:pPr>
-        <w:numPr>
-          <w:ilvl w:val="0"/>
-          <w:numId w:val="2"/>
-        </w:numPr>
-        <w:shd w:val="clear" w:color="auto" w:fill="FFFFFF"/>
-        <w:tabs>
-          <w:tab w:val="clear" w:pos="1440"/>
-        </w:tabs>
-        <w:spacing w:after="100" w:afterAutospacing="1" w:line="360" w:lineRule="atLeast"/>
-        <w:jc w:val="both"/>
-        <w:rPr>
-          <w:rFonts w:ascii="Open Sans" w:eastAsia="Times New Roman" w:hAnsi="Open Sans"/>
-          <w:sz w:val="24"/>
-          <w:szCs w:val="24"/>
-          <w:lang w:eastAsia="en-IN"/>
-        </w:rPr>
-      </w:pPr>
-      <w:r>
-        <w:rPr>
-          <w:rFonts w:ascii="Open Sans" w:eastAsia="Times New Roman" w:hAnsi="Open Sans"/>
-          <w:sz w:val="24"/>
-          <w:szCs w:val="24"/>
-          <w:lang w:eastAsia="en-IN"/>
-        </w:rPr>
-        <w:t xml:space="preserve">Trade License </w:t>
-      </w:r>
-      <w:bookmarkStart w:id="3" w:name="_GoBack"/>
-      <w:bookmarkEnd w:id="3"/>
-    </w:p>
-    <w:p>
-      <w:pPr>
-        <w:numPr>
-          <w:ilvl w:val="0"/>
-          <w:numId w:val="2"/>
-        </w:numPr>
-        <w:shd w:val="clear" w:color="auto" w:fill="FFFFFF"/>
-        <w:tabs>
-          <w:tab w:val="clear" w:pos="1440"/>
-        </w:tabs>
-        <w:spacing w:after="100" w:afterAutospacing="1" w:line="360" w:lineRule="atLeast"/>
-        <w:jc w:val="both"/>
-        <w:rPr>
-          <w:rFonts w:ascii="Open Sans" w:eastAsia="Times New Roman" w:hAnsi="Open Sans"/>
-          <w:sz w:val="24"/>
-          <w:szCs w:val="24"/>
-          <w:lang w:eastAsia="en-IN"/>
-        </w:rPr>
-      </w:pPr>
-      <w:r>
-        <w:rPr>
-          <w:rFonts w:ascii="Open Sans" w:eastAsia="Times New Roman" w:hAnsi="Open Sans"/>
-          <w:sz w:val="24"/>
-          <w:szCs w:val="24"/>
-          <w:lang w:eastAsia="en-IN"/>
-        </w:rPr>
-        <w:t xml:space="preserve">NGO Darpan Registration </w:t>
-      </w:r>
-    </w:p>
-    <w:p>
-      <w:pPr>
-        <w:numPr>
-          <w:ilvl w:val="0"/>
-          <w:numId w:val="2"/>
-        </w:numPr>
-        <w:shd w:val="clear" w:color="auto" w:fill="FFFFFF"/>
-        <w:tabs>
-          <w:tab w:val="clear" w:pos="1440"/>
-        </w:tabs>
-        <w:spacing w:after="100" w:afterAutospacing="1" w:line="360" w:lineRule="atLeast"/>
-        <w:jc w:val="both"/>
-        <w:rPr>
-          <w:rFonts w:ascii="Open Sans" w:eastAsia="Times New Roman" w:hAnsi="Open Sans"/>
-          <w:sz w:val="24"/>
-          <w:szCs w:val="24"/>
-          <w:lang w:eastAsia="en-IN"/>
-        </w:rPr>
-      </w:pPr>
-      <w:r>
-        <w:rPr>
-          <w:rFonts w:ascii="Open Sans" w:eastAsia="Times New Roman" w:hAnsi="Open Sans"/>
-          <w:sz w:val="24"/>
-          <w:szCs w:val="24"/>
-          <w:lang w:eastAsia="en-IN"/>
-        </w:rPr>
-        <w:t>Trademark Registration</w:t>
-      </w:r>
-    </w:p>
-    <w:p>
-      <w:pPr>
-        <w:numPr>
-          <w:ilvl w:val="0"/>
-          <w:numId w:val="2"/>
-        </w:numPr>
-        <w:shd w:val="clear" w:color="auto" w:fill="FFFFFF"/>
-        <w:tabs>
-          <w:tab w:val="clear" w:pos="1440"/>
-        </w:tabs>
-        <w:spacing w:after="100" w:afterAutospacing="1" w:line="360" w:lineRule="atLeast"/>
-        <w:jc w:val="both"/>
-        <w:rPr>
-          <w:rFonts w:ascii="Open Sans" w:eastAsia="Times New Roman" w:hAnsi="Open Sans"/>
-          <w:sz w:val="24"/>
-          <w:szCs w:val="24"/>
-          <w:lang w:eastAsia="en-IN"/>
-        </w:rPr>
-      </w:pPr>
-      <w:r>
-        <w:rPr>
-          <w:rFonts w:ascii="Open Sans" w:eastAsia="Times New Roman" w:hAnsi="Open Sans"/>
-          <w:sz w:val="24"/>
-          <w:szCs w:val="24"/>
-          <w:lang w:eastAsia="en-IN"/>
-        </w:rPr>
-        <w:t xml:space="preserve">Import Export Code (IEC) </w:t>
-      </w:r>
-    </w:p>
-    <w:p>
-      <w:pPr>
-        <w:numPr>
-          <w:ilvl w:val="0"/>
-          <w:numId w:val="2"/>
-        </w:numPr>
-        <w:shd w:val="clear" w:color="auto" w:fill="FFFFFF"/>
-        <w:tabs>
-          <w:tab w:val="clear" w:pos="1440"/>
-        </w:tabs>
-        <w:spacing w:after="100" w:afterAutospacing="1" w:line="360" w:lineRule="atLeast"/>
-        <w:jc w:val="both"/>
-        <w:rPr>
-          <w:rFonts w:ascii="Open Sans" w:eastAsia="Times New Roman" w:hAnsi="Open Sans"/>
-          <w:sz w:val="24"/>
-          <w:szCs w:val="24"/>
-          <w:lang w:eastAsia="en-IN"/>
-        </w:rPr>
-      </w:pPr>
-      <w:r>
-        <w:rPr>
-          <w:rFonts w:ascii="Open Sans" w:eastAsia="Times New Roman" w:hAnsi="Open Sans"/>
-          <w:sz w:val="24"/>
-          <w:szCs w:val="24"/>
-          <w:lang w:eastAsia="en-IN"/>
-        </w:rPr>
-        <w:t xml:space="preserve">ISO Certification </w:t>
-      </w:r>
-    </w:p>
-    <w:p>
-      <w:pPr>
-        <w:numPr>
-          <w:ilvl w:val="0"/>
-          <w:numId w:val="2"/>
-        </w:numPr>
-        <w:shd w:val="clear" w:color="auto" w:fill="FFFFFF"/>
-        <w:tabs>
-          <w:tab w:val="clear" w:pos="1440"/>
-        </w:tabs>
-        <w:spacing w:after="100" w:afterAutospacing="1" w:line="360" w:lineRule="atLeast"/>
-        <w:jc w:val="both"/>
-        <w:rPr>
-          <w:rFonts w:ascii="Open Sans" w:eastAsia="Times New Roman" w:hAnsi="Open Sans"/>
-          <w:sz w:val="24"/>
-          <w:szCs w:val="24"/>
-          <w:lang w:eastAsia="en-IN"/>
-        </w:rPr>
-      </w:pPr>
-      <w:r>
-        <w:rPr>
-          <w:rFonts w:ascii="Open Sans" w:eastAsia="Times New Roman" w:hAnsi="Open Sans"/>
-          <w:sz w:val="24"/>
-          <w:szCs w:val="24"/>
-          <w:lang w:eastAsia="en-IN"/>
-        </w:rPr>
-        <w:t xml:space="preserve">FSSAI Registration </w:t>
-      </w:r>
-    </w:p>
-    <w:p>
-      <w:pPr>
+      </w:pPr>
+      <w:r>
         <w:rPr>
           <w:b/>
           <w:bCs/>
           <w:sz w:val="32"/>
           <w:szCs w:val="32"/>
         </w:rPr>
-      </w:pPr>
+        <w:t>Corporate Compliance</w:t>
+      </w:r>
       <w:r>
         <w:rPr>
           <w:b/>
@@ -1958,162 +2189,164 @@
           <w:sz w:val="32"/>
           <w:szCs w:val="32"/>
         </w:rPr>
-        <w:t>Corporate Compliance</w:t>
-      </w:r>
-      <w:r>
+        <w:t xml:space="preserve"> &amp; Secretarial Services</w:t>
+      </w:r>
+    </w:p>
+    <w:p>
+      <w:pPr>
+        <w:numPr>
+          <w:ilvl w:val="0"/>
+          <w:numId w:val="4"/>
+        </w:numPr>
+        <w:shd w:val="clear" w:color="auto" w:fill="FFFFFF"/>
+        <w:tabs>
+          <w:tab w:val="clear" w:pos="1440"/>
+        </w:tabs>
+        <w:spacing w:after="100" w:afterAutospacing="1" w:line="360" w:lineRule="atLeast"/>
+        <w:jc w:val="both"/>
+        <w:rPr>
+          <w:rFonts w:ascii="Open Sans" w:eastAsia="Times New Roman" w:hAnsi="Open Sans"/>
+          <w:sz w:val="24"/>
+          <w:szCs w:val="24"/>
+          <w:lang w:eastAsia="en-IN"/>
+        </w:rPr>
+      </w:pPr>
+      <w:r>
+        <w:rPr>
+          <w:rFonts w:ascii="Open Sans" w:eastAsia="Times New Roman" w:hAnsi="Open Sans"/>
+          <w:sz w:val="24"/>
+          <w:szCs w:val="24"/>
+          <w:lang w:eastAsia="en-IN"/>
+        </w:rPr>
+        <w:t xml:space="preserve">MCA Annual Compliance </w:t>
+      </w:r>
+    </w:p>
+    <w:p>
+      <w:pPr>
+        <w:numPr>
+          <w:ilvl w:val="0"/>
+          <w:numId w:val="4"/>
+        </w:numPr>
+        <w:shd w:val="clear" w:color="auto" w:fill="FFFFFF"/>
+        <w:tabs>
+          <w:tab w:val="clear" w:pos="1440"/>
+        </w:tabs>
+        <w:spacing w:after="100" w:afterAutospacing="1" w:line="360" w:lineRule="atLeast"/>
+        <w:jc w:val="both"/>
+        <w:rPr>
+          <w:rFonts w:ascii="Open Sans" w:eastAsia="Times New Roman" w:hAnsi="Open Sans"/>
+          <w:sz w:val="24"/>
+          <w:szCs w:val="24"/>
+          <w:lang w:eastAsia="en-IN"/>
+        </w:rPr>
+      </w:pPr>
+      <w:r>
+        <w:rPr>
+          <w:rFonts w:ascii="Open Sans" w:eastAsia="Times New Roman" w:hAnsi="Open Sans"/>
+          <w:sz w:val="24"/>
+          <w:szCs w:val="24"/>
+          <w:lang w:eastAsia="en-IN"/>
+        </w:rPr>
+        <w:lastRenderedPageBreak/>
+        <w:t xml:space="preserve">ROC Filings </w:t>
+      </w:r>
+    </w:p>
+    <w:p>
+      <w:pPr>
+        <w:numPr>
+          <w:ilvl w:val="0"/>
+          <w:numId w:val="4"/>
+        </w:numPr>
+        <w:shd w:val="clear" w:color="auto" w:fill="FFFFFF"/>
+        <w:tabs>
+          <w:tab w:val="clear" w:pos="1440"/>
+        </w:tabs>
+        <w:spacing w:after="100" w:afterAutospacing="1" w:line="360" w:lineRule="atLeast"/>
+        <w:jc w:val="both"/>
+        <w:rPr>
+          <w:rFonts w:ascii="Open Sans" w:eastAsia="Times New Roman" w:hAnsi="Open Sans"/>
+          <w:sz w:val="24"/>
+          <w:szCs w:val="24"/>
+          <w:lang w:eastAsia="en-IN"/>
+        </w:rPr>
+      </w:pPr>
+      <w:r>
+        <w:rPr>
+          <w:rFonts w:ascii="Open Sans" w:eastAsia="Times New Roman" w:hAnsi="Open Sans"/>
+          <w:sz w:val="24"/>
+          <w:szCs w:val="24"/>
+          <w:lang w:eastAsia="en-IN"/>
+        </w:rPr>
+        <w:t xml:space="preserve">Maintenance of Statutory Registers &amp; Records </w:t>
+      </w:r>
+    </w:p>
+    <w:p>
+      <w:pPr>
+        <w:numPr>
+          <w:ilvl w:val="0"/>
+          <w:numId w:val="4"/>
+        </w:numPr>
+        <w:shd w:val="clear" w:color="auto" w:fill="FFFFFF"/>
+        <w:tabs>
+          <w:tab w:val="clear" w:pos="1440"/>
+        </w:tabs>
+        <w:spacing w:after="100" w:afterAutospacing="1" w:line="360" w:lineRule="atLeast"/>
+        <w:jc w:val="both"/>
+        <w:rPr>
+          <w:rFonts w:ascii="Open Sans" w:eastAsia="Times New Roman" w:hAnsi="Open Sans"/>
+          <w:sz w:val="24"/>
+          <w:szCs w:val="24"/>
+          <w:lang w:eastAsia="en-IN"/>
+        </w:rPr>
+      </w:pPr>
+      <w:r>
+        <w:rPr>
+          <w:rFonts w:ascii="Open Sans" w:eastAsia="Times New Roman" w:hAnsi="Open Sans"/>
+          <w:sz w:val="24"/>
+          <w:szCs w:val="24"/>
+          <w:lang w:eastAsia="en-IN"/>
+        </w:rPr>
+        <w:t xml:space="preserve">AGM &amp; </w:t>
+      </w:r>
+      <w:r>
+        <w:rPr>
+          <w:rFonts w:ascii="Open Sans" w:eastAsia="Times New Roman" w:hAnsi="Open Sans"/>
+          <w:sz w:val="24"/>
+          <w:szCs w:val="24"/>
+          <w:lang w:eastAsia="en-IN"/>
+        </w:rPr>
+        <w:t>EGM, BM</w:t>
+      </w:r>
+      <w:r>
+        <w:rPr>
+          <w:rFonts w:ascii="Open Sans" w:eastAsia="Times New Roman" w:hAnsi="Open Sans"/>
+          <w:sz w:val="24"/>
+          <w:szCs w:val="24"/>
+          <w:lang w:eastAsia="en-IN"/>
+        </w:rPr>
+        <w:t xml:space="preserve"> Compliance, Minutes &amp; Resolutions </w:t>
+      </w:r>
+    </w:p>
+    <w:p>
+      <w:pPr>
         <w:rPr>
           <w:b/>
           <w:bCs/>
           <w:sz w:val="32"/>
           <w:szCs w:val="32"/>
         </w:rPr>
-        <w:t xml:space="preserve"> &amp; Secretarial Services</w:t>
-      </w:r>
-    </w:p>
-    <w:p>
-      <w:pPr>
-        <w:numPr>
-          <w:ilvl w:val="0"/>
-          <w:numId w:val="4"/>
-        </w:numPr>
-        <w:shd w:val="clear" w:color="auto" w:fill="FFFFFF"/>
-        <w:tabs>
-          <w:tab w:val="clear" w:pos="1440"/>
-        </w:tabs>
-        <w:spacing w:after="100" w:afterAutospacing="1" w:line="360" w:lineRule="atLeast"/>
-        <w:jc w:val="both"/>
-        <w:rPr>
-          <w:rFonts w:ascii="Open Sans" w:eastAsia="Times New Roman" w:hAnsi="Open Sans"/>
-          <w:sz w:val="24"/>
-          <w:szCs w:val="24"/>
-          <w:lang w:eastAsia="en-IN"/>
-        </w:rPr>
-      </w:pPr>
-      <w:r>
-        <w:rPr>
-          <w:rFonts w:ascii="Open Sans" w:eastAsia="Times New Roman" w:hAnsi="Open Sans"/>
-          <w:sz w:val="24"/>
-          <w:szCs w:val="24"/>
-          <w:lang w:eastAsia="en-IN"/>
-        </w:rPr>
-        <w:t xml:space="preserve">MCA Annual Compliance </w:t>
-      </w:r>
-    </w:p>
-    <w:p>
-      <w:pPr>
-        <w:numPr>
-          <w:ilvl w:val="0"/>
-          <w:numId w:val="4"/>
-        </w:numPr>
-        <w:shd w:val="clear" w:color="auto" w:fill="FFFFFF"/>
-        <w:tabs>
-          <w:tab w:val="clear" w:pos="1440"/>
-        </w:tabs>
-        <w:spacing w:after="100" w:afterAutospacing="1" w:line="360" w:lineRule="atLeast"/>
-        <w:jc w:val="both"/>
-        <w:rPr>
-          <w:rFonts w:ascii="Open Sans" w:eastAsia="Times New Roman" w:hAnsi="Open Sans"/>
-          <w:sz w:val="24"/>
-          <w:szCs w:val="24"/>
-          <w:lang w:eastAsia="en-IN"/>
-        </w:rPr>
-      </w:pPr>
-      <w:r>
-        <w:rPr>
-          <w:rFonts w:ascii="Open Sans" w:eastAsia="Times New Roman" w:hAnsi="Open Sans"/>
-          <w:sz w:val="24"/>
-          <w:szCs w:val="24"/>
-          <w:lang w:eastAsia="en-IN"/>
-        </w:rPr>
-        <w:t xml:space="preserve">ROC Filings </w:t>
-      </w:r>
-    </w:p>
-    <w:p>
-      <w:pPr>
-        <w:numPr>
-          <w:ilvl w:val="0"/>
-          <w:numId w:val="4"/>
-        </w:numPr>
-        <w:shd w:val="clear" w:color="auto" w:fill="FFFFFF"/>
-        <w:tabs>
-          <w:tab w:val="clear" w:pos="1440"/>
-        </w:tabs>
-        <w:spacing w:after="100" w:afterAutospacing="1" w:line="360" w:lineRule="atLeast"/>
-        <w:jc w:val="both"/>
-        <w:rPr>
-          <w:rFonts w:ascii="Open Sans" w:eastAsia="Times New Roman" w:hAnsi="Open Sans"/>
-          <w:sz w:val="24"/>
-          <w:szCs w:val="24"/>
-          <w:lang w:eastAsia="en-IN"/>
-        </w:rPr>
-      </w:pPr>
-      <w:r>
-        <w:rPr>
-          <w:rFonts w:ascii="Open Sans" w:eastAsia="Times New Roman" w:hAnsi="Open Sans"/>
-          <w:sz w:val="24"/>
-          <w:szCs w:val="24"/>
-          <w:lang w:eastAsia="en-IN"/>
-        </w:rPr>
-        <w:t xml:space="preserve">Maintenance of Statutory Registers &amp; Records </w:t>
-      </w:r>
-    </w:p>
-    <w:p>
-      <w:pPr>
-        <w:numPr>
-          <w:ilvl w:val="0"/>
-          <w:numId w:val="4"/>
-        </w:numPr>
-        <w:shd w:val="clear" w:color="auto" w:fill="FFFFFF"/>
-        <w:tabs>
-          <w:tab w:val="clear" w:pos="1440"/>
-        </w:tabs>
-        <w:spacing w:after="100" w:afterAutospacing="1" w:line="360" w:lineRule="atLeast"/>
-        <w:jc w:val="both"/>
-        <w:rPr>
-          <w:rFonts w:ascii="Open Sans" w:eastAsia="Times New Roman" w:hAnsi="Open Sans"/>
-          <w:sz w:val="24"/>
-          <w:szCs w:val="24"/>
-          <w:lang w:eastAsia="en-IN"/>
-        </w:rPr>
-      </w:pPr>
-      <w:r>
-        <w:rPr>
-          <w:rFonts w:ascii="Open Sans" w:eastAsia="Times New Roman" w:hAnsi="Open Sans"/>
-          <w:sz w:val="24"/>
-          <w:szCs w:val="24"/>
-          <w:lang w:eastAsia="en-IN"/>
-        </w:rPr>
-        <w:t xml:space="preserve">AGM &amp; </w:t>
-      </w:r>
-      <w:r>
-        <w:rPr>
-          <w:rFonts w:ascii="Open Sans" w:eastAsia="Times New Roman" w:hAnsi="Open Sans"/>
-          <w:sz w:val="24"/>
-          <w:szCs w:val="24"/>
-          <w:lang w:eastAsia="en-IN"/>
-        </w:rPr>
-        <w:t>EGM, BM</w:t>
-      </w:r>
-      <w:r>
-        <w:rPr>
-          <w:rFonts w:ascii="Open Sans" w:eastAsia="Times New Roman" w:hAnsi="Open Sans"/>
-          <w:sz w:val="24"/>
-          <w:szCs w:val="24"/>
-          <w:lang w:eastAsia="en-IN"/>
-        </w:rPr>
-        <w:t xml:space="preserve"> Compliance, Minutes &amp; Resolutions </w:t>
-      </w:r>
-    </w:p>
-    <w:p>
-      <w:pPr>
+      </w:pPr>
+      <w:bookmarkStart w:id="3" w:name="_Hlk231721591"/>
+      <w:r>
         <w:rPr>
           <w:b/>
           <w:bCs/>
           <w:sz w:val="32"/>
           <w:szCs w:val="32"/>
         </w:rPr>
-      </w:pPr>
-      <w:bookmarkStart w:id="4" w:name="_Hlk231721591"/>
+        <w:t>Virtual CFO (</w:t>
+      </w:r>
+      <w:proofErr w:type="spellStart"/>
       <w:r>
         <w:rPr>
           <w:b/>
@@ -2121,9 +2354,9 @@
           <w:sz w:val="32"/>
           <w:szCs w:val="32"/>
         </w:rPr>
-        <w:t>Virtual CFO (</w:t>
-      </w:r>
-      <w:proofErr w:type="spellStart"/>
+        <w:t>vCFO</w:t>
+      </w:r>
+      <w:proofErr w:type="spellEnd"/>
       <w:r>
         <w:rPr>
           <w:b/>
@@ -2131,312 +2364,350 @@
           <w:sz w:val="32"/>
           <w:szCs w:val="32"/>
         </w:rPr>
-        <w:t>vCFO</w:t>
-      </w:r>
-      <w:proofErr w:type="spellEnd"/>
-      <w:r>
+        <w:t>) Services</w:t>
+      </w:r>
+      <w:bookmarkEnd w:id="3"/>
+    </w:p>
+    <w:p>
+      <w:pPr>
+        <w:pStyle w:val="Heading3"/>
+        <w:shd w:val="clear" w:color="auto" w:fill="FFFFFF"/>
+        <w:spacing w:before="0" w:beforeAutospacing="0" w:after="90" w:afterAutospacing="0" w:line="375" w:lineRule="atLeast"/>
+        <w:rPr>
+          <w:rFonts w:ascii="Open Sans" w:hAnsi="Open Sans"/>
+          <w:sz w:val="40"/>
+          <w:szCs w:val="40"/>
+        </w:rPr>
+      </w:pPr>
+      <w:r>
+        <w:rPr>
+          <w:rFonts w:ascii="Open Sans" w:hAnsi="Open Sans"/>
+          <w:sz w:val="40"/>
+          <w:szCs w:val="40"/>
+        </w:rPr>
+        <w:t>5</w:t>
+      </w:r>
+      <w:r>
+        <w:rPr>
+          <w:rFonts w:ascii="Open Sans" w:hAnsi="Open Sans"/>
+          <w:sz w:val="40"/>
+          <w:szCs w:val="40"/>
+        </w:rPr>
+        <w:t>. Taxation</w:t>
+      </w:r>
+      <w:r>
+        <w:rPr>
+          <w:rFonts w:ascii="Open Sans" w:hAnsi="Open Sans"/>
+          <w:sz w:val="40"/>
+          <w:szCs w:val="40"/>
+        </w:rPr>
+        <w:t>, Regulatory compliances</w:t>
+      </w:r>
+      <w:r>
+        <w:rPr>
+          <w:rFonts w:ascii="Open Sans" w:hAnsi="Open Sans"/>
+          <w:sz w:val="40"/>
+          <w:szCs w:val="40"/>
+        </w:rPr>
+        <w:t xml:space="preserve"> &amp; Litigation</w:t>
+      </w:r>
+    </w:p>
+    <w:p>
+      <w:pPr>
+        <w:pStyle w:val="Heading3"/>
+        <w:shd w:val="clear" w:color="auto" w:fill="FFFFFF"/>
+        <w:spacing w:before="0" w:beforeAutospacing="0" w:after="90" w:afterAutospacing="0" w:line="375" w:lineRule="atLeast"/>
+        <w:rPr>
+          <w:rFonts w:ascii="Open Sans" w:hAnsi="Open Sans" w:cs="Open Sans"/>
+          <w:kern w:val="2"/>
+          <w:sz w:val="24"/>
+          <w:szCs w:val="24"/>
+          <w14:ligatures w14:val="standardContextual"/>
+        </w:rPr>
+      </w:pPr>
+      <w:r>
+        <w:rPr>
+          <w:rFonts w:ascii="Open Sans" w:hAnsi="Open Sans" w:cs="Open Sans"/>
+          <w:kern w:val="2"/>
+          <w:sz w:val="24"/>
+          <w:szCs w:val="24"/>
+          <w14:ligatures w14:val="standardContextual"/>
+        </w:rPr>
+        <w:t>Professional solutions for income tax, GST, regulatory registrations, and litigation support. Focused on compliance, efficiency, and effective representation.</w:t>
+      </w:r>
+    </w:p>
+    <w:p>
+      <w:pPr>
+        <w:pStyle w:val="Heading3"/>
+        <w:shd w:val="clear" w:color="auto" w:fill="FFFFFF"/>
+        <w:spacing w:before="0" w:beforeAutospacing="0" w:after="90" w:afterAutospacing="0" w:line="375" w:lineRule="atLeast"/>
+        <w:rPr>
+          <w:rFonts w:ascii="Open Sans" w:hAnsi="Open Sans" w:cs="Open Sans"/>
+          <w:kern w:val="2"/>
+          <w:sz w:val="24"/>
+          <w:szCs w:val="24"/>
+          <w14:ligatures w14:val="standardContextual"/>
+        </w:rPr>
+      </w:pPr>
+      <w:bookmarkStart w:id="4" w:name="_GoBack"/>
+      <w:bookmarkEnd w:id="4"/>
+    </w:p>
+    <w:p>
+      <w:pPr>
         <w:rPr>
           <w:b/>
           <w:bCs/>
           <w:sz w:val="32"/>
           <w:szCs w:val="32"/>
         </w:rPr>
-        <w:t>) Services</w:t>
-      </w:r>
-      <w:bookmarkEnd w:id="4"/>
-    </w:p>
-    <w:p>
-      <w:pPr>
-        <w:pStyle w:val="Heading3"/>
-        <w:shd w:val="clear" w:color="auto" w:fill="FFFFFF"/>
-        <w:spacing w:before="0" w:beforeAutospacing="0" w:after="90" w:afterAutospacing="0" w:line="375" w:lineRule="atLeast"/>
-        <w:rPr>
-          <w:rFonts w:ascii="Open Sans" w:hAnsi="Open Sans"/>
-          <w:sz w:val="40"/>
-          <w:szCs w:val="40"/>
-        </w:rPr>
-      </w:pPr>
-      <w:r>
-        <w:rPr>
-          <w:rFonts w:ascii="Open Sans" w:hAnsi="Open Sans"/>
-          <w:sz w:val="40"/>
-          <w:szCs w:val="40"/>
-        </w:rPr>
-        <w:t>5</w:t>
-      </w:r>
-      <w:r>
-        <w:rPr>
-          <w:rFonts w:ascii="Open Sans" w:hAnsi="Open Sans"/>
-          <w:sz w:val="40"/>
-          <w:szCs w:val="40"/>
-        </w:rPr>
-        <w:t>. Taxation</w:t>
-      </w:r>
-      <w:r>
-        <w:rPr>
-          <w:rFonts w:ascii="Open Sans" w:hAnsi="Open Sans"/>
-          <w:sz w:val="40"/>
-          <w:szCs w:val="40"/>
-        </w:rPr>
-        <w:t>, Regulatory compliances</w:t>
-      </w:r>
-      <w:r>
-        <w:rPr>
-          <w:rFonts w:ascii="Open Sans" w:hAnsi="Open Sans"/>
-          <w:sz w:val="40"/>
-          <w:szCs w:val="40"/>
-        </w:rPr>
-        <w:t xml:space="preserve"> &amp; Litigation</w:t>
-      </w:r>
-    </w:p>
-    <w:p>
-      <w:pPr>
+      </w:pPr>
+      <w:r>
         <w:rPr>
           <w:b/>
           <w:bCs/>
           <w:sz w:val="32"/>
           <w:szCs w:val="32"/>
         </w:rPr>
-      </w:pPr>
-      <w:r>
+        <w:t>Income Tax</w:t>
+      </w:r>
+    </w:p>
+    <w:p>
+      <w:pPr>
+        <w:numPr>
+          <w:ilvl w:val="0"/>
+          <w:numId w:val="5"/>
+        </w:numPr>
+        <w:shd w:val="clear" w:color="auto" w:fill="FFFFFF"/>
+        <w:tabs>
+          <w:tab w:val="clear" w:pos="1440"/>
+        </w:tabs>
+        <w:spacing w:after="100" w:afterAutospacing="1" w:line="360" w:lineRule="atLeast"/>
+        <w:jc w:val="both"/>
+        <w:rPr>
+          <w:rFonts w:ascii="Open Sans" w:eastAsia="Times New Roman" w:hAnsi="Open Sans"/>
+          <w:sz w:val="24"/>
+          <w:szCs w:val="24"/>
+          <w:lang w:eastAsia="en-IN"/>
+        </w:rPr>
+      </w:pPr>
+      <w:r>
+        <w:rPr>
+          <w:rFonts w:ascii="Open Sans" w:eastAsia="Times New Roman" w:hAnsi="Open Sans"/>
+          <w:sz w:val="24"/>
+          <w:szCs w:val="24"/>
+          <w:lang w:eastAsia="en-IN"/>
+        </w:rPr>
+        <w:t xml:space="preserve">Income Tax Returns </w:t>
+      </w:r>
+    </w:p>
+    <w:p>
+      <w:pPr>
+        <w:numPr>
+          <w:ilvl w:val="0"/>
+          <w:numId w:val="5"/>
+        </w:numPr>
+        <w:shd w:val="clear" w:color="auto" w:fill="FFFFFF"/>
+        <w:tabs>
+          <w:tab w:val="clear" w:pos="1440"/>
+        </w:tabs>
+        <w:spacing w:after="100" w:afterAutospacing="1" w:line="360" w:lineRule="atLeast"/>
+        <w:jc w:val="both"/>
+        <w:rPr>
+          <w:rFonts w:ascii="Open Sans" w:eastAsia="Times New Roman" w:hAnsi="Open Sans"/>
+          <w:sz w:val="24"/>
+          <w:szCs w:val="24"/>
+          <w:lang w:eastAsia="en-IN"/>
+        </w:rPr>
+      </w:pPr>
+      <w:r>
+        <w:rPr>
+          <w:rFonts w:ascii="Open Sans" w:eastAsia="Times New Roman" w:hAnsi="Open Sans"/>
+          <w:sz w:val="24"/>
+          <w:szCs w:val="24"/>
+          <w:lang w:eastAsia="en-IN"/>
+        </w:rPr>
+        <w:t>Tax Audit</w:t>
+      </w:r>
+    </w:p>
+    <w:p>
+      <w:pPr>
+        <w:numPr>
+          <w:ilvl w:val="0"/>
+          <w:numId w:val="5"/>
+        </w:numPr>
+        <w:shd w:val="clear" w:color="auto" w:fill="FFFFFF"/>
+        <w:spacing w:after="100" w:afterAutospacing="1" w:line="360" w:lineRule="atLeast"/>
+        <w:jc w:val="both"/>
+        <w:rPr>
+          <w:rFonts w:ascii="Open Sans" w:eastAsia="Times New Roman" w:hAnsi="Open Sans"/>
+          <w:sz w:val="24"/>
+          <w:szCs w:val="24"/>
+          <w:lang w:eastAsia="en-IN"/>
+        </w:rPr>
+      </w:pPr>
+      <w:r>
+        <w:rPr>
+          <w:rFonts w:ascii="Open Sans" w:eastAsia="Times New Roman" w:hAnsi="Open Sans"/>
+          <w:sz w:val="24"/>
+          <w:szCs w:val="24"/>
+          <w:lang w:eastAsia="en-IN"/>
+        </w:rPr>
+        <w:t xml:space="preserve">TDS/TCS Returns </w:t>
+      </w:r>
+    </w:p>
+    <w:p>
+      <w:pPr>
+        <w:numPr>
+          <w:ilvl w:val="0"/>
+          <w:numId w:val="5"/>
+        </w:numPr>
+        <w:shd w:val="clear" w:color="auto" w:fill="FFFFFF"/>
+        <w:tabs>
+          <w:tab w:val="clear" w:pos="1440"/>
+        </w:tabs>
+        <w:spacing w:after="100" w:afterAutospacing="1" w:line="360" w:lineRule="atLeast"/>
+        <w:jc w:val="both"/>
+        <w:rPr>
+          <w:rFonts w:ascii="Open Sans" w:eastAsia="Times New Roman" w:hAnsi="Open Sans"/>
+          <w:sz w:val="24"/>
+          <w:szCs w:val="24"/>
+          <w:lang w:eastAsia="en-IN"/>
+        </w:rPr>
+      </w:pPr>
+      <w:r>
+        <w:rPr>
+          <w:rFonts w:ascii="Open Sans" w:eastAsia="Times New Roman" w:hAnsi="Open Sans"/>
+          <w:sz w:val="24"/>
+          <w:szCs w:val="24"/>
+          <w:lang w:eastAsia="en-IN"/>
+        </w:rPr>
+        <w:t>Registration under 12A &amp; 80G</w:t>
+      </w:r>
+    </w:p>
+    <w:p>
+      <w:pPr>
+        <w:numPr>
+          <w:ilvl w:val="0"/>
+          <w:numId w:val="5"/>
+        </w:numPr>
+        <w:shd w:val="clear" w:color="auto" w:fill="FFFFFF"/>
+        <w:tabs>
+          <w:tab w:val="clear" w:pos="1440"/>
+        </w:tabs>
+        <w:spacing w:after="100" w:afterAutospacing="1" w:line="360" w:lineRule="atLeast"/>
+        <w:jc w:val="both"/>
+        <w:rPr>
+          <w:rFonts w:ascii="Open Sans" w:eastAsia="Times New Roman" w:hAnsi="Open Sans"/>
+          <w:sz w:val="24"/>
+          <w:szCs w:val="24"/>
+          <w:lang w:eastAsia="en-IN"/>
+        </w:rPr>
+      </w:pPr>
+      <w:r>
+        <w:rPr>
+          <w:rFonts w:ascii="Open Sans" w:eastAsia="Times New Roman" w:hAnsi="Open Sans"/>
+          <w:sz w:val="24"/>
+          <w:szCs w:val="24"/>
+          <w:lang w:eastAsia="en-IN"/>
+        </w:rPr>
+        <w:t xml:space="preserve">PAN/TAN Applications </w:t>
+      </w:r>
+    </w:p>
+    <w:p>
+      <w:pPr>
+        <w:numPr>
+          <w:ilvl w:val="0"/>
+          <w:numId w:val="5"/>
+        </w:numPr>
+        <w:shd w:val="clear" w:color="auto" w:fill="FFFFFF"/>
+        <w:tabs>
+          <w:tab w:val="clear" w:pos="1440"/>
+        </w:tabs>
+        <w:spacing w:after="100" w:afterAutospacing="1" w:line="360" w:lineRule="atLeast"/>
+        <w:jc w:val="both"/>
+        <w:rPr>
+          <w:rFonts w:ascii="Open Sans" w:eastAsia="Times New Roman" w:hAnsi="Open Sans"/>
+          <w:sz w:val="24"/>
+          <w:szCs w:val="24"/>
+          <w:lang w:eastAsia="en-IN"/>
+        </w:rPr>
+      </w:pPr>
+      <w:r>
+        <w:rPr>
+          <w:rFonts w:ascii="Open Sans" w:eastAsia="Times New Roman" w:hAnsi="Open Sans"/>
+          <w:sz w:val="24"/>
+          <w:szCs w:val="24"/>
+          <w:lang w:eastAsia="en-IN"/>
+        </w:rPr>
+        <w:t xml:space="preserve">Tax Planning &amp; Advisory </w:t>
+      </w:r>
+    </w:p>
+    <w:p>
+      <w:pPr>
         <w:rPr>
           <w:b/>
           <w:bCs/>
           <w:sz w:val="32"/>
           <w:szCs w:val="32"/>
         </w:rPr>
-        <w:t>Income Tax</w:t>
-      </w:r>
-    </w:p>
-    <w:p>
-      <w:pPr>
-        <w:numPr>
-          <w:ilvl w:val="0"/>
-          <w:numId w:val="5"/>
-        </w:numPr>
-        <w:shd w:val="clear" w:color="auto" w:fill="FFFFFF"/>
-        <w:tabs>
-          <w:tab w:val="clear" w:pos="1440"/>
-        </w:tabs>
-        <w:spacing w:after="100" w:afterAutospacing="1" w:line="360" w:lineRule="atLeast"/>
-        <w:jc w:val="both"/>
-        <w:rPr>
-          <w:rFonts w:ascii="Open Sans" w:eastAsia="Times New Roman" w:hAnsi="Open Sans"/>
-          <w:sz w:val="24"/>
-          <w:szCs w:val="24"/>
-          <w:lang w:eastAsia="en-IN"/>
-        </w:rPr>
-      </w:pPr>
-      <w:r>
-        <w:rPr>
-          <w:rFonts w:ascii="Open Sans" w:eastAsia="Times New Roman" w:hAnsi="Open Sans"/>
-          <w:sz w:val="24"/>
-          <w:szCs w:val="24"/>
-          <w:lang w:eastAsia="en-IN"/>
-        </w:rPr>
-        <w:t xml:space="preserve">Income Tax Returns </w:t>
-      </w:r>
-    </w:p>
-    <w:p>
-      <w:pPr>
-        <w:numPr>
-          <w:ilvl w:val="0"/>
-          <w:numId w:val="5"/>
-        </w:numPr>
-        <w:shd w:val="clear" w:color="auto" w:fill="FFFFFF"/>
-        <w:tabs>
-          <w:tab w:val="clear" w:pos="1440"/>
-        </w:tabs>
-        <w:spacing w:after="100" w:afterAutospacing="1" w:line="360" w:lineRule="atLeast"/>
-        <w:jc w:val="both"/>
-        <w:rPr>
-          <w:rFonts w:ascii="Open Sans" w:eastAsia="Times New Roman" w:hAnsi="Open Sans"/>
-          <w:sz w:val="24"/>
-          <w:szCs w:val="24"/>
-          <w:lang w:eastAsia="en-IN"/>
-        </w:rPr>
-      </w:pPr>
-      <w:r>
-        <w:rPr>
-          <w:rFonts w:ascii="Open Sans" w:eastAsia="Times New Roman" w:hAnsi="Open Sans"/>
-          <w:sz w:val="24"/>
-          <w:szCs w:val="24"/>
-          <w:lang w:eastAsia="en-IN"/>
-        </w:rPr>
-        <w:t>Tax Audit</w:t>
-      </w:r>
-    </w:p>
-    <w:p>
-      <w:pPr>
-        <w:numPr>
-          <w:ilvl w:val="0"/>
-          <w:numId w:val="5"/>
-        </w:numPr>
-        <w:shd w:val="clear" w:color="auto" w:fill="FFFFFF"/>
-        <w:spacing w:after="100" w:afterAutospacing="1" w:line="360" w:lineRule="atLeast"/>
-        <w:jc w:val="both"/>
-        <w:rPr>
-          <w:rFonts w:ascii="Open Sans" w:eastAsia="Times New Roman" w:hAnsi="Open Sans"/>
-          <w:sz w:val="24"/>
-          <w:szCs w:val="24"/>
-          <w:lang w:eastAsia="en-IN"/>
-        </w:rPr>
-      </w:pPr>
-      <w:r>
-        <w:rPr>
-          <w:rFonts w:ascii="Open Sans" w:eastAsia="Times New Roman" w:hAnsi="Open Sans"/>
-          <w:sz w:val="24"/>
-          <w:szCs w:val="24"/>
-          <w:lang w:eastAsia="en-IN"/>
-        </w:rPr>
-        <w:t xml:space="preserve">TDS/TCS Returns </w:t>
-      </w:r>
-    </w:p>
-    <w:p>
-      <w:pPr>
-        <w:numPr>
-          <w:ilvl w:val="0"/>
-          <w:numId w:val="5"/>
-        </w:numPr>
-        <w:shd w:val="clear" w:color="auto" w:fill="FFFFFF"/>
-        <w:tabs>
-          <w:tab w:val="clear" w:pos="1440"/>
-        </w:tabs>
-        <w:spacing w:after="100" w:afterAutospacing="1" w:line="360" w:lineRule="atLeast"/>
-        <w:jc w:val="both"/>
-        <w:rPr>
-          <w:rFonts w:ascii="Open Sans" w:eastAsia="Times New Roman" w:hAnsi="Open Sans"/>
-          <w:sz w:val="24"/>
-          <w:szCs w:val="24"/>
-          <w:lang w:eastAsia="en-IN"/>
-        </w:rPr>
-      </w:pPr>
-      <w:r>
-        <w:rPr>
-          <w:rFonts w:ascii="Open Sans" w:eastAsia="Times New Roman" w:hAnsi="Open Sans"/>
-          <w:sz w:val="24"/>
-          <w:szCs w:val="24"/>
-          <w:lang w:eastAsia="en-IN"/>
-        </w:rPr>
-        <w:t>Registration under 12A &amp; 80G</w:t>
-      </w:r>
-    </w:p>
-    <w:p>
-      <w:pPr>
-        <w:numPr>
-          <w:ilvl w:val="0"/>
-          <w:numId w:val="5"/>
-        </w:numPr>
-        <w:shd w:val="clear" w:color="auto" w:fill="FFFFFF"/>
-        <w:tabs>
-          <w:tab w:val="clear" w:pos="1440"/>
-        </w:tabs>
-        <w:spacing w:after="100" w:afterAutospacing="1" w:line="360" w:lineRule="atLeast"/>
-        <w:jc w:val="both"/>
-        <w:rPr>
-          <w:rFonts w:ascii="Open Sans" w:eastAsia="Times New Roman" w:hAnsi="Open Sans"/>
-          <w:sz w:val="24"/>
-          <w:szCs w:val="24"/>
-          <w:lang w:eastAsia="en-IN"/>
-        </w:rPr>
-      </w:pPr>
-      <w:r>
-        <w:rPr>
-          <w:rFonts w:ascii="Open Sans" w:eastAsia="Times New Roman" w:hAnsi="Open Sans"/>
-          <w:sz w:val="24"/>
-          <w:szCs w:val="24"/>
-          <w:lang w:eastAsia="en-IN"/>
-        </w:rPr>
-        <w:t xml:space="preserve">PAN/TAN Applications </w:t>
-      </w:r>
-    </w:p>
-    <w:p>
-      <w:pPr>
-        <w:numPr>
-          <w:ilvl w:val="0"/>
-          <w:numId w:val="5"/>
-        </w:numPr>
-        <w:shd w:val="clear" w:color="auto" w:fill="FFFFFF"/>
-        <w:tabs>
-          <w:tab w:val="clear" w:pos="1440"/>
-        </w:tabs>
-        <w:spacing w:after="100" w:afterAutospacing="1" w:line="360" w:lineRule="atLeast"/>
-        <w:jc w:val="both"/>
-        <w:rPr>
-          <w:rFonts w:ascii="Open Sans" w:eastAsia="Times New Roman" w:hAnsi="Open Sans"/>
-          <w:sz w:val="24"/>
-          <w:szCs w:val="24"/>
-          <w:lang w:eastAsia="en-IN"/>
-        </w:rPr>
-      </w:pPr>
-      <w:r>
-        <w:rPr>
-          <w:rFonts w:ascii="Open Sans" w:eastAsia="Times New Roman" w:hAnsi="Open Sans"/>
-          <w:sz w:val="24"/>
-          <w:szCs w:val="24"/>
-          <w:lang w:eastAsia="en-IN"/>
-        </w:rPr>
-        <w:t xml:space="preserve">Tax Planning &amp; Advisory </w:t>
-      </w:r>
-    </w:p>
-    <w:p>
-      <w:pPr>
+      </w:pPr>
+      <w:r>
         <w:rPr>
           <w:b/>
           <w:bCs/>
           <w:sz w:val="32"/>
           <w:szCs w:val="32"/>
         </w:rPr>
-      </w:pPr>
-      <w:r>
+        <w:t>GST</w:t>
+      </w:r>
+    </w:p>
+    <w:p>
+      <w:pPr>
+        <w:numPr>
+          <w:ilvl w:val="0"/>
+          <w:numId w:val="5"/>
+        </w:numPr>
+        <w:shd w:val="clear" w:color="auto" w:fill="FFFFFF"/>
+        <w:tabs>
+          <w:tab w:val="clear" w:pos="1440"/>
+        </w:tabs>
+        <w:spacing w:after="100" w:afterAutospacing="1" w:line="360" w:lineRule="atLeast"/>
+        <w:jc w:val="both"/>
+        <w:rPr>
+          <w:rFonts w:ascii="Open Sans" w:eastAsia="Times New Roman" w:hAnsi="Open Sans"/>
+          <w:sz w:val="24"/>
+          <w:szCs w:val="24"/>
+          <w:lang w:eastAsia="en-IN"/>
+        </w:rPr>
+      </w:pPr>
+      <w:r>
+        <w:rPr>
+          <w:rFonts w:ascii="Open Sans" w:eastAsia="Times New Roman" w:hAnsi="Open Sans"/>
+          <w:sz w:val="24"/>
+          <w:szCs w:val="24"/>
+          <w:lang w:eastAsia="en-IN"/>
+        </w:rPr>
+        <w:t xml:space="preserve">GST Registration &amp; Returns </w:t>
+      </w:r>
+    </w:p>
+    <w:p>
+      <w:pPr>
         <w:rPr>
           <w:b/>
           <w:bCs/>
           <w:sz w:val="32"/>
           <w:szCs w:val="32"/>
         </w:rPr>
-        <w:t>GST</w:t>
-      </w:r>
-    </w:p>
-    <w:p>
-      <w:pPr>
-        <w:numPr>
-          <w:ilvl w:val="0"/>
-          <w:numId w:val="5"/>
-        </w:numPr>
-        <w:shd w:val="clear" w:color="auto" w:fill="FFFFFF"/>
-        <w:tabs>
-          <w:tab w:val="clear" w:pos="1440"/>
-        </w:tabs>
-        <w:spacing w:after="100" w:afterAutospacing="1" w:line="360" w:lineRule="atLeast"/>
-        <w:jc w:val="both"/>
-        <w:rPr>
-          <w:rFonts w:ascii="Open Sans" w:eastAsia="Times New Roman" w:hAnsi="Open Sans"/>
-          <w:sz w:val="24"/>
-          <w:szCs w:val="24"/>
-          <w:lang w:eastAsia="en-IN"/>
-        </w:rPr>
-      </w:pPr>
-      <w:r>
-        <w:rPr>
-          <w:rFonts w:ascii="Open Sans" w:eastAsia="Times New Roman" w:hAnsi="Open Sans"/>
-          <w:sz w:val="24"/>
-          <w:szCs w:val="24"/>
-          <w:lang w:eastAsia="en-IN"/>
-        </w:rPr>
-        <w:lastRenderedPageBreak/>
-        <w:t xml:space="preserve">GST Registration &amp; Returns </w:t>
-      </w:r>
-    </w:p>
-    <w:p>
-      <w:pPr>
+      </w:pPr>
+      <w:r>
         <w:rPr>
           <w:b/>
           <w:bCs/>
           <w:sz w:val="32"/>
           <w:szCs w:val="32"/>
         </w:rPr>
-      </w:pPr>
+        <w:t>Regulatory</w:t>
+      </w:r>
       <w:r>
         <w:rPr>
           <w:b/>
@@ -2444,415 +2715,407 @@
           <w:sz w:val="32"/>
           <w:szCs w:val="32"/>
         </w:rPr>
-        <w:t>Regulatory</w:t>
-      </w:r>
-      <w:r>
+        <w:t xml:space="preserve"> Registrations.</w:t>
+      </w:r>
+    </w:p>
+    <w:p>
+      <w:pPr>
+        <w:numPr>
+          <w:ilvl w:val="0"/>
+          <w:numId w:val="5"/>
+        </w:numPr>
+        <w:shd w:val="clear" w:color="auto" w:fill="FFFFFF"/>
+        <w:tabs>
+          <w:tab w:val="clear" w:pos="1440"/>
+        </w:tabs>
+        <w:spacing w:after="100" w:afterAutospacing="1" w:line="360" w:lineRule="atLeast"/>
+        <w:jc w:val="both"/>
+        <w:rPr>
+          <w:rFonts w:ascii="Open Sans" w:eastAsia="Times New Roman" w:hAnsi="Open Sans"/>
+          <w:sz w:val="24"/>
+          <w:szCs w:val="24"/>
+          <w:lang w:eastAsia="en-IN"/>
+        </w:rPr>
+      </w:pPr>
+      <w:r>
+        <w:rPr>
+          <w:rFonts w:ascii="Open Sans" w:eastAsia="Times New Roman" w:hAnsi="Open Sans"/>
+          <w:sz w:val="24"/>
+          <w:szCs w:val="24"/>
+          <w:lang w:eastAsia="en-IN"/>
+        </w:rPr>
+        <w:t xml:space="preserve">Professional Tax Registration &amp; Returns </w:t>
+      </w:r>
+    </w:p>
+    <w:p>
+      <w:pPr>
+        <w:numPr>
+          <w:ilvl w:val="0"/>
+          <w:numId w:val="5"/>
+        </w:numPr>
+        <w:shd w:val="clear" w:color="auto" w:fill="FFFFFF"/>
+        <w:tabs>
+          <w:tab w:val="clear" w:pos="1440"/>
+        </w:tabs>
+        <w:spacing w:after="100" w:afterAutospacing="1" w:line="360" w:lineRule="atLeast"/>
+        <w:jc w:val="both"/>
+        <w:rPr>
+          <w:rFonts w:ascii="Open Sans" w:eastAsia="Times New Roman" w:hAnsi="Open Sans"/>
+          <w:sz w:val="24"/>
+          <w:szCs w:val="24"/>
+          <w:lang w:eastAsia="en-IN"/>
+        </w:rPr>
+      </w:pPr>
+      <w:bookmarkStart w:id="5" w:name="_Hlk231890581"/>
+      <w:r>
+        <w:rPr>
+          <w:rFonts w:ascii="Open Sans" w:eastAsia="Times New Roman" w:hAnsi="Open Sans"/>
+          <w:sz w:val="24"/>
+          <w:szCs w:val="24"/>
+          <w:lang w:eastAsia="en-IN"/>
+        </w:rPr>
+        <w:t xml:space="preserve">Shop &amp; Establishment Registration </w:t>
+      </w:r>
+    </w:p>
+    <w:p>
+      <w:pPr>
+        <w:numPr>
+          <w:ilvl w:val="0"/>
+          <w:numId w:val="5"/>
+        </w:numPr>
+        <w:shd w:val="clear" w:color="auto" w:fill="FFFFFF"/>
+        <w:tabs>
+          <w:tab w:val="clear" w:pos="1440"/>
+        </w:tabs>
+        <w:spacing w:after="100" w:afterAutospacing="1" w:line="360" w:lineRule="atLeast"/>
+        <w:jc w:val="both"/>
+        <w:rPr>
+          <w:rFonts w:ascii="Open Sans" w:eastAsia="Times New Roman" w:hAnsi="Open Sans"/>
+          <w:sz w:val="24"/>
+          <w:szCs w:val="24"/>
+          <w:lang w:eastAsia="en-IN"/>
+        </w:rPr>
+      </w:pPr>
+      <w:proofErr w:type="spellStart"/>
+      <w:r>
+        <w:rPr>
+          <w:rFonts w:ascii="Open Sans" w:eastAsia="Times New Roman" w:hAnsi="Open Sans"/>
+          <w:sz w:val="24"/>
+          <w:szCs w:val="24"/>
+          <w:lang w:eastAsia="en-IN"/>
+        </w:rPr>
+        <w:t>Startup</w:t>
+      </w:r>
+      <w:proofErr w:type="spellEnd"/>
+      <w:r>
+        <w:rPr>
+          <w:rFonts w:ascii="Open Sans" w:eastAsia="Times New Roman" w:hAnsi="Open Sans"/>
+          <w:sz w:val="24"/>
+          <w:szCs w:val="24"/>
+          <w:lang w:eastAsia="en-IN"/>
+        </w:rPr>
+        <w:t xml:space="preserve"> India Registration </w:t>
+      </w:r>
+    </w:p>
+    <w:p>
+      <w:pPr>
+        <w:numPr>
+          <w:ilvl w:val="0"/>
+          <w:numId w:val="5"/>
+        </w:numPr>
+        <w:shd w:val="clear" w:color="auto" w:fill="FFFFFF"/>
+        <w:tabs>
+          <w:tab w:val="clear" w:pos="1440"/>
+        </w:tabs>
+        <w:spacing w:after="100" w:afterAutospacing="1" w:line="360" w:lineRule="atLeast"/>
+        <w:jc w:val="both"/>
+        <w:rPr>
+          <w:rFonts w:ascii="Open Sans" w:eastAsia="Times New Roman" w:hAnsi="Open Sans"/>
+          <w:sz w:val="24"/>
+          <w:szCs w:val="24"/>
+          <w:lang w:eastAsia="en-IN"/>
+        </w:rPr>
+      </w:pPr>
+      <w:r>
+        <w:rPr>
+          <w:rFonts w:ascii="Open Sans" w:eastAsia="Times New Roman" w:hAnsi="Open Sans"/>
+          <w:sz w:val="24"/>
+          <w:szCs w:val="24"/>
+          <w:lang w:eastAsia="en-IN"/>
+        </w:rPr>
+        <w:t>MSME/</w:t>
+      </w:r>
+      <w:proofErr w:type="spellStart"/>
+      <w:r>
+        <w:rPr>
+          <w:rFonts w:ascii="Open Sans" w:eastAsia="Times New Roman" w:hAnsi="Open Sans"/>
+          <w:sz w:val="24"/>
+          <w:szCs w:val="24"/>
+          <w:lang w:eastAsia="en-IN"/>
+        </w:rPr>
+        <w:t>Udyam</w:t>
+      </w:r>
+      <w:proofErr w:type="spellEnd"/>
+      <w:r>
+        <w:rPr>
+          <w:rFonts w:ascii="Open Sans" w:eastAsia="Times New Roman" w:hAnsi="Open Sans"/>
+          <w:sz w:val="24"/>
+          <w:szCs w:val="24"/>
+          <w:lang w:eastAsia="en-IN"/>
+        </w:rPr>
+        <w:t xml:space="preserve"> Registration </w:t>
+      </w:r>
+    </w:p>
+    <w:p>
+      <w:pPr>
+        <w:numPr>
+          <w:ilvl w:val="0"/>
+          <w:numId w:val="5"/>
+        </w:numPr>
+        <w:shd w:val="clear" w:color="auto" w:fill="FFFFFF"/>
+        <w:tabs>
+          <w:tab w:val="clear" w:pos="1440"/>
+        </w:tabs>
+        <w:spacing w:after="100" w:afterAutospacing="1" w:line="360" w:lineRule="atLeast"/>
+        <w:jc w:val="both"/>
+        <w:rPr>
+          <w:rFonts w:ascii="Open Sans" w:eastAsia="Times New Roman" w:hAnsi="Open Sans"/>
+          <w:sz w:val="24"/>
+          <w:szCs w:val="24"/>
+          <w:lang w:eastAsia="en-IN"/>
+        </w:rPr>
+      </w:pPr>
+      <w:r>
+        <w:rPr>
+          <w:rFonts w:ascii="Open Sans" w:eastAsia="Times New Roman" w:hAnsi="Open Sans"/>
+          <w:sz w:val="24"/>
+          <w:szCs w:val="24"/>
+          <w:lang w:eastAsia="en-IN"/>
+        </w:rPr>
+        <w:t xml:space="preserve">PF Registration </w:t>
+      </w:r>
+    </w:p>
+    <w:p>
+      <w:pPr>
+        <w:numPr>
+          <w:ilvl w:val="0"/>
+          <w:numId w:val="5"/>
+        </w:numPr>
+        <w:shd w:val="clear" w:color="auto" w:fill="FFFFFF"/>
+        <w:tabs>
+          <w:tab w:val="clear" w:pos="1440"/>
+        </w:tabs>
+        <w:spacing w:after="100" w:afterAutospacing="1" w:line="360" w:lineRule="atLeast"/>
+        <w:jc w:val="both"/>
+        <w:rPr>
+          <w:rFonts w:ascii="Open Sans" w:eastAsia="Times New Roman" w:hAnsi="Open Sans"/>
+          <w:sz w:val="24"/>
+          <w:szCs w:val="24"/>
+          <w:lang w:eastAsia="en-IN"/>
+        </w:rPr>
+      </w:pPr>
+      <w:r>
+        <w:rPr>
+          <w:rFonts w:ascii="Open Sans" w:eastAsia="Times New Roman" w:hAnsi="Open Sans"/>
+          <w:sz w:val="24"/>
+          <w:szCs w:val="24"/>
+          <w:lang w:eastAsia="en-IN"/>
+        </w:rPr>
+        <w:t xml:space="preserve">ESIC Registration </w:t>
+      </w:r>
+    </w:p>
+    <w:p>
+      <w:pPr>
+        <w:numPr>
+          <w:ilvl w:val="0"/>
+          <w:numId w:val="5"/>
+        </w:numPr>
+        <w:shd w:val="clear" w:color="auto" w:fill="FFFFFF"/>
+        <w:tabs>
+          <w:tab w:val="clear" w:pos="1440"/>
+        </w:tabs>
+        <w:spacing w:after="100" w:afterAutospacing="1" w:line="360" w:lineRule="atLeast"/>
+        <w:jc w:val="both"/>
+        <w:rPr>
+          <w:rFonts w:ascii="Open Sans" w:eastAsia="Times New Roman" w:hAnsi="Open Sans"/>
+          <w:sz w:val="24"/>
+          <w:szCs w:val="24"/>
+          <w:lang w:eastAsia="en-IN"/>
+        </w:rPr>
+      </w:pPr>
+      <w:r>
+        <w:rPr>
+          <w:rFonts w:ascii="Open Sans" w:eastAsia="Times New Roman" w:hAnsi="Open Sans"/>
+          <w:sz w:val="24"/>
+          <w:szCs w:val="24"/>
+          <w:lang w:eastAsia="en-IN"/>
+        </w:rPr>
+        <w:t xml:space="preserve">Trade License </w:t>
+      </w:r>
+    </w:p>
+    <w:p>
+      <w:pPr>
+        <w:numPr>
+          <w:ilvl w:val="0"/>
+          <w:numId w:val="5"/>
+        </w:numPr>
+        <w:shd w:val="clear" w:color="auto" w:fill="FFFFFF"/>
+        <w:tabs>
+          <w:tab w:val="clear" w:pos="1440"/>
+        </w:tabs>
+        <w:spacing w:after="100" w:afterAutospacing="1" w:line="360" w:lineRule="atLeast"/>
+        <w:jc w:val="both"/>
+        <w:rPr>
+          <w:rFonts w:ascii="Open Sans" w:eastAsia="Times New Roman" w:hAnsi="Open Sans"/>
+          <w:sz w:val="24"/>
+          <w:szCs w:val="24"/>
+          <w:lang w:eastAsia="en-IN"/>
+        </w:rPr>
+      </w:pPr>
+      <w:r>
+        <w:rPr>
+          <w:rFonts w:ascii="Open Sans" w:eastAsia="Times New Roman" w:hAnsi="Open Sans"/>
+          <w:sz w:val="24"/>
+          <w:szCs w:val="24"/>
+          <w:lang w:eastAsia="en-IN"/>
+        </w:rPr>
+        <w:t xml:space="preserve">NGO Darpan Registration </w:t>
+      </w:r>
+    </w:p>
+    <w:p>
+      <w:pPr>
+        <w:numPr>
+          <w:ilvl w:val="0"/>
+          <w:numId w:val="5"/>
+        </w:numPr>
+        <w:shd w:val="clear" w:color="auto" w:fill="FFFFFF"/>
+        <w:tabs>
+          <w:tab w:val="clear" w:pos="1440"/>
+        </w:tabs>
+        <w:spacing w:after="100" w:afterAutospacing="1" w:line="360" w:lineRule="atLeast"/>
+        <w:jc w:val="both"/>
+        <w:rPr>
+          <w:rFonts w:ascii="Open Sans" w:eastAsia="Times New Roman" w:hAnsi="Open Sans"/>
+          <w:sz w:val="24"/>
+          <w:szCs w:val="24"/>
+          <w:lang w:eastAsia="en-IN"/>
+        </w:rPr>
+      </w:pPr>
+      <w:r>
+        <w:rPr>
+          <w:rFonts w:ascii="Open Sans" w:eastAsia="Times New Roman" w:hAnsi="Open Sans"/>
+          <w:sz w:val="24"/>
+          <w:szCs w:val="24"/>
+          <w:lang w:eastAsia="en-IN"/>
+        </w:rPr>
+        <w:t>Trademark Registration</w:t>
+      </w:r>
+    </w:p>
+    <w:p>
+      <w:pPr>
+        <w:numPr>
+          <w:ilvl w:val="0"/>
+          <w:numId w:val="5"/>
+        </w:numPr>
+        <w:shd w:val="clear" w:color="auto" w:fill="FFFFFF"/>
+        <w:tabs>
+          <w:tab w:val="clear" w:pos="1440"/>
+        </w:tabs>
+        <w:spacing w:after="100" w:afterAutospacing="1" w:line="360" w:lineRule="atLeast"/>
+        <w:jc w:val="both"/>
+        <w:rPr>
+          <w:rFonts w:ascii="Open Sans" w:eastAsia="Times New Roman" w:hAnsi="Open Sans"/>
+          <w:sz w:val="24"/>
+          <w:szCs w:val="24"/>
+          <w:lang w:eastAsia="en-IN"/>
+        </w:rPr>
+      </w:pPr>
+      <w:r>
+        <w:rPr>
+          <w:rFonts w:ascii="Open Sans" w:eastAsia="Times New Roman" w:hAnsi="Open Sans"/>
+          <w:sz w:val="24"/>
+          <w:szCs w:val="24"/>
+          <w:lang w:eastAsia="en-IN"/>
+        </w:rPr>
+        <w:t xml:space="preserve">Import Export Code (IEC) </w:t>
+      </w:r>
+    </w:p>
+    <w:p>
+      <w:pPr>
+        <w:numPr>
+          <w:ilvl w:val="0"/>
+          <w:numId w:val="5"/>
+        </w:numPr>
+        <w:shd w:val="clear" w:color="auto" w:fill="FFFFFF"/>
+        <w:tabs>
+          <w:tab w:val="clear" w:pos="1440"/>
+        </w:tabs>
+        <w:spacing w:after="100" w:afterAutospacing="1" w:line="360" w:lineRule="atLeast"/>
+        <w:jc w:val="both"/>
+        <w:rPr>
+          <w:rFonts w:ascii="Open Sans" w:eastAsia="Times New Roman" w:hAnsi="Open Sans"/>
+          <w:sz w:val="24"/>
+          <w:szCs w:val="24"/>
+          <w:lang w:eastAsia="en-IN"/>
+        </w:rPr>
+      </w:pPr>
+      <w:r>
+        <w:rPr>
+          <w:rFonts w:ascii="Open Sans" w:eastAsia="Times New Roman" w:hAnsi="Open Sans"/>
+          <w:sz w:val="24"/>
+          <w:szCs w:val="24"/>
+          <w:lang w:eastAsia="en-IN"/>
+        </w:rPr>
+        <w:t xml:space="preserve">ISO Certification </w:t>
+      </w:r>
+    </w:p>
+    <w:p>
+      <w:pPr>
+        <w:numPr>
+          <w:ilvl w:val="0"/>
+          <w:numId w:val="5"/>
+        </w:numPr>
+        <w:shd w:val="clear" w:color="auto" w:fill="FFFFFF"/>
+        <w:tabs>
+          <w:tab w:val="clear" w:pos="1440"/>
+        </w:tabs>
+        <w:spacing w:after="100" w:afterAutospacing="1" w:line="360" w:lineRule="atLeast"/>
+        <w:jc w:val="both"/>
+        <w:rPr>
+          <w:rFonts w:ascii="Open Sans" w:eastAsia="Times New Roman" w:hAnsi="Open Sans"/>
+          <w:sz w:val="24"/>
+          <w:szCs w:val="24"/>
+          <w:lang w:eastAsia="en-IN"/>
+        </w:rPr>
+      </w:pPr>
+      <w:r>
+        <w:rPr>
+          <w:rFonts w:ascii="Open Sans" w:eastAsia="Times New Roman" w:hAnsi="Open Sans"/>
+          <w:sz w:val="24"/>
+          <w:szCs w:val="24"/>
+          <w:lang w:eastAsia="en-IN"/>
+        </w:rPr>
+        <w:t xml:space="preserve">FSSAI Registration </w:t>
+      </w:r>
+    </w:p>
+    <w:bookmarkEnd w:id="5"/>
+    <w:p>
+      <w:pPr>
         <w:rPr>
           <w:b/>
           <w:bCs/>
           <w:sz w:val="32"/>
           <w:szCs w:val="32"/>
         </w:rPr>
-        <w:t xml:space="preserve"> Registrations.</w:t>
-      </w:r>
-    </w:p>
-    <w:p>
-      <w:pPr>
-        <w:numPr>
-          <w:ilvl w:val="0"/>
-          <w:numId w:val="5"/>
-        </w:numPr>
-        <w:shd w:val="clear" w:color="auto" w:fill="FFFFFF"/>
-        <w:tabs>
-          <w:tab w:val="clear" w:pos="1440"/>
-        </w:tabs>
-        <w:spacing w:after="100" w:afterAutospacing="1" w:line="360" w:lineRule="atLeast"/>
-        <w:jc w:val="both"/>
-        <w:rPr>
-          <w:rFonts w:ascii="Open Sans" w:eastAsia="Times New Roman" w:hAnsi="Open Sans"/>
-          <w:sz w:val="24"/>
-          <w:szCs w:val="24"/>
-          <w:lang w:eastAsia="en-IN"/>
-        </w:rPr>
-      </w:pPr>
-      <w:r>
-        <w:rPr>
-          <w:rFonts w:ascii="Open Sans" w:eastAsia="Times New Roman" w:hAnsi="Open Sans"/>
-          <w:sz w:val="24"/>
-          <w:szCs w:val="24"/>
-          <w:lang w:eastAsia="en-IN"/>
-        </w:rPr>
-        <w:t xml:space="preserve">Professional Tax Registration &amp; Returns </w:t>
-      </w:r>
-    </w:p>
-    <w:p>
-      <w:pPr>
-        <w:numPr>
-          <w:ilvl w:val="0"/>
-          <w:numId w:val="5"/>
-        </w:numPr>
-        <w:shd w:val="clear" w:color="auto" w:fill="FFFFFF"/>
-        <w:tabs>
-          <w:tab w:val="clear" w:pos="1440"/>
-        </w:tabs>
-        <w:spacing w:after="100" w:afterAutospacing="1" w:line="360" w:lineRule="atLeast"/>
-        <w:jc w:val="both"/>
-        <w:rPr>
-          <w:rFonts w:ascii="Open Sans" w:eastAsia="Times New Roman" w:hAnsi="Open Sans"/>
-          <w:sz w:val="24"/>
-          <w:szCs w:val="24"/>
-          <w:lang w:eastAsia="en-IN"/>
-        </w:rPr>
-      </w:pPr>
-      <w:bookmarkStart w:id="5" w:name="_Hlk231890581"/>
-      <w:r>
-        <w:rPr>
-          <w:rFonts w:ascii="Open Sans" w:eastAsia="Times New Roman" w:hAnsi="Open Sans"/>
-          <w:sz w:val="24"/>
-          <w:szCs w:val="24"/>
-          <w:lang w:eastAsia="en-IN"/>
-        </w:rPr>
-        <w:t xml:space="preserve">Shop &amp; Establishment Registration </w:t>
-      </w:r>
-    </w:p>
-    <w:p>
-      <w:pPr>
-        <w:numPr>
-          <w:ilvl w:val="0"/>
-          <w:numId w:val="5"/>
-        </w:numPr>
-        <w:shd w:val="clear" w:color="auto" w:fill="FFFFFF"/>
-        <w:tabs>
-          <w:tab w:val="clear" w:pos="1440"/>
-        </w:tabs>
-        <w:spacing w:after="100" w:afterAutospacing="1" w:line="360" w:lineRule="atLeast"/>
-        <w:jc w:val="both"/>
-        <w:rPr>
-          <w:rFonts w:ascii="Open Sans" w:eastAsia="Times New Roman" w:hAnsi="Open Sans"/>
-          <w:sz w:val="24"/>
-          <w:szCs w:val="24"/>
-          <w:lang w:eastAsia="en-IN"/>
-        </w:rPr>
-      </w:pPr>
-      <w:proofErr w:type="spellStart"/>
-      <w:r>
-        <w:rPr>
-          <w:rFonts w:ascii="Open Sans" w:eastAsia="Times New Roman" w:hAnsi="Open Sans"/>
-          <w:sz w:val="24"/>
-          <w:szCs w:val="24"/>
-          <w:lang w:eastAsia="en-IN"/>
-        </w:rPr>
-        <w:t>Startup</w:t>
-      </w:r>
-      <w:proofErr w:type="spellEnd"/>
-      <w:r>
-        <w:rPr>
-          <w:rFonts w:ascii="Open Sans" w:eastAsia="Times New Roman" w:hAnsi="Open Sans"/>
-          <w:sz w:val="24"/>
-          <w:szCs w:val="24"/>
-          <w:lang w:eastAsia="en-IN"/>
-        </w:rPr>
-        <w:t xml:space="preserve"> India Registration </w:t>
-      </w:r>
-    </w:p>
-    <w:p>
-      <w:pPr>
-        <w:numPr>
-          <w:ilvl w:val="0"/>
-          <w:numId w:val="5"/>
-        </w:numPr>
-        <w:shd w:val="clear" w:color="auto" w:fill="FFFFFF"/>
-        <w:tabs>
-          <w:tab w:val="clear" w:pos="1440"/>
-        </w:tabs>
-        <w:spacing w:after="100" w:afterAutospacing="1" w:line="360" w:lineRule="atLeast"/>
-        <w:jc w:val="both"/>
-        <w:rPr>
-          <w:rFonts w:ascii="Open Sans" w:eastAsia="Times New Roman" w:hAnsi="Open Sans"/>
-          <w:sz w:val="24"/>
-          <w:szCs w:val="24"/>
-          <w:lang w:eastAsia="en-IN"/>
-        </w:rPr>
-      </w:pPr>
-      <w:r>
-        <w:rPr>
-          <w:rFonts w:ascii="Open Sans" w:eastAsia="Times New Roman" w:hAnsi="Open Sans"/>
-          <w:sz w:val="24"/>
-          <w:szCs w:val="24"/>
-          <w:lang w:eastAsia="en-IN"/>
-        </w:rPr>
-        <w:t>MSME/</w:t>
-      </w:r>
-      <w:proofErr w:type="spellStart"/>
-      <w:r>
-        <w:rPr>
-          <w:rFonts w:ascii="Open Sans" w:eastAsia="Times New Roman" w:hAnsi="Open Sans"/>
-          <w:sz w:val="24"/>
-          <w:szCs w:val="24"/>
-          <w:lang w:eastAsia="en-IN"/>
-        </w:rPr>
-        <w:t>Udyam</w:t>
-      </w:r>
-      <w:proofErr w:type="spellEnd"/>
-      <w:r>
-        <w:rPr>
-          <w:rFonts w:ascii="Open Sans" w:eastAsia="Times New Roman" w:hAnsi="Open Sans"/>
-          <w:sz w:val="24"/>
-          <w:szCs w:val="24"/>
-          <w:lang w:eastAsia="en-IN"/>
-        </w:rPr>
-        <w:t xml:space="preserve"> Registration </w:t>
-      </w:r>
-    </w:p>
-    <w:p>
-      <w:pPr>
-        <w:numPr>
-          <w:ilvl w:val="0"/>
-          <w:numId w:val="5"/>
-        </w:numPr>
-        <w:shd w:val="clear" w:color="auto" w:fill="FFFFFF"/>
-        <w:tabs>
-          <w:tab w:val="clear" w:pos="1440"/>
-        </w:tabs>
-        <w:spacing w:after="100" w:afterAutospacing="1" w:line="360" w:lineRule="atLeast"/>
-        <w:jc w:val="both"/>
-        <w:rPr>
-          <w:rFonts w:ascii="Open Sans" w:eastAsia="Times New Roman" w:hAnsi="Open Sans"/>
-          <w:sz w:val="24"/>
-          <w:szCs w:val="24"/>
-          <w:lang w:eastAsia="en-IN"/>
-        </w:rPr>
-      </w:pPr>
-      <w:r>
-        <w:rPr>
-          <w:rFonts w:ascii="Open Sans" w:eastAsia="Times New Roman" w:hAnsi="Open Sans"/>
-          <w:sz w:val="24"/>
-          <w:szCs w:val="24"/>
-          <w:lang w:eastAsia="en-IN"/>
-        </w:rPr>
-        <w:t xml:space="preserve">PF Registration </w:t>
-      </w:r>
-    </w:p>
-    <w:p>
-      <w:pPr>
-        <w:numPr>
-          <w:ilvl w:val="0"/>
-          <w:numId w:val="5"/>
-        </w:numPr>
-        <w:shd w:val="clear" w:color="auto" w:fill="FFFFFF"/>
-        <w:tabs>
-          <w:tab w:val="clear" w:pos="1440"/>
-        </w:tabs>
-        <w:spacing w:after="100" w:afterAutospacing="1" w:line="360" w:lineRule="atLeast"/>
-        <w:jc w:val="both"/>
-        <w:rPr>
-          <w:rFonts w:ascii="Open Sans" w:eastAsia="Times New Roman" w:hAnsi="Open Sans"/>
-          <w:sz w:val="24"/>
-          <w:szCs w:val="24"/>
-          <w:lang w:eastAsia="en-IN"/>
-        </w:rPr>
-      </w:pPr>
-      <w:r>
-        <w:rPr>
-          <w:rFonts w:ascii="Open Sans" w:eastAsia="Times New Roman" w:hAnsi="Open Sans"/>
-          <w:sz w:val="24"/>
-          <w:szCs w:val="24"/>
-          <w:lang w:eastAsia="en-IN"/>
-        </w:rPr>
-        <w:t xml:space="preserve">ESIC Registration </w:t>
-      </w:r>
-    </w:p>
-    <w:p>
-      <w:pPr>
-        <w:numPr>
-          <w:ilvl w:val="0"/>
-          <w:numId w:val="5"/>
-        </w:numPr>
-        <w:shd w:val="clear" w:color="auto" w:fill="FFFFFF"/>
-        <w:tabs>
-          <w:tab w:val="clear" w:pos="1440"/>
-        </w:tabs>
-        <w:spacing w:after="100" w:afterAutospacing="1" w:line="360" w:lineRule="atLeast"/>
-        <w:jc w:val="both"/>
-        <w:rPr>
-          <w:rFonts w:ascii="Open Sans" w:eastAsia="Times New Roman" w:hAnsi="Open Sans"/>
-          <w:sz w:val="24"/>
-          <w:szCs w:val="24"/>
-          <w:lang w:eastAsia="en-IN"/>
-        </w:rPr>
-      </w:pPr>
-      <w:r>
-        <w:rPr>
-          <w:rFonts w:ascii="Open Sans" w:eastAsia="Times New Roman" w:hAnsi="Open Sans"/>
-          <w:sz w:val="24"/>
-          <w:szCs w:val="24"/>
-          <w:lang w:eastAsia="en-IN"/>
-        </w:rPr>
-        <w:t xml:space="preserve">Trade License </w:t>
-      </w:r>
-    </w:p>
-    <w:p>
-      <w:pPr>
-        <w:numPr>
-          <w:ilvl w:val="0"/>
-          <w:numId w:val="5"/>
-        </w:numPr>
-        <w:shd w:val="clear" w:color="auto" w:fill="FFFFFF"/>
-        <w:tabs>
-          <w:tab w:val="clear" w:pos="1440"/>
-        </w:tabs>
-        <w:spacing w:after="100" w:afterAutospacing="1" w:line="360" w:lineRule="atLeast"/>
-        <w:jc w:val="both"/>
-        <w:rPr>
-          <w:rFonts w:ascii="Open Sans" w:eastAsia="Times New Roman" w:hAnsi="Open Sans"/>
-          <w:sz w:val="24"/>
-          <w:szCs w:val="24"/>
-          <w:lang w:eastAsia="en-IN"/>
-        </w:rPr>
-      </w:pPr>
-      <w:r>
-        <w:rPr>
-          <w:rFonts w:ascii="Open Sans" w:eastAsia="Times New Roman" w:hAnsi="Open Sans"/>
-          <w:sz w:val="24"/>
-          <w:szCs w:val="24"/>
-          <w:lang w:eastAsia="en-IN"/>
-        </w:rPr>
-        <w:t xml:space="preserve">NGO Darpan Registration </w:t>
-      </w:r>
-    </w:p>
-    <w:p>
-      <w:pPr>
-        <w:numPr>
-          <w:ilvl w:val="0"/>
-          <w:numId w:val="5"/>
-        </w:numPr>
-        <w:shd w:val="clear" w:color="auto" w:fill="FFFFFF"/>
-        <w:tabs>
-          <w:tab w:val="clear" w:pos="1440"/>
-        </w:tabs>
-        <w:spacing w:after="100" w:afterAutospacing="1" w:line="360" w:lineRule="atLeast"/>
-        <w:jc w:val="both"/>
-        <w:rPr>
-          <w:rFonts w:ascii="Open Sans" w:eastAsia="Times New Roman" w:hAnsi="Open Sans"/>
-          <w:sz w:val="24"/>
-          <w:szCs w:val="24"/>
-          <w:lang w:eastAsia="en-IN"/>
-        </w:rPr>
-      </w:pPr>
-      <w:r>
-        <w:rPr>
-          <w:rFonts w:ascii="Open Sans" w:eastAsia="Times New Roman" w:hAnsi="Open Sans"/>
-          <w:sz w:val="24"/>
-          <w:szCs w:val="24"/>
-          <w:lang w:eastAsia="en-IN"/>
-        </w:rPr>
-        <w:t>Trademark Registration</w:t>
-      </w:r>
-    </w:p>
-    <w:p>
-      <w:pPr>
-        <w:numPr>
-          <w:ilvl w:val="0"/>
-          <w:numId w:val="5"/>
-        </w:numPr>
-        <w:shd w:val="clear" w:color="auto" w:fill="FFFFFF"/>
-        <w:tabs>
-          <w:tab w:val="clear" w:pos="1440"/>
-        </w:tabs>
-        <w:spacing w:after="100" w:afterAutospacing="1" w:line="360" w:lineRule="atLeast"/>
-        <w:jc w:val="both"/>
-        <w:rPr>
-          <w:rFonts w:ascii="Open Sans" w:eastAsia="Times New Roman" w:hAnsi="Open Sans"/>
-          <w:sz w:val="24"/>
-          <w:szCs w:val="24"/>
-          <w:lang w:eastAsia="en-IN"/>
-        </w:rPr>
-      </w:pPr>
-      <w:r>
-        <w:rPr>
-          <w:rFonts w:ascii="Open Sans" w:eastAsia="Times New Roman" w:hAnsi="Open Sans"/>
-          <w:sz w:val="24"/>
-          <w:szCs w:val="24"/>
-          <w:lang w:eastAsia="en-IN"/>
-        </w:rPr>
-        <w:t xml:space="preserve">Import Export Code (IEC) </w:t>
-      </w:r>
-    </w:p>
-    <w:p>
-      <w:pPr>
-        <w:numPr>
-          <w:ilvl w:val="0"/>
-          <w:numId w:val="5"/>
-        </w:numPr>
-        <w:shd w:val="clear" w:color="auto" w:fill="FFFFFF"/>
-        <w:tabs>
-          <w:tab w:val="clear" w:pos="1440"/>
-        </w:tabs>
-        <w:spacing w:after="100" w:afterAutospacing="1" w:line="360" w:lineRule="atLeast"/>
-        <w:jc w:val="both"/>
-        <w:rPr>
-          <w:rFonts w:ascii="Open Sans" w:eastAsia="Times New Roman" w:hAnsi="Open Sans"/>
-          <w:sz w:val="24"/>
-          <w:szCs w:val="24"/>
-          <w:lang w:eastAsia="en-IN"/>
-        </w:rPr>
-      </w:pPr>
-      <w:r>
-        <w:rPr>
-          <w:rFonts w:ascii="Open Sans" w:eastAsia="Times New Roman" w:hAnsi="Open Sans"/>
-          <w:sz w:val="24"/>
-          <w:szCs w:val="24"/>
-          <w:lang w:eastAsia="en-IN"/>
-        </w:rPr>
-        <w:t xml:space="preserve">ISO Certification </w:t>
-      </w:r>
-    </w:p>
-    <w:p>
-      <w:pPr>
-        <w:numPr>
-          <w:ilvl w:val="0"/>
-          <w:numId w:val="5"/>
-        </w:numPr>
-        <w:shd w:val="clear" w:color="auto" w:fill="FFFFFF"/>
-        <w:tabs>
-          <w:tab w:val="clear" w:pos="1440"/>
-        </w:tabs>
-        <w:spacing w:after="100" w:afterAutospacing="1" w:line="360" w:lineRule="atLeast"/>
-        <w:jc w:val="both"/>
-        <w:rPr>
-          <w:rFonts w:ascii="Open Sans" w:eastAsia="Times New Roman" w:hAnsi="Open Sans"/>
-          <w:sz w:val="24"/>
-          <w:szCs w:val="24"/>
-          <w:lang w:eastAsia="en-IN"/>
-        </w:rPr>
-      </w:pPr>
-      <w:r>
-        <w:rPr>
-          <w:rFonts w:ascii="Open Sans" w:eastAsia="Times New Roman" w:hAnsi="Open Sans"/>
-          <w:sz w:val="24"/>
-          <w:szCs w:val="24"/>
-          <w:lang w:eastAsia="en-IN"/>
-        </w:rPr>
-        <w:t xml:space="preserve">FSSAI Registration </w:t>
-      </w:r>
-    </w:p>
-    <w:bookmarkEnd w:id="5"/>
-    <w:p>
-      <w:pPr>
+      </w:pPr>
+      <w:r>
         <w:rPr>
           <w:b/>
           <w:bCs/>
           <w:sz w:val="32"/>
           <w:szCs w:val="32"/>
         </w:rPr>
-      </w:pPr>
-      <w:r>
-        <w:rPr>
-          <w:b/>
-          <w:bCs/>
-          <w:sz w:val="32"/>
-          <w:szCs w:val="32"/>
-        </w:rPr>
+        <w:lastRenderedPageBreak/>
         <w:t>Litigation Support</w:t>
       </w:r>
     </w:p>
@@ -4085,6 +4348,156 @@
     </w:lvl>
   </w:abstractNum>
   <w:abstractNum w:abstractNumId="8" w15:restartNumberingAfterBreak="0">
+    <w:nsid w:val="2462742F"/>
+    <w:multiLevelType w:val="multilevel"/>
+    <w:tmpl w:val="1F8E10B2"/>
+    <w:lvl w:ilvl="0">
+      <w:start w:val="1"/>
+      <w:numFmt w:val="bullet"/>
+      <w:lvlText w:val=""/>
+      <w:lvlJc w:val="left"/>
+      <w:pPr>
+        <w:tabs>
+          <w:tab w:val="num" w:pos="1440"/>
+        </w:tabs>
+        <w:ind w:left="1440" w:hanging="360"/>
+      </w:pPr>
+      <w:rPr>
+        <w:rFonts w:ascii="Symbol" w:hAnsi="Symbol" w:hint="default"/>
+        <w:sz w:val="20"/>
+      </w:rPr>
+    </w:lvl>
+    <w:lvl w:ilvl="1">
+      <w:start w:val="1"/>
+      <w:numFmt w:val="bullet"/>
+      <w:lvlText w:val="o"/>
+      <w:lvlJc w:val="left"/>
+      <w:pPr>
+        <w:tabs>
+          <w:tab w:val="num" w:pos="2160"/>
+        </w:tabs>
+        <w:ind w:left="2160" w:hanging="360"/>
+      </w:pPr>
+      <w:rPr>
+        <w:rFonts w:ascii="Courier New" w:hAnsi="Courier New" w:hint="default"/>
+        <w:color w:val="000000" w:themeColor="text1"/>
+        <w:sz w:val="20"/>
+      </w:rPr>
+    </w:lvl>
+    <w:lvl w:ilvl="2" w:tentative="1">
+      <w:start w:val="1"/>
+      <w:numFmt w:val="bullet"/>
+      <w:lvlText w:val=""/>
+      <w:lvlJc w:val="left"/>
+      <w:pPr>
+        <w:tabs>
+          <w:tab w:val="num" w:pos="2880"/>
+        </w:tabs>
+        <w:ind w:left="2880" w:hanging="360"/>
+      </w:pPr>
+      <w:rPr>
+        <w:rFonts w:ascii="Wingdings" w:hAnsi="Wingdings" w:hint="default"/>
+        <w:sz w:val="20"/>
+      </w:rPr>
+    </w:lvl>
+    <w:lvl w:ilvl="3" w:tentative="1">
+      <w:start w:val="1"/>
+      <w:numFmt w:val="bullet"/>
+      <w:lvlText w:val=""/>
+      <w:lvlJc w:val="left"/>
+      <w:pPr>
+        <w:tabs>
+          <w:tab w:val="num" w:pos="3600"/>
+        </w:tabs>
+        <w:ind w:left="3600" w:hanging="360"/>
+      </w:pPr>
+      <w:rPr>
+        <w:rFonts w:ascii="Wingdings" w:hAnsi="Wingdings" w:hint="default"/>
+        <w:sz w:val="20"/>
+      </w:rPr>
+    </w:lvl>
+    <w:lvl w:ilvl="4" w:tentative="1">
+      <w:start w:val="1"/>
+      <w:numFmt w:val="bullet"/>
+      <w:lvlText w:val=""/>
+      <w:lvlJc w:val="left"/>
+      <w:pPr>
+        <w:tabs>
+          <w:tab w:val="num" w:pos="4320"/>
+        </w:tabs>
+        <w:ind w:left="4320" w:hanging="360"/>
+      </w:pPr>
+      <w:rPr>
+        <w:rFonts w:ascii="Wingdings" w:hAnsi="Wingdings" w:hint="default"/>
+        <w:sz w:val="20"/>
+      </w:rPr>
+    </w:lvl>
+    <w:lvl w:ilvl="5" w:tentative="1">
+      <w:start w:val="1"/>
+      <w:numFmt w:val="bullet"/>
+      <w:lvlText w:val=""/>
+      <w:lvlJc w:val="left"/>
+      <w:pPr>
+        <w:tabs>
+          <w:tab w:val="num" w:pos="5040"/>
+        </w:tabs>
+        <w:ind w:left="5040" w:hanging="360"/>
+      </w:pPr>
+      <w:rPr>
+        <w:rFonts w:ascii="Wingdings" w:hAnsi="Wingdings" w:hint="default"/>
+        <w:sz w:val="20"/>
+      </w:rPr>
+    </w:lvl>
+    <w:lvl w:ilvl="6" w:tentative="1">
+      <w:start w:val="1"/>
+      <w:numFmt w:val="bullet"/>
+      <w:lvlText w:val=""/>
+      <w:lvlJc w:val="left"/>
+      <w:pPr>
+        <w:tabs>
+          <w:tab w:val="num" w:pos="5760"/>
+        </w:tabs>
+        <w:ind w:left="5760" w:hanging="360"/>
+      </w:pPr>
+      <w:rPr>
+        <w:rFonts w:ascii="Wingdings" w:hAnsi="Wingdings" w:hint="default"/>
+        <w:sz w:val="20"/>
+      </w:rPr>
+    </w:lvl>
+    <w:lvl w:ilvl="7" w:tentative="1">
+      <w:start w:val="1"/>
+      <w:numFmt w:val="bullet"/>
+      <w:lvlText w:val=""/>
+      <w:lvlJc w:val="left"/>
+      <w:pPr>
+        <w:tabs>
+          <w:tab w:val="num" w:pos="6480"/>
+        </w:tabs>
+        <w:ind w:left="6480" w:hanging="360"/>
+      </w:pPr>
+      <w:rPr>
+        <w:rFonts w:ascii="Wingdings" w:hAnsi="Wingdings" w:hint="default"/>
+        <w:sz w:val="20"/>
+      </w:rPr>
+    </w:lvl>
+    <w:lvl w:ilvl="8" w:tentative="1">
+      <w:start w:val="1"/>
+      <w:numFmt w:val="bullet"/>
+      <w:lvlText w:val=""/>
+      <w:lvlJc w:val="left"/>
+      <w:pPr>
+        <w:tabs>
+          <w:tab w:val="num" w:pos="7200"/>
+        </w:tabs>
+        <w:ind w:left="7200" w:hanging="360"/>
+      </w:pPr>
+      <w:rPr>
+        <w:rFonts w:ascii="Wingdings" w:hAnsi="Wingdings" w:hint="default"/>
+        <w:sz w:val="20"/>
+      </w:rPr>
+    </w:lvl>
+  </w:abstractNum>
+  <w:abstractNum w:abstractNumId="9" w15:restartNumberingAfterBreak="0">
     <w:nsid w:val="26554AB4"/>
     <w:multiLevelType w:val="multilevel"/>
     <w:tmpl w:val="65EC6AD0"/>
@@ -4233,7 +4646,7 @@
       </w:rPr>
     </w:lvl>
   </w:abstractNum>
-  <w:abstractNum w:abstractNumId="9" w15:restartNumberingAfterBreak="0">
+  <w:abstractNum w:abstractNumId="10" w15:restartNumberingAfterBreak="0">
     <w:nsid w:val="313D21B1"/>
     <w:multiLevelType w:val="multilevel"/>
     <w:tmpl w:val="865C13C2"/>
@@ -4382,7 +4795,7 @@
       </w:rPr>
     </w:lvl>
   </w:abstractNum>
-  <w:abstractNum w:abstractNumId="10" w15:restartNumberingAfterBreak="0">
+  <w:abstractNum w:abstractNumId="11" w15:restartNumberingAfterBreak="0">
     <w:nsid w:val="37B5659B"/>
     <w:multiLevelType w:val="multilevel"/>
     <w:tmpl w:val="65DAB6F8"/>
@@ -4532,7 +4945,7 @@
       </w:rPr>
     </w:lvl>
   </w:abstractNum>
-  <w:abstractNum w:abstractNumId="11" w15:restartNumberingAfterBreak="0">
+  <w:abstractNum w:abstractNumId="12" w15:restartNumberingAfterBreak="0">
     <w:nsid w:val="3D38484D"/>
     <w:multiLevelType w:val="multilevel"/>
     <w:tmpl w:val="0374F71C"/>
@@ -4681,7 +5094,7 @@
       </w:rPr>
     </w:lvl>
   </w:abstractNum>
-  <w:abstractNum w:abstractNumId="12" w15:restartNumberingAfterBreak="0">
+  <w:abstractNum w:abstractNumId="13" w15:restartNumberingAfterBreak="0">
     <w:nsid w:val="48BA4E6D"/>
     <w:multiLevelType w:val="multilevel"/>
     <w:tmpl w:val="CFBE6320"/>
@@ -4830,7 +5243,7 @@
       </w:rPr>
     </w:lvl>
   </w:abstractNum>
-  <w:abstractNum w:abstractNumId="13" w15:restartNumberingAfterBreak="0">
+  <w:abstractNum w:abstractNumId="14" w15:restartNumberingAfterBreak="0">
     <w:nsid w:val="4ACD6291"/>
     <w:multiLevelType w:val="multilevel"/>
     <w:tmpl w:val="47FC0C54"/>
@@ -4980,7 +5393,7 @@
       </w:rPr>
     </w:lvl>
   </w:abstractNum>
-  <w:abstractNum w:abstractNumId="14" w15:restartNumberingAfterBreak="0">
+  <w:abstractNum w:abstractNumId="15" w15:restartNumberingAfterBreak="0">
     <w:nsid w:val="535B00D3"/>
     <w:multiLevelType w:val="multilevel"/>
     <w:tmpl w:val="BF1419E8"/>
@@ -5129,7 +5542,120 @@
       </w:rPr>
     </w:lvl>
   </w:abstractNum>
-  <w:abstractNum w:abstractNumId="15" w15:restartNumberingAfterBreak="0">
+  <w:abstractNum w:abstractNumId="16" w15:restartNumberingAfterBreak="0">
+    <w:nsid w:val="551C5822"/>
+    <w:multiLevelType w:val="hybridMultilevel"/>
+    <w:tmpl w:val="9822F4E0"/>
+    <w:lvl w:ilvl="0" w:tplc="40090001">
+      <w:start w:val="1"/>
+      <w:numFmt w:val="bullet"/>
+      <w:lvlText w:val=""/>
+      <w:lvlJc w:val="left"/>
+      <w:pPr>
+        <w:ind w:left="720" w:hanging="360"/>
+      </w:pPr>
+      <w:rPr>
+        <w:rFonts w:ascii="Symbol" w:hAnsi="Symbol" w:hint="default"/>
+      </w:rPr>
+    </w:lvl>
+    <w:lvl w:ilvl="1" w:tplc="40090003">
+      <w:start w:val="1"/>
+      <w:numFmt w:val="bullet"/>
+      <w:lvlText w:val="o"/>
+      <w:lvlJc w:val="left"/>
+      <w:pPr>
+        <w:ind w:left="1440" w:hanging="360"/>
+      </w:pPr>
+      <w:rPr>
+        <w:rFonts w:ascii="Courier New" w:hAnsi="Courier New" w:cs="Courier New" w:hint="default"/>
+      </w:rPr>
+    </w:lvl>
+    <w:lvl w:ilvl="2" w:tplc="40090005" w:tentative="1">
+      <w:start w:val="1"/>
+      <w:numFmt w:val="bullet"/>
+      <w:lvlText w:val=""/>
+      <w:lvlJc w:val="left"/>
+      <w:pPr>
+        <w:ind w:left="2160" w:hanging="360"/>
+      </w:pPr>
+      <w:rPr>
+        <w:rFonts w:ascii="Wingdings" w:hAnsi="Wingdings" w:hint="default"/>
+      </w:rPr>
+    </w:lvl>
+    <w:lvl w:ilvl="3" w:tplc="40090001" w:tentative="1">
+      <w:start w:val="1"/>
+      <w:numFmt w:val="bullet"/>
+      <w:lvlText w:val=""/>
+      <w:lvlJc w:val="left"/>
+      <w:pPr>
+        <w:ind w:left="2880" w:hanging="360"/>
+      </w:pPr>
+      <w:rPr>
+        <w:rFonts w:ascii="Symbol" w:hAnsi="Symbol" w:hint="default"/>
+      </w:rPr>
+    </w:lvl>
+    <w:lvl w:ilvl="4" w:tplc="40090003" w:tentative="1">
+      <w:start w:val="1"/>
+      <w:numFmt w:val="bullet"/>
+      <w:lvlText w:val="o"/>
+      <w:lvlJc w:val="left"/>
+      <w:pPr>
+        <w:ind w:left="3600" w:hanging="360"/>
+      </w:pPr>
+      <w:rPr>
+        <w:rFonts w:ascii="Courier New" w:hAnsi="Courier New" w:cs="Courier New" w:hint="default"/>
+      </w:rPr>
+    </w:lvl>
+    <w:lvl w:ilvl="5" w:tplc="40090005" w:tentative="1">
+      <w:start w:val="1"/>
+      <w:numFmt w:val="bullet"/>
+      <w:lvlText w:val=""/>
+      <w:lvlJc w:val="left"/>
+      <w:pPr>
+        <w:ind w:left="4320" w:hanging="360"/>
+      </w:pPr>
+      <w:rPr>
+        <w:rFonts w:ascii="Wingdings" w:hAnsi="Wingdings" w:hint="default"/>
+      </w:rPr>
+    </w:lvl>
+    <w:lvl w:ilvl="6" w:tplc="40090001" w:tentative="1">
+      <w:start w:val="1"/>
+      <w:numFmt w:val="bullet"/>
+      <w:lvlText w:val=""/>
+      <w:lvlJc w:val="left"/>
+      <w:pPr>
+        <w:ind w:left="5040" w:hanging="360"/>
+      </w:pPr>
+      <w:rPr>
+        <w:rFonts w:ascii="Symbol" w:hAnsi="Symbol" w:hint="default"/>
+      </w:rPr>
+    </w:lvl>
+    <w:lvl w:ilvl="7" w:tplc="40090003" w:tentative="1">
+      <w:start w:val="1"/>
+      <w:numFmt w:val="bullet"/>
+      <w:lvlText w:val="o"/>
+      <w:lvlJc w:val="left"/>
+      <w:pPr>
+        <w:ind w:left="5760" w:hanging="360"/>
+      </w:pPr>
+      <w:rPr>
+        <w:rFonts w:ascii="Courier New" w:hAnsi="Courier New" w:cs="Courier New" w:hint="default"/>
+      </w:rPr>
+    </w:lvl>
+    <w:lvl w:ilvl="8" w:tplc="40090005" w:tentative="1">
+      <w:start w:val="1"/>
+      <w:numFmt w:val="bullet"/>
+      <w:lvlText w:val=""/>
+      <w:lvlJc w:val="left"/>
+      <w:pPr>
+        <w:ind w:left="6480" w:hanging="360"/>
+      </w:pPr>
+      <w:rPr>
+        <w:rFonts w:ascii="Wingdings" w:hAnsi="Wingdings" w:hint="default"/>
+      </w:rPr>
+    </w:lvl>
+  </w:abstractNum>
+  <w:abstractNum w:abstractNumId="17" w15:restartNumberingAfterBreak="0">
     <w:nsid w:val="5B103B14"/>
     <w:multiLevelType w:val="multilevel"/>
     <w:tmpl w:val="4F1443CE"/>
@@ -5278,7 +5804,7 @@
       </w:rPr>
     </w:lvl>
   </w:abstractNum>
-  <w:abstractNum w:abstractNumId="16" w15:restartNumberingAfterBreak="0">
+  <w:abstractNum w:abstractNumId="18" w15:restartNumberingAfterBreak="0">
     <w:nsid w:val="68136995"/>
     <w:multiLevelType w:val="multilevel"/>
     <w:tmpl w:val="92D20476"/>
@@ -5427,7 +5953,7 @@
       </w:rPr>
     </w:lvl>
   </w:abstractNum>
-  <w:abstractNum w:abstractNumId="17" w15:restartNumberingAfterBreak="0">
+  <w:abstractNum w:abstractNumId="19" w15:restartNumberingAfterBreak="0">
     <w:nsid w:val="747E5772"/>
     <w:multiLevelType w:val="multilevel"/>
     <w:tmpl w:val="0160FFA4"/>
@@ -5577,7 +6103,7 @@
       </w:rPr>
     </w:lvl>
   </w:abstractNum>
-  <w:abstractNum w:abstractNumId="18" w15:restartNumberingAfterBreak="0">
+  <w:abstractNum w:abstractNumId="20" w15:restartNumberingAfterBreak="0">
     <w:nsid w:val="7E747AB4"/>
     <w:multiLevelType w:val="multilevel"/>
     <w:tmpl w:val="5C3E4458"/>
@@ -5730,49 +6256,49 @@
     <w:abstractNumId w:val="3"/>
   </w:num>
   <w:num w:numId="2">
-    <w:abstractNumId w:val="13"/>
+    <w:abstractNumId w:val="14"/>
   </w:num>
   <w:num w:numId="3">
     <w:abstractNumId w:val="6"/>
   </w:num>
   <w:num w:numId="4">
-    <w:abstractNumId w:val="17"/>
+    <w:abstractNumId w:val="19"/>
   </w:num>
   <w:num w:numId="5">
-    <w:abstractNumId w:val="10"/>
+    <w:abstractNumId w:val="11"/>
   </w:num>
   <w:num w:numId="6">
-    <w:abstractNumId w:val="18"/>
+    <w:abstractNumId w:val="20"/>
   </w:num>
   <w:num w:numId="7">
     <w:abstractNumId w:val="2"/>
   </w:num>
   <w:num w:numId="8">
-    <w:abstractNumId w:val="12"/>
+    <w:abstractNumId w:val="13"/>
   </w:num>
   <w:num w:numId="9">
-    <w:abstractNumId w:val="11"/>
+    <w:abstractNumId w:val="12"/>
   </w:num>
   <w:num w:numId="10">
     <w:abstractNumId w:val="0"/>
   </w:num>
   <w:num w:numId="11">
-    <w:abstractNumId w:val="15"/>
+    <w:abstractNumId w:val="17"/>
   </w:num>
   <w:num w:numId="12">
     <w:abstractNumId w:val="1"/>
   </w:num>
   <w:num w:numId="13">
-    <w:abstractNumId w:val="16"/>
+    <w:abstractNumId w:val="18"/>
   </w:num>
   <w:num w:numId="14">
-    <w:abstractNumId w:val="14"/>
+    <w:abstractNumId w:val="15"/>
   </w:num>
   <w:num w:numId="15">
-    <w:abstractNumId w:val="9"/>
+    <w:abstractNumId w:val="10"/>
   </w:num>
   <w:num w:numId="16">
-    <w:abstractNumId w:val="8"/>
+    <w:abstractNumId w:val="9"/>
   </w:num>
   <w:num w:numId="17">
     <w:abstractNumId w:val="5"/>
@@ -5782,6 +6308,12 @@
   </w:num>
   <w:num w:numId="19">
     <w:abstractNumId w:val="4"/>
+  </w:num>
+  <w:num w:numId="20">
+    <w:abstractNumId w:val="8"/>
+  </w:num>
+  <w:num w:numId="21">
+    <w:abstractNumId w:val="16"/>
   </w:num>
 </w:numbering>
 </file>
@@ -6335,6 +6867,36 @@
       <w:szCs w:val="32"/>
     </w:rPr>
   </w:style>
+  <w:style w:type="paragraph" w:styleId="NormalWeb">
+    <w:name w:val="Normal (Web)"/>
+    <w:basedOn w:val="Normal"/>
+    <w:uiPriority w:val="99"/>
+    <w:semiHidden/>
+    <w:unhideWhenUsed/>
+    <w:rsid w:val="00294606"/>
+    <w:pPr>
+      <w:spacing w:before="100" w:beforeAutospacing="1" w:after="100" w:afterAutospacing="1" w:line="240" w:lineRule="auto"/>
+    </w:pPr>
+    <w:rPr>
+      <w:rFonts w:ascii="Times New Roman" w:eastAsia="Times New Roman" w:hAnsi="Times New Roman" w:cs="Times New Roman"/>
+      <w:kern w:val="0"/>
+      <w:sz w:val="24"/>
+      <w:szCs w:val="24"/>
+      <w:lang w:eastAsia="en-IN"/>
+      <w14:ligatures w14:val="none"/>
+    </w:rPr>
+  </w:style>
+  <w:style w:type="character" w:styleId="Strong">
+    <w:name w:val="Strong"/>
+    <w:basedOn w:val="DefaultParagraphFont"/>
+    <w:uiPriority w:val="22"/>
+    <w:qFormat/>
+    <w:rsid w:val="00294606"/>
+    <w:rPr>
+      <w:b/>
+      <w:bCs/>
+    </w:rPr>
+  </w:style>
 </w:styles>
 </file>
 

</xml_diff>